<commit_message>
Update SEN381_Milestone1_V1.2 - conditionally accepted.docx
</commit_message>
<xml_diff>
--- a/SEN381_Milestone1_V1.2 - conditionally accepted.docx
+++ b/SEN381_Milestone1_V1.2 - conditionally accepted.docx
@@ -4453,9 +4453,6 @@
               <w:lastRenderedPageBreak/>
               <w:t>Lecturer</w:t>
             </w:r>
-            <w:r>
-              <w:t xml:space="preserve"> / Assessor</w:t>
-            </w:r>
           </w:p>
         </w:tc>
         <w:tc>
@@ -4816,6 +4813,309 @@
         <w:t>.</w:t>
       </w:r>
     </w:p>
+    <w:p>
+      <w:pPr>
+        <w:pStyle w:val="Heading1"/>
+      </w:pPr>
+      <w:r>
+        <w:t>4. Constraints</w:t>
+      </w:r>
+    </w:p>
+    <w:p/>
+    <w:tbl>
+      <w:tblPr>
+        <w:tblW w:w="7658" w:type="dxa"/>
+        <w:tblBorders>
+          <w:top w:val="single" w:sz="4" w:space="0" w:color="auto"/>
+          <w:left w:val="single" w:sz="4" w:space="0" w:color="auto"/>
+          <w:bottom w:val="single" w:sz="4" w:space="0" w:color="auto"/>
+          <w:right w:val="single" w:sz="4" w:space="0" w:color="auto"/>
+          <w:insideH w:val="single" w:sz="4" w:space="0" w:color="auto"/>
+          <w:insideV w:val="single" w:sz="4" w:space="0" w:color="auto"/>
+        </w:tblBorders>
+        <w:tblCellMar>
+          <w:left w:w="10" w:type="dxa"/>
+          <w:right w:w="10" w:type="dxa"/>
+        </w:tblCellMar>
+        <w:tblLook w:val="04A0" w:firstRow="1" w:lastRow="0" w:firstColumn="1" w:lastColumn="0" w:noHBand="0" w:noVBand="1"/>
+      </w:tblPr>
+      <w:tblGrid>
+        <w:gridCol w:w="889"/>
+        <w:gridCol w:w="2051"/>
+        <w:gridCol w:w="4718"/>
+      </w:tblGrid>
+      <w:tr>
+        <w:trPr>
+          <w:tblHeader/>
+        </w:trPr>
+        <w:tc>
+          <w:tcPr>
+            <w:tcW w:w="889" w:type="dxa"/>
+            <w:shd w:val="clear" w:color="auto" w:fill="1F3864"/>
+            <w:tcMar>
+              <w:top w:w="80" w:type="dxa"/>
+              <w:left w:w="100" w:type="dxa"/>
+              <w:bottom w:w="80" w:type="dxa"/>
+              <w:right w:w="100" w:type="dxa"/>
+            </w:tcMar>
+          </w:tcPr>
+          <w:p>
+            <w:pPr>
+              <w:rPr>
+                <w:sz w:val="20"/>
+                <w:szCs w:val="20"/>
+              </w:rPr>
+            </w:pPr>
+            <w:r>
+              <w:rPr>
+                <w:b/>
+                <w:bCs/>
+                <w:color w:val="FFFFFF"/>
+                <w:sz w:val="18"/>
+                <w:szCs w:val="18"/>
+              </w:rPr>
+              <w:lastRenderedPageBreak/>
+              <w:t>ID</w:t>
+            </w:r>
+          </w:p>
+        </w:tc>
+        <w:tc>
+          <w:tcPr>
+            <w:tcW w:w="2051" w:type="dxa"/>
+            <w:shd w:val="clear" w:color="auto" w:fill="1F3864"/>
+            <w:tcMar>
+              <w:top w:w="80" w:type="dxa"/>
+              <w:left w:w="100" w:type="dxa"/>
+              <w:bottom w:w="80" w:type="dxa"/>
+              <w:right w:w="100" w:type="dxa"/>
+            </w:tcMar>
+          </w:tcPr>
+          <w:p>
+            <w:r>
+              <w:rPr>
+                <w:b/>
+                <w:bCs/>
+                <w:color w:val="FFFFFF"/>
+                <w:sz w:val="20"/>
+                <w:szCs w:val="20"/>
+              </w:rPr>
+              <w:t>Constraint</w:t>
+            </w:r>
+          </w:p>
+        </w:tc>
+        <w:tc>
+          <w:tcPr>
+            <w:tcW w:w="4718" w:type="dxa"/>
+            <w:shd w:val="clear" w:color="auto" w:fill="1F3864"/>
+            <w:tcMar>
+              <w:top w:w="80" w:type="dxa"/>
+              <w:left w:w="100" w:type="dxa"/>
+              <w:bottom w:w="80" w:type="dxa"/>
+              <w:right w:w="100" w:type="dxa"/>
+            </w:tcMar>
+          </w:tcPr>
+          <w:p>
+            <w:r>
+              <w:rPr>
+                <w:b/>
+                <w:bCs/>
+                <w:sz w:val="20"/>
+                <w:szCs w:val="20"/>
+              </w:rPr>
+              <w:t>Rationale</w:t>
+            </w:r>
+            <w:r>
+              <w:rPr>
+                <w:b/>
+                <w:bCs/>
+                <w:sz w:val="20"/>
+                <w:szCs w:val="20"/>
+              </w:rPr>
+              <w:t>/Source</w:t>
+            </w:r>
+          </w:p>
+        </w:tc>
+      </w:tr>
+      <w:tr>
+        <w:tc>
+          <w:tcPr>
+            <w:tcW w:w="889" w:type="dxa"/>
+            <w:tcMar>
+              <w:top w:w="80" w:type="dxa"/>
+              <w:left w:w="100" w:type="dxa"/>
+              <w:bottom w:w="80" w:type="dxa"/>
+              <w:right w:w="100" w:type="dxa"/>
+            </w:tcMar>
+          </w:tcPr>
+          <w:p>
+            <w:r>
+              <w:t>CON-001</w:t>
+            </w:r>
+          </w:p>
+        </w:tc>
+        <w:tc>
+          <w:tcPr>
+            <w:tcW w:w="2051" w:type="dxa"/>
+            <w:tcMar>
+              <w:top w:w="80" w:type="dxa"/>
+              <w:left w:w="100" w:type="dxa"/>
+              <w:bottom w:w="80" w:type="dxa"/>
+              <w:right w:w="100" w:type="dxa"/>
+            </w:tcMar>
+          </w:tcPr>
+          <w:p>
+            <w:r>
+              <w:t>Must run on most devices that support web browsers</w:t>
+            </w:r>
+          </w:p>
+        </w:tc>
+        <w:tc>
+          <w:tcPr>
+            <w:tcW w:w="4718" w:type="dxa"/>
+            <w:tcMar>
+              <w:top w:w="80" w:type="dxa"/>
+              <w:left w:w="100" w:type="dxa"/>
+              <w:bottom w:w="80" w:type="dxa"/>
+              <w:right w:w="100" w:type="dxa"/>
+            </w:tcMar>
+          </w:tcPr>
+          <w:p/>
+        </w:tc>
+      </w:tr>
+      <w:tr>
+        <w:tc>
+          <w:tcPr>
+            <w:tcW w:w="889" w:type="dxa"/>
+            <w:tcMar>
+              <w:top w:w="80" w:type="dxa"/>
+              <w:left w:w="100" w:type="dxa"/>
+              <w:bottom w:w="80" w:type="dxa"/>
+              <w:right w:w="100" w:type="dxa"/>
+            </w:tcMar>
+          </w:tcPr>
+          <w:p>
+            <w:r>
+              <w:t>CON-002</w:t>
+            </w:r>
+          </w:p>
+        </w:tc>
+        <w:tc>
+          <w:tcPr>
+            <w:tcW w:w="2051" w:type="dxa"/>
+            <w:tcMar>
+              <w:top w:w="80" w:type="dxa"/>
+              <w:left w:w="100" w:type="dxa"/>
+              <w:bottom w:w="80" w:type="dxa"/>
+              <w:right w:w="100" w:type="dxa"/>
+            </w:tcMar>
+          </w:tcPr>
+          <w:p>
+            <w:r>
+              <w:rPr>
+                <w:sz w:val="20"/>
+                <w:szCs w:val="20"/>
+              </w:rPr>
+              <w:t>Must use a relational database (SQL)</w:t>
+            </w:r>
+          </w:p>
+        </w:tc>
+        <w:tc>
+          <w:tcPr>
+            <w:tcW w:w="4718" w:type="dxa"/>
+            <w:tcMar>
+              <w:top w:w="80" w:type="dxa"/>
+              <w:left w:w="100" w:type="dxa"/>
+              <w:bottom w:w="80" w:type="dxa"/>
+              <w:right w:w="100" w:type="dxa"/>
+            </w:tcMar>
+          </w:tcPr>
+          <w:p/>
+        </w:tc>
+      </w:tr>
+      <w:tr>
+        <w:tc>
+          <w:tcPr>
+            <w:tcW w:w="889" w:type="dxa"/>
+            <w:tcMar>
+              <w:top w:w="80" w:type="dxa"/>
+              <w:left w:w="100" w:type="dxa"/>
+              <w:bottom w:w="80" w:type="dxa"/>
+              <w:right w:w="100" w:type="dxa"/>
+            </w:tcMar>
+          </w:tcPr>
+          <w:p>
+            <w:r>
+              <w:t>CON-003</w:t>
+            </w:r>
+          </w:p>
+        </w:tc>
+        <w:tc>
+          <w:tcPr>
+            <w:tcW w:w="2051" w:type="dxa"/>
+            <w:tcMar>
+              <w:top w:w="80" w:type="dxa"/>
+              <w:left w:w="100" w:type="dxa"/>
+              <w:bottom w:w="80" w:type="dxa"/>
+              <w:right w:w="100" w:type="dxa"/>
+            </w:tcMar>
+          </w:tcPr>
+          <w:p>
+            <w:pPr>
+              <w:rPr>
+                <w:sz w:val="20"/>
+                <w:szCs w:val="20"/>
+              </w:rPr>
+            </w:pPr>
+            <w:r>
+              <w:rPr>
+                <w:sz w:val="20"/>
+                <w:szCs w:val="20"/>
+              </w:rPr>
+              <w:t>Source code managed in GitHub under protected-main branching strategy</w:t>
+            </w:r>
+          </w:p>
+        </w:tc>
+        <w:tc>
+          <w:tcPr>
+            <w:tcW w:w="4718" w:type="dxa"/>
+            <w:tcMar>
+              <w:top w:w="80" w:type="dxa"/>
+              <w:left w:w="100" w:type="dxa"/>
+              <w:bottom w:w="80" w:type="dxa"/>
+              <w:right w:w="100" w:type="dxa"/>
+            </w:tcMar>
+          </w:tcPr>
+          <w:p>
+            <w:r>
+              <w:t xml:space="preserve">Assignment 2 showed the benefit of using CI software and we will be using </w:t>
+            </w:r>
+            <w:r>
+              <w:rPr>
+                <w:sz w:val="20"/>
+                <w:szCs w:val="20"/>
+              </w:rPr>
+              <w:t>2-reviewe</w:t>
+            </w:r>
+            <w:r>
+              <w:rPr>
+                <w:sz w:val="20"/>
+                <w:szCs w:val="20"/>
+              </w:rPr>
+              <w:t>r</w:t>
+            </w:r>
+            <w:r>
+              <w:rPr>
+                <w:sz w:val="20"/>
+                <w:szCs w:val="20"/>
+              </w:rPr>
+              <w:t xml:space="preserve"> policy</w:t>
+            </w:r>
+          </w:p>
+        </w:tc>
+      </w:tr>
+    </w:tbl>
+    <w:p/>
+    <w:p/>
     <w:p>
       <w:r>
         <w:br w:type="page"/>

</xml_diff>

<commit_message>
Updated the Document controll
the changes were overwritten, and was just added back into the document.
</commit_message>
<xml_diff>
--- a/SEN381_Milestone1_V1.2 - conditionally accepted.docx
+++ b/SEN381_Milestone1_V1.2 - conditionally accepted.docx
@@ -3146,6 +3146,141 @@
           </w:p>
         </w:tc>
       </w:tr>
+      <w:tr>
+        <w:trPr>
+          <w:trHeight w:val="1560"/>
+        </w:trPr>
+        <w:tc>
+          <w:tcPr>
+            <w:tcW w:w="1400" w:type="dxa"/>
+          </w:tcPr>
+          <w:p>
+            <w:pPr>
+              <w:rPr>
+                <w:iCs/>
+              </w:rPr>
+            </w:pPr>
+            <w:r>
+              <w:rPr>
+                <w:iCs/>
+              </w:rPr>
+              <w:t xml:space="preserve"> 1.2</w:t>
+            </w:r>
+          </w:p>
+        </w:tc>
+        <w:tc>
+          <w:tcPr>
+            <w:tcW w:w="1400" w:type="dxa"/>
+          </w:tcPr>
+          <w:p>
+            <w:pPr>
+              <w:rPr>
+                <w:iCs/>
+              </w:rPr>
+            </w:pPr>
+            <w:r>
+              <w:rPr>
+                <w:iCs/>
+              </w:rPr>
+              <w:t xml:space="preserve"> 22/09/2026</w:t>
+            </w:r>
+          </w:p>
+        </w:tc>
+        <w:tc>
+          <w:tcPr>
+            <w:tcW w:w="2600" w:type="dxa"/>
+          </w:tcPr>
+          <w:p>
+            <w:pPr>
+              <w:rPr>
+                <w:iCs/>
+              </w:rPr>
+            </w:pPr>
+            <w:r>
+              <w:rPr>
+                <w:iCs/>
+              </w:rPr>
+              <w:t xml:space="preserve"> Michael</w:t>
+            </w:r>
+          </w:p>
+        </w:tc>
+        <w:tc>
+          <w:tcPr>
+            <w:tcW w:w="3400" w:type="dxa"/>
+          </w:tcPr>
+          <w:p>
+            <w:pPr>
+              <w:rPr>
+                <w:iCs/>
+              </w:rPr>
+            </w:pPr>
+            <w:r>
+              <w:rPr>
+                <w:iCs/>
+              </w:rPr>
+              <w:t>Fixed minor spelling mistakes.</w:t>
+            </w:r>
+          </w:p>
+          <w:p>
+            <w:pPr>
+              <w:rPr>
+                <w:iCs/>
+              </w:rPr>
+            </w:pPr>
+            <w:r>
+              <w:rPr>
+                <w:iCs/>
+              </w:rPr>
+              <w:t>Section 2: Added the lecturer as stakeholder.</w:t>
+            </w:r>
+            <w:r>
+              <w:rPr>
+                <w:iCs/>
+              </w:rPr>
+              <w:br/>
+              <w:t>section3: expanded explanation on WhatsApp’s exclusion. Included reasoning behind excluding multi-language support, and why data is kept for 5 years.</w:t>
+            </w:r>
+          </w:p>
+          <w:p>
+            <w:pPr>
+              <w:rPr>
+                <w:iCs/>
+              </w:rPr>
+            </w:pPr>
+            <w:r>
+              <w:rPr>
+                <w:iCs/>
+              </w:rPr>
+              <w:t>Section 5: rationale now has citation to support the reasoning.</w:t>
+            </w:r>
+          </w:p>
+          <w:p>
+            <w:pPr>
+              <w:rPr>
+                <w:iCs/>
+              </w:rPr>
+            </w:pPr>
+            <w:r>
+              <w:rPr>
+                <w:iCs/>
+              </w:rPr>
+              <w:t>Section 6: fixed a missing functional requirement.</w:t>
+            </w:r>
+          </w:p>
+        </w:tc>
+        <w:tc>
+          <w:tcPr>
+            <w:tcW w:w="1600" w:type="dxa"/>
+          </w:tcPr>
+          <w:p>
+            <w:pPr>
+              <w:rPr>
+                <w:iCs/>
+              </w:rPr>
+            </w:pPr>
+          </w:p>
+        </w:tc>
+      </w:tr>
     </w:tbl>
     <w:p>
       <w:pPr>
@@ -3499,6 +3634,7 @@
     </w:tbl>
     <w:p>
       <w:r>
+        <w:lastRenderedPageBreak/>
         <w:br w:type="page"/>
       </w:r>
     </w:p>
@@ -4922,18 +5058,105 @@
                 <w:sz w:val="20"/>
                 <w:szCs w:val="20"/>
               </w:rPr>
-              <w:t>Rationale</w:t>
-            </w:r>
-            <w:r>
-              <w:rPr>
-                <w:b/>
-                <w:bCs/>
+              <w:t>Rationale/Source</w:t>
+            </w:r>
+          </w:p>
+        </w:tc>
+      </w:tr>
+      <w:tr>
+        <w:tc>
+          <w:tcPr>
+            <w:tcW w:w="889" w:type="dxa"/>
+            <w:tcMar>
+              <w:top w:w="80" w:type="dxa"/>
+              <w:left w:w="100" w:type="dxa"/>
+              <w:bottom w:w="80" w:type="dxa"/>
+              <w:right w:w="100" w:type="dxa"/>
+            </w:tcMar>
+          </w:tcPr>
+          <w:p>
+            <w:r>
+              <w:t>CON-001</w:t>
+            </w:r>
+          </w:p>
+        </w:tc>
+        <w:tc>
+          <w:tcPr>
+            <w:tcW w:w="2051" w:type="dxa"/>
+            <w:tcMar>
+              <w:top w:w="80" w:type="dxa"/>
+              <w:left w:w="100" w:type="dxa"/>
+              <w:bottom w:w="80" w:type="dxa"/>
+              <w:right w:w="100" w:type="dxa"/>
+            </w:tcMar>
+          </w:tcPr>
+          <w:p>
+            <w:r>
+              <w:t>Must run on most devices that support web browsers</w:t>
+            </w:r>
+          </w:p>
+        </w:tc>
+        <w:tc>
+          <w:tcPr>
+            <w:tcW w:w="4718" w:type="dxa"/>
+            <w:tcMar>
+              <w:top w:w="80" w:type="dxa"/>
+              <w:left w:w="100" w:type="dxa"/>
+              <w:bottom w:w="80" w:type="dxa"/>
+              <w:right w:w="100" w:type="dxa"/>
+            </w:tcMar>
+          </w:tcPr>
+          <w:p/>
+        </w:tc>
+      </w:tr>
+      <w:tr>
+        <w:tc>
+          <w:tcPr>
+            <w:tcW w:w="889" w:type="dxa"/>
+            <w:tcMar>
+              <w:top w:w="80" w:type="dxa"/>
+              <w:left w:w="100" w:type="dxa"/>
+              <w:bottom w:w="80" w:type="dxa"/>
+              <w:right w:w="100" w:type="dxa"/>
+            </w:tcMar>
+          </w:tcPr>
+          <w:p>
+            <w:r>
+              <w:t>CON-002</w:t>
+            </w:r>
+          </w:p>
+        </w:tc>
+        <w:tc>
+          <w:tcPr>
+            <w:tcW w:w="2051" w:type="dxa"/>
+            <w:tcMar>
+              <w:top w:w="80" w:type="dxa"/>
+              <w:left w:w="100" w:type="dxa"/>
+              <w:bottom w:w="80" w:type="dxa"/>
+              <w:right w:w="100" w:type="dxa"/>
+            </w:tcMar>
+          </w:tcPr>
+          <w:p>
+            <w:r>
+              <w:rPr>
                 <w:sz w:val="20"/>
                 <w:szCs w:val="20"/>
               </w:rPr>
-              <w:t>/Source</w:t>
-            </w:r>
-          </w:p>
+              <w:t>Must use a relational database (SQL)</w:t>
+            </w:r>
+          </w:p>
+        </w:tc>
+        <w:tc>
+          <w:tcPr>
+            <w:tcW w:w="4718" w:type="dxa"/>
+            <w:tcMar>
+              <w:top w:w="80" w:type="dxa"/>
+              <w:left w:w="100" w:type="dxa"/>
+              <w:bottom w:w="80" w:type="dxa"/>
+              <w:right w:w="100" w:type="dxa"/>
+            </w:tcMar>
+          </w:tcPr>
+          <w:p/>
         </w:tc>
       </w:tr>
       <w:tr>
@@ -4949,7 +5172,7 @@
           </w:tcPr>
           <w:p>
             <w:r>
-              <w:t>CON-001</w:t>
+              <w:t>CON-003</w:t>
             </w:r>
           </w:p>
         </w:tc>
@@ -4964,151 +5187,41 @@
             </w:tcMar>
           </w:tcPr>
           <w:p>
-            <w:r>
-              <w:t>Must run on most devices that support web browsers</w:t>
-            </w:r>
-          </w:p>
-        </w:tc>
-        <w:tc>
-          <w:tcPr>
-            <w:tcW w:w="4718" w:type="dxa"/>
-            <w:tcMar>
-              <w:top w:w="80" w:type="dxa"/>
-              <w:left w:w="100" w:type="dxa"/>
-              <w:bottom w:w="80" w:type="dxa"/>
-              <w:right w:w="100" w:type="dxa"/>
-            </w:tcMar>
-          </w:tcPr>
-          <w:p/>
-        </w:tc>
-      </w:tr>
-      <w:tr>
-        <w:tc>
-          <w:tcPr>
-            <w:tcW w:w="889" w:type="dxa"/>
-            <w:tcMar>
-              <w:top w:w="80" w:type="dxa"/>
-              <w:left w:w="100" w:type="dxa"/>
-              <w:bottom w:w="80" w:type="dxa"/>
-              <w:right w:w="100" w:type="dxa"/>
-            </w:tcMar>
-          </w:tcPr>
-          <w:p>
-            <w:r>
-              <w:t>CON-002</w:t>
-            </w:r>
-          </w:p>
-        </w:tc>
-        <w:tc>
-          <w:tcPr>
-            <w:tcW w:w="2051" w:type="dxa"/>
-            <w:tcMar>
-              <w:top w:w="80" w:type="dxa"/>
-              <w:left w:w="100" w:type="dxa"/>
-              <w:bottom w:w="80" w:type="dxa"/>
-              <w:right w:w="100" w:type="dxa"/>
-            </w:tcMar>
-          </w:tcPr>
-          <w:p>
-            <w:r>
+            <w:pPr>
               <w:rPr>
                 <w:sz w:val="20"/>
                 <w:szCs w:val="20"/>
               </w:rPr>
-              <w:t>Must use a relational database (SQL)</w:t>
-            </w:r>
-          </w:p>
-        </w:tc>
-        <w:tc>
-          <w:tcPr>
-            <w:tcW w:w="4718" w:type="dxa"/>
-            <w:tcMar>
-              <w:top w:w="80" w:type="dxa"/>
-              <w:left w:w="100" w:type="dxa"/>
-              <w:bottom w:w="80" w:type="dxa"/>
-              <w:right w:w="100" w:type="dxa"/>
-            </w:tcMar>
-          </w:tcPr>
-          <w:p/>
-        </w:tc>
-      </w:tr>
-      <w:tr>
-        <w:tc>
-          <w:tcPr>
-            <w:tcW w:w="889" w:type="dxa"/>
-            <w:tcMar>
-              <w:top w:w="80" w:type="dxa"/>
-              <w:left w:w="100" w:type="dxa"/>
-              <w:bottom w:w="80" w:type="dxa"/>
-              <w:right w:w="100" w:type="dxa"/>
-            </w:tcMar>
-          </w:tcPr>
-          <w:p>
-            <w:r>
-              <w:t>CON-003</w:t>
-            </w:r>
-          </w:p>
-        </w:tc>
-        <w:tc>
-          <w:tcPr>
-            <w:tcW w:w="2051" w:type="dxa"/>
-            <w:tcMar>
-              <w:top w:w="80" w:type="dxa"/>
-              <w:left w:w="100" w:type="dxa"/>
-              <w:bottom w:w="80" w:type="dxa"/>
-              <w:right w:w="100" w:type="dxa"/>
-            </w:tcMar>
-          </w:tcPr>
-          <w:p>
-            <w:pPr>
+            </w:pPr>
+            <w:r>
               <w:rPr>
                 <w:sz w:val="20"/>
                 <w:szCs w:val="20"/>
               </w:rPr>
-            </w:pPr>
+              <w:t>Source code managed in GitHub under protected-main branching strategy</w:t>
+            </w:r>
+          </w:p>
+        </w:tc>
+        <w:tc>
+          <w:tcPr>
+            <w:tcW w:w="4718" w:type="dxa"/>
+            <w:tcMar>
+              <w:top w:w="80" w:type="dxa"/>
+              <w:left w:w="100" w:type="dxa"/>
+              <w:bottom w:w="80" w:type="dxa"/>
+              <w:right w:w="100" w:type="dxa"/>
+            </w:tcMar>
+          </w:tcPr>
+          <w:p>
+            <w:r>
+              <w:t xml:space="preserve">Assignment 2 showed the benefit of using CI software and we will be using </w:t>
+            </w:r>
             <w:r>
               <w:rPr>
                 <w:sz w:val="20"/>
                 <w:szCs w:val="20"/>
               </w:rPr>
-              <w:t>Source code managed in GitHub under protected-main branching strategy</w:t>
-            </w:r>
-          </w:p>
-        </w:tc>
-        <w:tc>
-          <w:tcPr>
-            <w:tcW w:w="4718" w:type="dxa"/>
-            <w:tcMar>
-              <w:top w:w="80" w:type="dxa"/>
-              <w:left w:w="100" w:type="dxa"/>
-              <w:bottom w:w="80" w:type="dxa"/>
-              <w:right w:w="100" w:type="dxa"/>
-            </w:tcMar>
-          </w:tcPr>
-          <w:p>
-            <w:r>
-              <w:t xml:space="preserve">Assignment 2 showed the benefit of using CI software and we will be using </w:t>
-            </w:r>
-            <w:r>
-              <w:rPr>
-                <w:sz w:val="20"/>
-                <w:szCs w:val="20"/>
-              </w:rPr>
-              <w:t>2-reviewe</w:t>
-            </w:r>
-            <w:r>
-              <w:rPr>
-                <w:sz w:val="20"/>
-                <w:szCs w:val="20"/>
-              </w:rPr>
-              <w:t>r</w:t>
-            </w:r>
-            <w:r>
-              <w:rPr>
-                <w:sz w:val="20"/>
-                <w:szCs w:val="20"/>
-              </w:rPr>
-              <w:t xml:space="preserve"> policy</w:t>
+              <w:t>2-reviewer policy</w:t>
             </w:r>
           </w:p>
         </w:tc>

</xml_diff>

<commit_message>
Added two new columns to existing tables
added ASR linkage to section 2 and added ids and new constraint in section 5
</commit_message>
<xml_diff>
--- a/SEN381_Milestone1_V1.2 - conditionally accepted.docx
+++ b/SEN381_Milestone1_V1.2 - conditionally accepted.docx
@@ -313,7 +313,7 @@
           <w:r>
             <w:fldChar w:fldCharType="separate"/>
           </w:r>
-          <w:hyperlink w:anchor="_Toc239883338" w:history="1">
+          <w:hyperlink w:anchor="_Toc241064265" w:history="1">
             <w:r>
               <w:rPr>
                 <w:rStyle w:val="Hyperlink"/>
@@ -340,7 +340,7 @@
                 <w:noProof/>
                 <w:webHidden/>
               </w:rPr>
-              <w:instrText xml:space="preserve"> PAGEREF _Toc239883338 \h </w:instrText>
+              <w:instrText xml:space="preserve"> PAGEREF _Toc241064265 \h </w:instrText>
             </w:r>
             <w:r>
               <w:rPr>
@@ -386,12 +386,85 @@
               <w14:ligatures w14:val="standardContextual"/>
             </w:rPr>
           </w:pPr>
-          <w:hyperlink w:anchor="_Toc239883339" w:history="1">
+          <w:hyperlink w:anchor="_Toc241064266" w:history="1">
             <w:r>
               <w:rPr>
                 <w:rStyle w:val="Hyperlink"/>
                 <w:noProof/>
               </w:rPr>
+              <w:t>Change record</w:t>
+            </w:r>
+            <w:r>
+              <w:rPr>
+                <w:noProof/>
+                <w:webHidden/>
+              </w:rPr>
+              <w:tab/>
+            </w:r>
+            <w:r>
+              <w:rPr>
+                <w:noProof/>
+                <w:webHidden/>
+              </w:rPr>
+              <w:fldChar w:fldCharType="begin"/>
+            </w:r>
+            <w:r>
+              <w:rPr>
+                <w:noProof/>
+                <w:webHidden/>
+              </w:rPr>
+              <w:instrText xml:space="preserve"> PAGEREF _Toc241064266 \h </w:instrText>
+            </w:r>
+            <w:r>
+              <w:rPr>
+                <w:noProof/>
+                <w:webHidden/>
+              </w:rPr>
+            </w:r>
+            <w:r>
+              <w:rPr>
+                <w:noProof/>
+                <w:webHidden/>
+              </w:rPr>
+              <w:fldChar w:fldCharType="separate"/>
+            </w:r>
+            <w:r>
+              <w:rPr>
+                <w:noProof/>
+                <w:webHidden/>
+              </w:rPr>
+              <w:t>4</w:t>
+            </w:r>
+            <w:r>
+              <w:rPr>
+                <w:noProof/>
+                <w:webHidden/>
+              </w:rPr>
+              <w:fldChar w:fldCharType="end"/>
+            </w:r>
+          </w:hyperlink>
+        </w:p>
+        <w:p>
+          <w:pPr>
+            <w:pStyle w:val="TOC2"/>
+            <w:tabs>
+              <w:tab w:val="right" w:leader="dot" w:pos="10790"/>
+            </w:tabs>
+            <w:rPr>
+              <w:rFonts w:asciiTheme="minorHAnsi" w:eastAsiaTheme="minorEastAsia" w:hAnsiTheme="minorHAnsi" w:cstheme="minorBidi"/>
+              <w:noProof/>
+              <w:kern w:val="2"/>
+              <w:sz w:val="24"/>
+              <w:szCs w:val="24"/>
+              <w14:ligatures w14:val="standardContextual"/>
+            </w:rPr>
+          </w:pPr>
+          <w:hyperlink w:anchor="_Toc241064267" w:history="1">
+            <w:r>
+              <w:rPr>
+                <w:rStyle w:val="Hyperlink"/>
+                <w:noProof/>
+              </w:rPr>
               <w:t>Baseline Approval</w:t>
             </w:r>
             <w:r>
@@ -413,7 +486,7 @@
                 <w:noProof/>
                 <w:webHidden/>
               </w:rPr>
-              <w:instrText xml:space="preserve"> PAGEREF _Toc239883339 \h </w:instrText>
+              <w:instrText xml:space="preserve"> PAGEREF _Toc241064267 \h </w:instrText>
             </w:r>
             <w:r>
               <w:rPr>
@@ -433,7 +506,80 @@
                 <w:noProof/>
                 <w:webHidden/>
               </w:rPr>
-              <w:t>3</w:t>
+              <w:t>5</w:t>
+            </w:r>
+            <w:r>
+              <w:rPr>
+                <w:noProof/>
+                <w:webHidden/>
+              </w:rPr>
+              <w:fldChar w:fldCharType="end"/>
+            </w:r>
+          </w:hyperlink>
+        </w:p>
+        <w:p>
+          <w:pPr>
+            <w:pStyle w:val="TOC2"/>
+            <w:tabs>
+              <w:tab w:val="right" w:leader="dot" w:pos="10790"/>
+            </w:tabs>
+            <w:rPr>
+              <w:rFonts w:asciiTheme="minorHAnsi" w:eastAsiaTheme="minorEastAsia" w:hAnsiTheme="minorHAnsi" w:cstheme="minorBidi"/>
+              <w:noProof/>
+              <w:kern w:val="2"/>
+              <w:sz w:val="24"/>
+              <w:szCs w:val="24"/>
+              <w14:ligatures w14:val="standardContextual"/>
+            </w:rPr>
+          </w:pPr>
+          <w:hyperlink w:anchor="_Toc241064268" w:history="1">
+            <w:r>
+              <w:rPr>
+                <w:rStyle w:val="Hyperlink"/>
+                <w:noProof/>
+              </w:rPr>
+              <w:t>Baseline Approval (Milestone 2)</w:t>
+            </w:r>
+            <w:r>
+              <w:rPr>
+                <w:noProof/>
+                <w:webHidden/>
+              </w:rPr>
+              <w:tab/>
+            </w:r>
+            <w:r>
+              <w:rPr>
+                <w:noProof/>
+                <w:webHidden/>
+              </w:rPr>
+              <w:fldChar w:fldCharType="begin"/>
+            </w:r>
+            <w:r>
+              <w:rPr>
+                <w:noProof/>
+                <w:webHidden/>
+              </w:rPr>
+              <w:instrText xml:space="preserve"> PAGEREF _Toc241064268 \h </w:instrText>
+            </w:r>
+            <w:r>
+              <w:rPr>
+                <w:noProof/>
+                <w:webHidden/>
+              </w:rPr>
+            </w:r>
+            <w:r>
+              <w:rPr>
+                <w:noProof/>
+                <w:webHidden/>
+              </w:rPr>
+              <w:fldChar w:fldCharType="separate"/>
+            </w:r>
+            <w:r>
+              <w:rPr>
+                <w:noProof/>
+                <w:webHidden/>
+              </w:rPr>
+              <w:t>5</w:t>
             </w:r>
             <w:r>
               <w:rPr>
@@ -459,7 +605,7 @@
               <w14:ligatures w14:val="standardContextual"/>
             </w:rPr>
           </w:pPr>
-          <w:hyperlink w:anchor="_Toc239883340" w:history="1">
+          <w:hyperlink w:anchor="_Toc241064269" w:history="1">
             <w:r>
               <w:rPr>
                 <w:rStyle w:val="Hyperlink"/>
@@ -486,7 +632,7 @@
                 <w:noProof/>
                 <w:webHidden/>
               </w:rPr>
-              <w:instrText xml:space="preserve"> PAGEREF _Toc239883340 \h </w:instrText>
+              <w:instrText xml:space="preserve"> PAGEREF _Toc241064269 \h </w:instrText>
             </w:r>
             <w:r>
               <w:rPr>
@@ -506,7 +652,7 @@
                 <w:noProof/>
                 <w:webHidden/>
               </w:rPr>
-              <w:t>4</w:t>
+              <w:t>6</w:t>
             </w:r>
             <w:r>
               <w:rPr>
@@ -532,7 +678,7 @@
               <w14:ligatures w14:val="standardContextual"/>
             </w:rPr>
           </w:pPr>
-          <w:hyperlink w:anchor="_Toc239883341" w:history="1">
+          <w:hyperlink w:anchor="_Toc241064270" w:history="1">
             <w:r>
               <w:rPr>
                 <w:rStyle w:val="Hyperlink"/>
@@ -559,7 +705,7 @@
                 <w:noProof/>
                 <w:webHidden/>
               </w:rPr>
-              <w:instrText xml:space="preserve"> PAGEREF _Toc239883341 \h </w:instrText>
+              <w:instrText xml:space="preserve"> PAGEREF _Toc241064270 \h </w:instrText>
             </w:r>
             <w:r>
               <w:rPr>
@@ -579,7 +725,7 @@
                 <w:noProof/>
                 <w:webHidden/>
               </w:rPr>
-              <w:t>4</w:t>
+              <w:t>6</w:t>
             </w:r>
             <w:r>
               <w:rPr>
@@ -605,7 +751,7 @@
               <w14:ligatures w14:val="standardContextual"/>
             </w:rPr>
           </w:pPr>
-          <w:hyperlink w:anchor="_Toc239883342" w:history="1">
+          <w:hyperlink w:anchor="_Toc241064271" w:history="1">
             <w:r>
               <w:rPr>
                 <w:rStyle w:val="Hyperlink"/>
@@ -632,7 +778,7 @@
                 <w:noProof/>
                 <w:webHidden/>
               </w:rPr>
-              <w:instrText xml:space="preserve"> PAGEREF _Toc239883342 \h </w:instrText>
+              <w:instrText xml:space="preserve"> PAGEREF _Toc241064271 \h </w:instrText>
             </w:r>
             <w:r>
               <w:rPr>
@@ -652,7 +798,7 @@
                 <w:noProof/>
                 <w:webHidden/>
               </w:rPr>
-              <w:t>4</w:t>
+              <w:t>6</w:t>
             </w:r>
             <w:r>
               <w:rPr>
@@ -678,7 +824,7 @@
               <w14:ligatures w14:val="standardContextual"/>
             </w:rPr>
           </w:pPr>
-          <w:hyperlink w:anchor="_Toc239883343" w:history="1">
+          <w:hyperlink w:anchor="_Toc241064272" w:history="1">
             <w:r>
               <w:rPr>
                 <w:rStyle w:val="Hyperlink"/>
@@ -705,7 +851,7 @@
                 <w:noProof/>
                 <w:webHidden/>
               </w:rPr>
-              <w:instrText xml:space="preserve"> PAGEREF _Toc239883343 \h </w:instrText>
+              <w:instrText xml:space="preserve"> PAGEREF _Toc241064272 \h </w:instrText>
             </w:r>
             <w:r>
               <w:rPr>
@@ -725,7 +871,7 @@
                 <w:noProof/>
                 <w:webHidden/>
               </w:rPr>
-              <w:t>4</w:t>
+              <w:t>6</w:t>
             </w:r>
             <w:r>
               <w:rPr>
@@ -751,7 +897,7 @@
               <w14:ligatures w14:val="standardContextual"/>
             </w:rPr>
           </w:pPr>
-          <w:hyperlink w:anchor="_Toc239883344" w:history="1">
+          <w:hyperlink w:anchor="_Toc241064273" w:history="1">
             <w:r>
               <w:rPr>
                 <w:rStyle w:val="Hyperlink"/>
@@ -778,7 +924,7 @@
                 <w:noProof/>
                 <w:webHidden/>
               </w:rPr>
-              <w:instrText xml:space="preserve"> PAGEREF _Toc239883344 \h </w:instrText>
+              <w:instrText xml:space="preserve"> PAGEREF _Toc241064273 \h </w:instrText>
             </w:r>
             <w:r>
               <w:rPr>
@@ -798,7 +944,7 @@
                 <w:noProof/>
                 <w:webHidden/>
               </w:rPr>
-              <w:t>4</w:t>
+              <w:t>6</w:t>
             </w:r>
             <w:r>
               <w:rPr>
@@ -824,7 +970,7 @@
               <w14:ligatures w14:val="standardContextual"/>
             </w:rPr>
           </w:pPr>
-          <w:hyperlink w:anchor="_Toc239883345" w:history="1">
+          <w:hyperlink w:anchor="_Toc241064274" w:history="1">
             <w:r>
               <w:rPr>
                 <w:rStyle w:val="Hyperlink"/>
@@ -851,7 +997,7 @@
                 <w:noProof/>
                 <w:webHidden/>
               </w:rPr>
-              <w:instrText xml:space="preserve"> PAGEREF _Toc239883345 \h </w:instrText>
+              <w:instrText xml:space="preserve"> PAGEREF _Toc241064274 \h </w:instrText>
             </w:r>
             <w:r>
               <w:rPr>
@@ -871,7 +1017,7 @@
                 <w:noProof/>
                 <w:webHidden/>
               </w:rPr>
-              <w:t>5</w:t>
+              <w:t>7</w:t>
             </w:r>
             <w:r>
               <w:rPr>
@@ -897,7 +1043,7 @@
               <w14:ligatures w14:val="standardContextual"/>
             </w:rPr>
           </w:pPr>
-          <w:hyperlink w:anchor="_Toc239883346" w:history="1">
+          <w:hyperlink w:anchor="_Toc241064275" w:history="1">
             <w:r>
               <w:rPr>
                 <w:rStyle w:val="Hyperlink"/>
@@ -924,7 +1070,7 @@
                 <w:noProof/>
                 <w:webHidden/>
               </w:rPr>
-              <w:instrText xml:space="preserve"> PAGEREF _Toc239883346 \h </w:instrText>
+              <w:instrText xml:space="preserve"> PAGEREF _Toc241064275 \h </w:instrText>
             </w:r>
             <w:r>
               <w:rPr>
@@ -944,7 +1090,7 @@
                 <w:noProof/>
                 <w:webHidden/>
               </w:rPr>
-              <w:t>5</w:t>
+              <w:t>7</w:t>
             </w:r>
             <w:r>
               <w:rPr>
@@ -970,7 +1116,7 @@
               <w14:ligatures w14:val="standardContextual"/>
             </w:rPr>
           </w:pPr>
-          <w:hyperlink w:anchor="_Toc239883347" w:history="1">
+          <w:hyperlink w:anchor="_Toc241064276" w:history="1">
             <w:r>
               <w:rPr>
                 <w:rStyle w:val="Hyperlink"/>
@@ -997,7 +1143,7 @@
                 <w:noProof/>
                 <w:webHidden/>
               </w:rPr>
-              <w:instrText xml:space="preserve"> PAGEREF _Toc239883347 \h </w:instrText>
+              <w:instrText xml:space="preserve"> PAGEREF _Toc241064276 \h </w:instrText>
             </w:r>
             <w:r>
               <w:rPr>
@@ -1017,7 +1163,7 @@
                 <w:noProof/>
                 <w:webHidden/>
               </w:rPr>
-              <w:t>5</w:t>
+              <w:t>7</w:t>
             </w:r>
             <w:r>
               <w:rPr>
@@ -1043,7 +1189,7 @@
               <w14:ligatures w14:val="standardContextual"/>
             </w:rPr>
           </w:pPr>
-          <w:hyperlink w:anchor="_Toc239883348" w:history="1">
+          <w:hyperlink w:anchor="_Toc241064277" w:history="1">
             <w:r>
               <w:rPr>
                 <w:rStyle w:val="Hyperlink"/>
@@ -1070,7 +1216,7 @@
                 <w:noProof/>
                 <w:webHidden/>
               </w:rPr>
-              <w:instrText xml:space="preserve"> PAGEREF _Toc239883348 \h </w:instrText>
+              <w:instrText xml:space="preserve"> PAGEREF _Toc241064277 \h </w:instrText>
             </w:r>
             <w:r>
               <w:rPr>
@@ -1090,7 +1236,7 @@
                 <w:noProof/>
                 <w:webHidden/>
               </w:rPr>
-              <w:t>5</w:t>
+              <w:t>7</w:t>
             </w:r>
             <w:r>
               <w:rPr>
@@ -1116,7 +1262,7 @@
               <w14:ligatures w14:val="standardContextual"/>
             </w:rPr>
           </w:pPr>
-          <w:hyperlink w:anchor="_Toc239883349" w:history="1">
+          <w:hyperlink w:anchor="_Toc241064278" w:history="1">
             <w:r>
               <w:rPr>
                 <w:rStyle w:val="Hyperlink"/>
@@ -1143,7 +1289,7 @@
                 <w:noProof/>
                 <w:webHidden/>
               </w:rPr>
-              <w:instrText xml:space="preserve"> PAGEREF _Toc239883349 \h </w:instrText>
+              <w:instrText xml:space="preserve"> PAGEREF _Toc241064278 \h </w:instrText>
             </w:r>
             <w:r>
               <w:rPr>
@@ -1163,7 +1309,7 @@
                 <w:noProof/>
                 <w:webHidden/>
               </w:rPr>
-              <w:t>5</w:t>
+              <w:t>7</w:t>
             </w:r>
             <w:r>
               <w:rPr>
@@ -1189,7 +1335,7 @@
               <w14:ligatures w14:val="standardContextual"/>
             </w:rPr>
           </w:pPr>
-          <w:hyperlink w:anchor="_Toc239883350" w:history="1">
+          <w:hyperlink w:anchor="_Toc241064279" w:history="1">
             <w:r>
               <w:rPr>
                 <w:rStyle w:val="Hyperlink"/>
@@ -1216,7 +1362,7 @@
                 <w:noProof/>
                 <w:webHidden/>
               </w:rPr>
-              <w:instrText xml:space="preserve"> PAGEREF _Toc239883350 \h </w:instrText>
+              <w:instrText xml:space="preserve"> PAGEREF _Toc241064279 \h </w:instrText>
             </w:r>
             <w:r>
               <w:rPr>
@@ -1236,7 +1382,7 @@
                 <w:noProof/>
                 <w:webHidden/>
               </w:rPr>
-              <w:t>6</w:t>
+              <w:t>8</w:t>
             </w:r>
             <w:r>
               <w:rPr>
@@ -1262,7 +1408,7 @@
               <w14:ligatures w14:val="standardContextual"/>
             </w:rPr>
           </w:pPr>
-          <w:hyperlink w:anchor="_Toc239883351" w:history="1">
+          <w:hyperlink w:anchor="_Toc241064280" w:history="1">
             <w:r>
               <w:rPr>
                 <w:rStyle w:val="Hyperlink"/>
@@ -1289,7 +1435,7 @@
                 <w:noProof/>
                 <w:webHidden/>
               </w:rPr>
-              <w:instrText xml:space="preserve"> PAGEREF _Toc239883351 \h </w:instrText>
+              <w:instrText xml:space="preserve"> PAGEREF _Toc241064280 \h </w:instrText>
             </w:r>
             <w:r>
               <w:rPr>
@@ -1309,7 +1455,7 @@
                 <w:noProof/>
                 <w:webHidden/>
               </w:rPr>
-              <w:t>6</w:t>
+              <w:t>8</w:t>
             </w:r>
             <w:r>
               <w:rPr>
@@ -1335,7 +1481,7 @@
               <w14:ligatures w14:val="standardContextual"/>
             </w:rPr>
           </w:pPr>
-          <w:hyperlink w:anchor="_Toc239883352" w:history="1">
+          <w:hyperlink w:anchor="_Toc241064281" w:history="1">
             <w:r>
               <w:rPr>
                 <w:rStyle w:val="Hyperlink"/>
@@ -1362,7 +1508,7 @@
                 <w:noProof/>
                 <w:webHidden/>
               </w:rPr>
-              <w:instrText xml:space="preserve"> PAGEREF _Toc239883352 \h </w:instrText>
+              <w:instrText xml:space="preserve"> PAGEREF _Toc241064281 \h </w:instrText>
             </w:r>
             <w:r>
               <w:rPr>
@@ -1382,7 +1528,80 @@
                 <w:noProof/>
                 <w:webHidden/>
               </w:rPr>
-              <w:t>7</w:t>
+              <w:t>10</w:t>
+            </w:r>
+            <w:r>
+              <w:rPr>
+                <w:noProof/>
+                <w:webHidden/>
+              </w:rPr>
+              <w:fldChar w:fldCharType="end"/>
+            </w:r>
+          </w:hyperlink>
+        </w:p>
+        <w:p>
+          <w:pPr>
+            <w:pStyle w:val="TOC2"/>
+            <w:tabs>
+              <w:tab w:val="right" w:leader="dot" w:pos="10790"/>
+            </w:tabs>
+            <w:rPr>
+              <w:rFonts w:asciiTheme="minorHAnsi" w:eastAsiaTheme="minorEastAsia" w:hAnsiTheme="minorHAnsi" w:cstheme="minorBidi"/>
+              <w:noProof/>
+              <w:kern w:val="2"/>
+              <w:sz w:val="24"/>
+              <w:szCs w:val="24"/>
+              <w14:ligatures w14:val="standardContextual"/>
+            </w:rPr>
+          </w:pPr>
+          <w:hyperlink w:anchor="_Toc241064282" w:history="1">
+            <w:r>
+              <w:rPr>
+                <w:rStyle w:val="Hyperlink"/>
+                <w:noProof/>
+              </w:rPr>
+              <w:t>4.3 Architecturally Significant Requirements and Quality Drivers</w:t>
+            </w:r>
+            <w:r>
+              <w:rPr>
+                <w:noProof/>
+                <w:webHidden/>
+              </w:rPr>
+              <w:tab/>
+            </w:r>
+            <w:r>
+              <w:rPr>
+                <w:noProof/>
+                <w:webHidden/>
+              </w:rPr>
+              <w:fldChar w:fldCharType="begin"/>
+            </w:r>
+            <w:r>
+              <w:rPr>
+                <w:noProof/>
+                <w:webHidden/>
+              </w:rPr>
+              <w:instrText xml:space="preserve"> PAGEREF _Toc241064282 \h </w:instrText>
+            </w:r>
+            <w:r>
+              <w:rPr>
+                <w:noProof/>
+                <w:webHidden/>
+              </w:rPr>
+            </w:r>
+            <w:r>
+              <w:rPr>
+                <w:noProof/>
+                <w:webHidden/>
+              </w:rPr>
+              <w:fldChar w:fldCharType="separate"/>
+            </w:r>
+            <w:r>
+              <w:rPr>
+                <w:noProof/>
+                <w:webHidden/>
+              </w:rPr>
+              <w:t>11</w:t>
             </w:r>
             <w:r>
               <w:rPr>
@@ -1408,7 +1627,7 @@
               <w14:ligatures w14:val="standardContextual"/>
             </w:rPr>
           </w:pPr>
-          <w:hyperlink w:anchor="_Toc239883353" w:history="1">
+          <w:hyperlink w:anchor="_Toc241064283" w:history="1">
             <w:r>
               <w:rPr>
                 <w:rStyle w:val="Hyperlink"/>
@@ -1435,7 +1654,7 @@
                 <w:noProof/>
                 <w:webHidden/>
               </w:rPr>
-              <w:instrText xml:space="preserve"> PAGEREF _Toc239883353 \h </w:instrText>
+              <w:instrText xml:space="preserve"> PAGEREF _Toc241064283 \h </w:instrText>
             </w:r>
             <w:r>
               <w:rPr>
@@ -1455,7 +1674,7 @@
                 <w:noProof/>
                 <w:webHidden/>
               </w:rPr>
-              <w:t>8</w:t>
+              <w:t>12</w:t>
             </w:r>
             <w:r>
               <w:rPr>
@@ -1481,7 +1700,7 @@
               <w14:ligatures w14:val="standardContextual"/>
             </w:rPr>
           </w:pPr>
-          <w:hyperlink w:anchor="_Toc239883354" w:history="1">
+          <w:hyperlink w:anchor="_Toc241064284" w:history="1">
             <w:r>
               <w:rPr>
                 <w:rStyle w:val="Hyperlink"/>
@@ -1508,7 +1727,7 @@
                 <w:noProof/>
                 <w:webHidden/>
               </w:rPr>
-              <w:instrText xml:space="preserve"> PAGEREF _Toc239883354 \h </w:instrText>
+              <w:instrText xml:space="preserve"> PAGEREF _Toc241064284 \h </w:instrText>
             </w:r>
             <w:r>
               <w:rPr>
@@ -1528,7 +1747,7 @@
                 <w:noProof/>
                 <w:webHidden/>
               </w:rPr>
-              <w:t>9</w:t>
+              <w:t>13</w:t>
             </w:r>
             <w:r>
               <w:rPr>
@@ -1554,7 +1773,7 @@
               <w14:ligatures w14:val="standardContextual"/>
             </w:rPr>
           </w:pPr>
-          <w:hyperlink w:anchor="_Toc239883355" w:history="1">
+          <w:hyperlink w:anchor="_Toc241064285" w:history="1">
             <w:r>
               <w:rPr>
                 <w:rStyle w:val="Hyperlink"/>
@@ -1581,7 +1800,7 @@
                 <w:noProof/>
                 <w:webHidden/>
               </w:rPr>
-              <w:instrText xml:space="preserve"> PAGEREF _Toc239883355 \h </w:instrText>
+              <w:instrText xml:space="preserve"> PAGEREF _Toc241064285 \h </w:instrText>
             </w:r>
             <w:r>
               <w:rPr>
@@ -1601,7 +1820,153 @@
                 <w:noProof/>
                 <w:webHidden/>
               </w:rPr>
-              <w:t>10</w:t>
+              <w:t>14</w:t>
+            </w:r>
+            <w:r>
+              <w:rPr>
+                <w:noProof/>
+                <w:webHidden/>
+              </w:rPr>
+              <w:fldChar w:fldCharType="end"/>
+            </w:r>
+          </w:hyperlink>
+        </w:p>
+        <w:p>
+          <w:pPr>
+            <w:pStyle w:val="TOC2"/>
+            <w:tabs>
+              <w:tab w:val="right" w:leader="dot" w:pos="10790"/>
+            </w:tabs>
+            <w:rPr>
+              <w:rFonts w:asciiTheme="minorHAnsi" w:eastAsiaTheme="minorEastAsia" w:hAnsiTheme="minorHAnsi" w:cstheme="minorBidi"/>
+              <w:noProof/>
+              <w:kern w:val="2"/>
+              <w:sz w:val="24"/>
+              <w:szCs w:val="24"/>
+              <w14:ligatures w14:val="standardContextual"/>
+            </w:rPr>
+          </w:pPr>
+          <w:hyperlink w:anchor="_Toc241064286" w:history="1">
+            <w:r>
+              <w:rPr>
+                <w:rStyle w:val="Hyperlink"/>
+                <w:noProof/>
+              </w:rPr>
+              <w:t>6.1 Matrix filled by Milestone 1</w:t>
+            </w:r>
+            <w:r>
+              <w:rPr>
+                <w:noProof/>
+                <w:webHidden/>
+              </w:rPr>
+              <w:tab/>
+            </w:r>
+            <w:r>
+              <w:rPr>
+                <w:noProof/>
+                <w:webHidden/>
+              </w:rPr>
+              <w:fldChar w:fldCharType="begin"/>
+            </w:r>
+            <w:r>
+              <w:rPr>
+                <w:noProof/>
+                <w:webHidden/>
+              </w:rPr>
+              <w:instrText xml:space="preserve"> PAGEREF _Toc241064286 \h </w:instrText>
+            </w:r>
+            <w:r>
+              <w:rPr>
+                <w:noProof/>
+                <w:webHidden/>
+              </w:rPr>
+            </w:r>
+            <w:r>
+              <w:rPr>
+                <w:noProof/>
+                <w:webHidden/>
+              </w:rPr>
+              <w:fldChar w:fldCharType="separate"/>
+            </w:r>
+            <w:r>
+              <w:rPr>
+                <w:noProof/>
+                <w:webHidden/>
+              </w:rPr>
+              <w:t>14</w:t>
+            </w:r>
+            <w:r>
+              <w:rPr>
+                <w:noProof/>
+                <w:webHidden/>
+              </w:rPr>
+              <w:fldChar w:fldCharType="end"/>
+            </w:r>
+          </w:hyperlink>
+        </w:p>
+        <w:p>
+          <w:pPr>
+            <w:pStyle w:val="TOC2"/>
+            <w:tabs>
+              <w:tab w:val="right" w:leader="dot" w:pos="10790"/>
+            </w:tabs>
+            <w:rPr>
+              <w:rFonts w:asciiTheme="minorHAnsi" w:eastAsiaTheme="minorEastAsia" w:hAnsiTheme="minorHAnsi" w:cstheme="minorBidi"/>
+              <w:noProof/>
+              <w:kern w:val="2"/>
+              <w:sz w:val="24"/>
+              <w:szCs w:val="24"/>
+              <w14:ligatures w14:val="standardContextual"/>
+            </w:rPr>
+          </w:pPr>
+          <w:hyperlink w:anchor="_Toc241064287" w:history="1">
+            <w:r>
+              <w:rPr>
+                <w:rStyle w:val="Hyperlink"/>
+                <w:noProof/>
+              </w:rPr>
+              <w:t>6.2 Matrix filled by Milestone 2</w:t>
+            </w:r>
+            <w:r>
+              <w:rPr>
+                <w:noProof/>
+                <w:webHidden/>
+              </w:rPr>
+              <w:tab/>
+            </w:r>
+            <w:r>
+              <w:rPr>
+                <w:noProof/>
+                <w:webHidden/>
+              </w:rPr>
+              <w:fldChar w:fldCharType="begin"/>
+            </w:r>
+            <w:r>
+              <w:rPr>
+                <w:noProof/>
+                <w:webHidden/>
+              </w:rPr>
+              <w:instrText xml:space="preserve"> PAGEREF _Toc241064287 \h </w:instrText>
+            </w:r>
+            <w:r>
+              <w:rPr>
+                <w:noProof/>
+                <w:webHidden/>
+              </w:rPr>
+            </w:r>
+            <w:r>
+              <w:rPr>
+                <w:noProof/>
+                <w:webHidden/>
+              </w:rPr>
+              <w:fldChar w:fldCharType="separate"/>
+            </w:r>
+            <w:r>
+              <w:rPr>
+                <w:noProof/>
+                <w:webHidden/>
+              </w:rPr>
+              <w:t>16</w:t>
             </w:r>
             <w:r>
               <w:rPr>
@@ -1627,7 +1992,7 @@
               <w14:ligatures w14:val="standardContextual"/>
             </w:rPr>
           </w:pPr>
-          <w:hyperlink w:anchor="_Toc239883356" w:history="1">
+          <w:hyperlink w:anchor="_Toc241064288" w:history="1">
             <w:r>
               <w:rPr>
                 <w:rStyle w:val="Hyperlink"/>
@@ -1654,7 +2019,7 @@
                 <w:noProof/>
                 <w:webHidden/>
               </w:rPr>
-              <w:instrText xml:space="preserve"> PAGEREF _Toc239883356 \h </w:instrText>
+              <w:instrText xml:space="preserve"> PAGEREF _Toc241064288 \h </w:instrText>
             </w:r>
             <w:r>
               <w:rPr>
@@ -1674,7 +2039,7 @@
                 <w:noProof/>
                 <w:webHidden/>
               </w:rPr>
-              <w:t>13</w:t>
+              <w:t>17</w:t>
             </w:r>
             <w:r>
               <w:rPr>
@@ -1700,7 +2065,7 @@
               <w14:ligatures w14:val="standardContextual"/>
             </w:rPr>
           </w:pPr>
-          <w:hyperlink w:anchor="_Toc239883357" w:history="1">
+          <w:hyperlink w:anchor="_Toc241064289" w:history="1">
             <w:r>
               <w:rPr>
                 <w:rStyle w:val="Hyperlink"/>
@@ -1727,7 +2092,7 @@
                 <w:noProof/>
                 <w:webHidden/>
               </w:rPr>
-              <w:instrText xml:space="preserve"> PAGEREF _Toc239883357 \h </w:instrText>
+              <w:instrText xml:space="preserve"> PAGEREF _Toc241064289 \h </w:instrText>
             </w:r>
             <w:r>
               <w:rPr>
@@ -1747,7 +2112,7 @@
                 <w:noProof/>
                 <w:webHidden/>
               </w:rPr>
-              <w:t>15</w:t>
+              <w:t>20</w:t>
             </w:r>
             <w:r>
               <w:rPr>
@@ -1773,7 +2138,7 @@
               <w14:ligatures w14:val="standardContextual"/>
             </w:rPr>
           </w:pPr>
-          <w:hyperlink w:anchor="_Toc239883358" w:history="1">
+          <w:hyperlink w:anchor="_Toc241064290" w:history="1">
             <w:r>
               <w:rPr>
                 <w:rStyle w:val="Hyperlink"/>
@@ -1800,7 +2165,7 @@
                 <w:noProof/>
                 <w:webHidden/>
               </w:rPr>
-              <w:instrText xml:space="preserve"> PAGEREF _Toc239883358 \h </w:instrText>
+              <w:instrText xml:space="preserve"> PAGEREF _Toc241064290 \h </w:instrText>
             </w:r>
             <w:r>
               <w:rPr>
@@ -1820,7 +2185,7 @@
                 <w:noProof/>
                 <w:webHidden/>
               </w:rPr>
-              <w:t>16</w:t>
+              <w:t>21</w:t>
             </w:r>
             <w:r>
               <w:rPr>
@@ -1846,7 +2211,7 @@
               <w14:ligatures w14:val="standardContextual"/>
             </w:rPr>
           </w:pPr>
-          <w:hyperlink w:anchor="_Toc239883359" w:history="1">
+          <w:hyperlink w:anchor="_Toc241064291" w:history="1">
             <w:r>
               <w:rPr>
                 <w:rStyle w:val="Hyperlink"/>
@@ -1873,7 +2238,7 @@
                 <w:noProof/>
                 <w:webHidden/>
               </w:rPr>
-              <w:instrText xml:space="preserve"> PAGEREF _Toc239883359 \h </w:instrText>
+              <w:instrText xml:space="preserve"> PAGEREF _Toc241064291 \h </w:instrText>
             </w:r>
             <w:r>
               <w:rPr>
@@ -1893,7 +2258,7 @@
                 <w:noProof/>
                 <w:webHidden/>
               </w:rPr>
-              <w:t>19</w:t>
+              <w:t>24</w:t>
             </w:r>
             <w:r>
               <w:rPr>
@@ -1919,7 +2284,7 @@
               <w14:ligatures w14:val="standardContextual"/>
             </w:rPr>
           </w:pPr>
-          <w:hyperlink w:anchor="_Toc239883360" w:history="1">
+          <w:hyperlink w:anchor="_Toc241064292" w:history="1">
             <w:r>
               <w:rPr>
                 <w:rStyle w:val="Hyperlink"/>
@@ -1946,7 +2311,7 @@
                 <w:noProof/>
                 <w:webHidden/>
               </w:rPr>
-              <w:instrText xml:space="preserve"> PAGEREF _Toc239883360 \h </w:instrText>
+              <w:instrText xml:space="preserve"> PAGEREF _Toc241064292 \h </w:instrText>
             </w:r>
             <w:r>
               <w:rPr>
@@ -1966,7 +2331,7 @@
                 <w:noProof/>
                 <w:webHidden/>
               </w:rPr>
-              <w:t>19</w:t>
+              <w:t>24</w:t>
             </w:r>
             <w:r>
               <w:rPr>
@@ -1992,7 +2357,7 @@
               <w14:ligatures w14:val="standardContextual"/>
             </w:rPr>
           </w:pPr>
-          <w:hyperlink w:anchor="_Toc239883361" w:history="1">
+          <w:hyperlink w:anchor="_Toc241064293" w:history="1">
             <w:r>
               <w:rPr>
                 <w:rStyle w:val="Hyperlink"/>
@@ -2019,7 +2384,7 @@
                 <w:noProof/>
                 <w:webHidden/>
               </w:rPr>
-              <w:instrText xml:space="preserve"> PAGEREF _Toc239883361 \h </w:instrText>
+              <w:instrText xml:space="preserve"> PAGEREF _Toc241064293 \h </w:instrText>
             </w:r>
             <w:r>
               <w:rPr>
@@ -2039,7 +2404,7 @@
                 <w:noProof/>
                 <w:webHidden/>
               </w:rPr>
-              <w:t>19</w:t>
+              <w:t>24</w:t>
             </w:r>
             <w:r>
               <w:rPr>
@@ -2065,7 +2430,7 @@
               <w14:ligatures w14:val="standardContextual"/>
             </w:rPr>
           </w:pPr>
-          <w:hyperlink w:anchor="_Toc239883362" w:history="1">
+          <w:hyperlink w:anchor="_Toc241064294" w:history="1">
             <w:r>
               <w:rPr>
                 <w:rStyle w:val="Hyperlink"/>
@@ -2092,7 +2457,7 @@
                 <w:noProof/>
                 <w:webHidden/>
               </w:rPr>
-              <w:instrText xml:space="preserve"> PAGEREF _Toc239883362 \h </w:instrText>
+              <w:instrText xml:space="preserve"> PAGEREF _Toc241064294 \h </w:instrText>
             </w:r>
             <w:r>
               <w:rPr>
@@ -2112,7 +2477,7 @@
                 <w:noProof/>
                 <w:webHidden/>
               </w:rPr>
-              <w:t>19</w:t>
+              <w:t>24</w:t>
             </w:r>
             <w:r>
               <w:rPr>
@@ -2138,7 +2503,7 @@
               <w14:ligatures w14:val="standardContextual"/>
             </w:rPr>
           </w:pPr>
-          <w:hyperlink w:anchor="_Toc239883363" w:history="1">
+          <w:hyperlink w:anchor="_Toc241064295" w:history="1">
             <w:r>
               <w:rPr>
                 <w:rStyle w:val="Hyperlink"/>
@@ -2165,7 +2530,7 @@
                 <w:noProof/>
                 <w:webHidden/>
               </w:rPr>
-              <w:instrText xml:space="preserve"> PAGEREF _Toc239883363 \h </w:instrText>
+              <w:instrText xml:space="preserve"> PAGEREF _Toc241064295 \h </w:instrText>
             </w:r>
             <w:r>
               <w:rPr>
@@ -2185,7 +2550,7 @@
                 <w:noProof/>
                 <w:webHidden/>
               </w:rPr>
-              <w:t>20</w:t>
+              <w:t>25</w:t>
             </w:r>
             <w:r>
               <w:rPr>
@@ -2211,12 +2576,158 @@
               <w14:ligatures w14:val="standardContextual"/>
             </w:rPr>
           </w:pPr>
-          <w:hyperlink w:anchor="_Toc239883364" w:history="1">
+          <w:hyperlink w:anchor="_Toc241064296" w:history="1">
             <w:r>
               <w:rPr>
                 <w:rStyle w:val="Hyperlink"/>
                 <w:noProof/>
               </w:rPr>
+              <w:t>13. Solution Design Baseline</w:t>
+            </w:r>
+            <w:r>
+              <w:rPr>
+                <w:noProof/>
+                <w:webHidden/>
+              </w:rPr>
+              <w:tab/>
+            </w:r>
+            <w:r>
+              <w:rPr>
+                <w:noProof/>
+                <w:webHidden/>
+              </w:rPr>
+              <w:fldChar w:fldCharType="begin"/>
+            </w:r>
+            <w:r>
+              <w:rPr>
+                <w:noProof/>
+                <w:webHidden/>
+              </w:rPr>
+              <w:instrText xml:space="preserve"> PAGEREF _Toc241064296 \h </w:instrText>
+            </w:r>
+            <w:r>
+              <w:rPr>
+                <w:noProof/>
+                <w:webHidden/>
+              </w:rPr>
+            </w:r>
+            <w:r>
+              <w:rPr>
+                <w:noProof/>
+                <w:webHidden/>
+              </w:rPr>
+              <w:fldChar w:fldCharType="separate"/>
+            </w:r>
+            <w:r>
+              <w:rPr>
+                <w:noProof/>
+                <w:webHidden/>
+              </w:rPr>
+              <w:t>26</w:t>
+            </w:r>
+            <w:r>
+              <w:rPr>
+                <w:noProof/>
+                <w:webHidden/>
+              </w:rPr>
+              <w:fldChar w:fldCharType="end"/>
+            </w:r>
+          </w:hyperlink>
+        </w:p>
+        <w:p>
+          <w:pPr>
+            <w:pStyle w:val="TOC2"/>
+            <w:tabs>
+              <w:tab w:val="right" w:leader="dot" w:pos="10790"/>
+            </w:tabs>
+            <w:rPr>
+              <w:rFonts w:asciiTheme="minorHAnsi" w:eastAsiaTheme="minorEastAsia" w:hAnsiTheme="minorHAnsi" w:cstheme="minorBidi"/>
+              <w:noProof/>
+              <w:kern w:val="2"/>
+              <w:sz w:val="24"/>
+              <w:szCs w:val="24"/>
+              <w14:ligatures w14:val="standardContextual"/>
+            </w:rPr>
+          </w:pPr>
+          <w:hyperlink w:anchor="_Toc241064297" w:history="1">
+            <w:r>
+              <w:rPr>
+                <w:rStyle w:val="Hyperlink"/>
+                <w:noProof/>
+              </w:rPr>
+              <w:t>13.1 Repository</w:t>
+            </w:r>
+            <w:r>
+              <w:rPr>
+                <w:noProof/>
+                <w:webHidden/>
+              </w:rPr>
+              <w:tab/>
+            </w:r>
+            <w:r>
+              <w:rPr>
+                <w:noProof/>
+                <w:webHidden/>
+              </w:rPr>
+              <w:fldChar w:fldCharType="begin"/>
+            </w:r>
+            <w:r>
+              <w:rPr>
+                <w:noProof/>
+                <w:webHidden/>
+              </w:rPr>
+              <w:instrText xml:space="preserve"> PAGEREF _Toc241064297 \h </w:instrText>
+            </w:r>
+            <w:r>
+              <w:rPr>
+                <w:noProof/>
+                <w:webHidden/>
+              </w:rPr>
+            </w:r>
+            <w:r>
+              <w:rPr>
+                <w:noProof/>
+                <w:webHidden/>
+              </w:rPr>
+              <w:fldChar w:fldCharType="separate"/>
+            </w:r>
+            <w:r>
+              <w:rPr>
+                <w:noProof/>
+                <w:webHidden/>
+              </w:rPr>
+              <w:t>26</w:t>
+            </w:r>
+            <w:r>
+              <w:rPr>
+                <w:noProof/>
+                <w:webHidden/>
+              </w:rPr>
+              <w:fldChar w:fldCharType="end"/>
+            </w:r>
+          </w:hyperlink>
+        </w:p>
+        <w:p>
+          <w:pPr>
+            <w:pStyle w:val="TOC1"/>
+            <w:tabs>
+              <w:tab w:val="right" w:leader="dot" w:pos="10790"/>
+            </w:tabs>
+            <w:rPr>
+              <w:rFonts w:asciiTheme="minorHAnsi" w:eastAsiaTheme="minorEastAsia" w:hAnsiTheme="minorHAnsi" w:cstheme="minorBidi"/>
+              <w:noProof/>
+              <w:kern w:val="2"/>
+              <w:sz w:val="24"/>
+              <w:szCs w:val="24"/>
+              <w14:ligatures w14:val="standardContextual"/>
+            </w:rPr>
+          </w:pPr>
+          <w:hyperlink w:anchor="_Toc241064298" w:history="1">
+            <w:r>
+              <w:rPr>
+                <w:rStyle w:val="Hyperlink"/>
+                <w:noProof/>
+              </w:rPr>
               <w:t>References</w:t>
             </w:r>
             <w:r>
@@ -2238,7 +2749,7 @@
                 <w:noProof/>
                 <w:webHidden/>
               </w:rPr>
-              <w:instrText xml:space="preserve"> PAGEREF _Toc239883364 \h </w:instrText>
+              <w:instrText xml:space="preserve"> PAGEREF _Toc241064298 \h </w:instrText>
             </w:r>
             <w:r>
               <w:rPr>
@@ -2258,7 +2769,7 @@
                 <w:noProof/>
                 <w:webHidden/>
               </w:rPr>
-              <w:t>21</w:t>
+              <w:t>26</w:t>
             </w:r>
             <w:r>
               <w:rPr>
@@ -2299,7 +2810,7 @@
       <w:pPr>
         <w:pStyle w:val="Heading1"/>
       </w:pPr>
-      <w:bookmarkStart w:id="0" w:name="_Toc239883338"/>
+      <w:bookmarkStart w:id="0" w:name="_Toc241064265"/>
       <w:r>
         <w:lastRenderedPageBreak/>
         <w:t>Document Control</w:t>
@@ -3284,12 +3795,28 @@
     </w:tbl>
     <w:p>
       <w:pPr>
+        <w:rPr>
+          <w:b/>
+          <w:bCs/>
+          <w:color w:val="2E5395"/>
+          <w:sz w:val="23"/>
+          <w:szCs w:val="23"/>
+        </w:rPr>
+      </w:pPr>
+      <w:r>
+        <w:br w:type="page"/>
+      </w:r>
+    </w:p>
+    <w:p>
+      <w:pPr>
         <w:pStyle w:val="Heading2"/>
       </w:pPr>
-      <w:bookmarkStart w:id="1" w:name="_Toc239883339"/>
+      <w:bookmarkStart w:id="1" w:name="_Toc241064266"/>
       <w:r>
+        <w:lastRenderedPageBreak/>
         <w:t>Change record</w:t>
       </w:r>
+      <w:bookmarkEnd w:id="1"/>
     </w:p>
     <w:tbl>
       <w:tblPr>
@@ -3577,6 +4104,128 @@
           </w:p>
         </w:tc>
       </w:tr>
+      <w:tr>
+        <w:tc>
+          <w:tcPr>
+            <w:tcW w:w="523" w:type="pct"/>
+          </w:tcPr>
+          <w:p>
+            <w:pPr>
+              <w:pStyle w:val="Compact"/>
+              <w:spacing w:before="40" w:after="40"/>
+            </w:pPr>
+            <w:r>
+              <w:t>CR-4</w:t>
+            </w:r>
+          </w:p>
+        </w:tc>
+        <w:tc>
+          <w:tcPr>
+            <w:tcW w:w="1117" w:type="pct"/>
+          </w:tcPr>
+          <w:p>
+            <w:pPr>
+              <w:pStyle w:val="Compact"/>
+              <w:spacing w:before="40" w:after="40"/>
+            </w:pPr>
+            <w:r>
+              <w:t>Section 5</w:t>
+            </w:r>
+          </w:p>
+        </w:tc>
+        <w:tc>
+          <w:tcPr>
+            <w:tcW w:w="2102" w:type="pct"/>
+          </w:tcPr>
+          <w:p>
+            <w:pPr>
+              <w:pStyle w:val="Compact"/>
+              <w:spacing w:before="40" w:after="40"/>
+            </w:pPr>
+            <w:r>
+              <w:t xml:space="preserve">Added column ids and new constraint technology </w:t>
+            </w:r>
+            <w:r>
+              <w:t>environment</w:t>
+            </w:r>
+          </w:p>
+        </w:tc>
+        <w:tc>
+          <w:tcPr>
+            <w:tcW w:w="1258" w:type="pct"/>
+          </w:tcPr>
+          <w:p>
+            <w:pPr>
+              <w:pStyle w:val="Compact"/>
+              <w:spacing w:before="40" w:after="40"/>
+            </w:pPr>
+            <w:r>
+              <w:t>To help with identifying and referencing constraints. The new constraint helps with the testing of the project that the lecturer can do on their end</w:t>
+            </w:r>
+          </w:p>
+        </w:tc>
+      </w:tr>
+      <w:tr>
+        <w:tc>
+          <w:tcPr>
+            <w:tcW w:w="523" w:type="pct"/>
+          </w:tcPr>
+          <w:p>
+            <w:pPr>
+              <w:pStyle w:val="Compact"/>
+              <w:spacing w:before="40" w:after="40"/>
+            </w:pPr>
+            <w:r>
+              <w:t>CR-5</w:t>
+            </w:r>
+          </w:p>
+        </w:tc>
+        <w:tc>
+          <w:tcPr>
+            <w:tcW w:w="1117" w:type="pct"/>
+          </w:tcPr>
+          <w:p>
+            <w:pPr>
+              <w:pStyle w:val="Compact"/>
+              <w:spacing w:before="40" w:after="40"/>
+            </w:pPr>
+            <w:r>
+              <w:t>Section 2</w:t>
+            </w:r>
+          </w:p>
+        </w:tc>
+        <w:tc>
+          <w:tcPr>
+            <w:tcW w:w="2102" w:type="pct"/>
+          </w:tcPr>
+          <w:p>
+            <w:pPr>
+              <w:pStyle w:val="Compact"/>
+              <w:spacing w:before="40" w:after="40"/>
+            </w:pPr>
+            <w:r>
+              <w:t xml:space="preserve">Added new row </w:t>
+            </w:r>
+            <w:r>
+              <w:t>ASR influence</w:t>
+            </w:r>
+          </w:p>
+        </w:tc>
+        <w:tc>
+          <w:tcPr>
+            <w:tcW w:w="1258" w:type="pct"/>
+          </w:tcPr>
+          <w:p>
+            <w:pPr>
+              <w:pStyle w:val="Compact"/>
+              <w:spacing w:before="40" w:after="40"/>
+            </w:pPr>
+            <w:r>
+              <w:t>This links the stakeholders to the main requirements that needs to be followed</w:t>
+            </w:r>
+          </w:p>
+        </w:tc>
+      </w:tr>
     </w:tbl>
     <w:p>
       <w:pPr>
@@ -3601,11 +4250,12 @@
       <w:pPr>
         <w:pStyle w:val="Heading2"/>
       </w:pPr>
+      <w:bookmarkStart w:id="2" w:name="_Toc241064267"/>
       <w:r>
         <w:lastRenderedPageBreak/>
         <w:t>Baseline Approval</w:t>
       </w:r>
-      <w:bookmarkEnd w:id="1"/>
+      <w:bookmarkEnd w:id="2"/>
     </w:p>
     <w:tbl>
       <w:tblPr>
@@ -3947,6 +4597,360 @@
         </w:tc>
       </w:tr>
     </w:tbl>
+    <w:p/>
+    <w:p>
+      <w:pPr>
+        <w:pStyle w:val="Heading2"/>
+      </w:pPr>
+      <w:bookmarkStart w:id="3" w:name="_Toc241064268"/>
+      <w:r>
+        <w:t>Baseline Approval</w:t>
+      </w:r>
+      <w:r>
+        <w:t xml:space="preserve"> (Milestone 2)</w:t>
+      </w:r>
+      <w:bookmarkEnd w:id="3"/>
+    </w:p>
+    <w:tbl>
+      <w:tblPr>
+        <w:tblW w:w="10400" w:type="dxa"/>
+        <w:tblBorders>
+          <w:top w:val="single" w:sz="4" w:space="0" w:color="auto"/>
+          <w:left w:val="single" w:sz="4" w:space="0" w:color="auto"/>
+          <w:bottom w:val="single" w:sz="4" w:space="0" w:color="auto"/>
+          <w:right w:val="single" w:sz="4" w:space="0" w:color="auto"/>
+          <w:insideH w:val="single" w:sz="4" w:space="0" w:color="auto"/>
+          <w:insideV w:val="single" w:sz="4" w:space="0" w:color="auto"/>
+        </w:tblBorders>
+        <w:tblLayout w:type="fixed"/>
+        <w:tblCellMar>
+          <w:left w:w="10" w:type="dxa"/>
+          <w:right w:w="10" w:type="dxa"/>
+        </w:tblCellMar>
+        <w:tblLook w:val="04A0" w:firstRow="1" w:lastRow="0" w:firstColumn="1" w:lastColumn="0" w:noHBand="0" w:noVBand="1"/>
+      </w:tblPr>
+      <w:tblGrid>
+        <w:gridCol w:w="4000"/>
+        <w:gridCol w:w="6400"/>
+      </w:tblGrid>
+      <w:tr>
+        <w:tc>
+          <w:tcPr>
+            <w:tcW w:w="4000" w:type="dxa"/>
+            <w:tcMar>
+              <w:top w:w="80" w:type="dxa"/>
+              <w:left w:w="100" w:type="dxa"/>
+              <w:bottom w:w="80" w:type="dxa"/>
+              <w:right w:w="100" w:type="dxa"/>
+            </w:tcMar>
+          </w:tcPr>
+          <w:p>
+            <w:r>
+              <w:rPr>
+                <w:color w:val="000000"/>
+                <w:sz w:val="19"/>
+                <w:szCs w:val="19"/>
+              </w:rPr>
+              <w:t>Project</w:t>
+            </w:r>
+          </w:p>
+        </w:tc>
+        <w:tc>
+          <w:tcPr>
+            <w:tcW w:w="6400" w:type="dxa"/>
+            <w:tcMar>
+              <w:top w:w="80" w:type="dxa"/>
+              <w:left w:w="100" w:type="dxa"/>
+              <w:bottom w:w="80" w:type="dxa"/>
+              <w:right w:w="100" w:type="dxa"/>
+            </w:tcMar>
+          </w:tcPr>
+          <w:p>
+            <w:proofErr w:type="spellStart"/>
+            <w:r>
+              <w:t>CivicConnect</w:t>
+            </w:r>
+            <w:proofErr w:type="spellEnd"/>
+          </w:p>
+        </w:tc>
+      </w:tr>
+      <w:tr>
+        <w:tc>
+          <w:tcPr>
+            <w:tcW w:w="4000" w:type="dxa"/>
+            <w:tcMar>
+              <w:top w:w="80" w:type="dxa"/>
+              <w:left w:w="100" w:type="dxa"/>
+              <w:bottom w:w="80" w:type="dxa"/>
+              <w:right w:w="100" w:type="dxa"/>
+            </w:tcMar>
+          </w:tcPr>
+          <w:p>
+            <w:r>
+              <w:rPr>
+                <w:color w:val="000000"/>
+                <w:sz w:val="19"/>
+                <w:szCs w:val="19"/>
+              </w:rPr>
+              <w:t>Baseline Type</w:t>
+            </w:r>
+          </w:p>
+        </w:tc>
+        <w:tc>
+          <w:tcPr>
+            <w:tcW w:w="6400" w:type="dxa"/>
+            <w:tcMar>
+              <w:top w:w="80" w:type="dxa"/>
+              <w:left w:w="100" w:type="dxa"/>
+              <w:bottom w:w="80" w:type="dxa"/>
+              <w:right w:w="100" w:type="dxa"/>
+            </w:tcMar>
+          </w:tcPr>
+          <w:p>
+            <w:r>
+              <w:t>Engineering Baseline (PED)</w:t>
+            </w:r>
+          </w:p>
+        </w:tc>
+      </w:tr>
+      <w:tr>
+        <w:tc>
+          <w:tcPr>
+            <w:tcW w:w="4000" w:type="dxa"/>
+            <w:tcMar>
+              <w:top w:w="80" w:type="dxa"/>
+              <w:left w:w="100" w:type="dxa"/>
+              <w:bottom w:w="80" w:type="dxa"/>
+              <w:right w:w="100" w:type="dxa"/>
+            </w:tcMar>
+          </w:tcPr>
+          <w:p>
+            <w:r>
+              <w:rPr>
+                <w:color w:val="000000"/>
+                <w:sz w:val="19"/>
+                <w:szCs w:val="19"/>
+              </w:rPr>
+              <w:t>Version</w:t>
+            </w:r>
+          </w:p>
+        </w:tc>
+        <w:tc>
+          <w:tcPr>
+            <w:tcW w:w="6400" w:type="dxa"/>
+            <w:tcMar>
+              <w:top w:w="80" w:type="dxa"/>
+              <w:left w:w="100" w:type="dxa"/>
+              <w:bottom w:w="80" w:type="dxa"/>
+              <w:right w:w="100" w:type="dxa"/>
+            </w:tcMar>
+          </w:tcPr>
+          <w:p>
+            <w:r>
+              <w:t>2.0</w:t>
+            </w:r>
+          </w:p>
+        </w:tc>
+      </w:tr>
+      <w:tr>
+        <w:tc>
+          <w:tcPr>
+            <w:tcW w:w="4000" w:type="dxa"/>
+            <w:tcMar>
+              <w:top w:w="80" w:type="dxa"/>
+              <w:left w:w="100" w:type="dxa"/>
+              <w:bottom w:w="80" w:type="dxa"/>
+              <w:right w:w="100" w:type="dxa"/>
+            </w:tcMar>
+          </w:tcPr>
+          <w:p>
+            <w:r>
+              <w:rPr>
+                <w:color w:val="000000"/>
+                <w:sz w:val="19"/>
+                <w:szCs w:val="19"/>
+              </w:rPr>
+              <w:t>Date</w:t>
+            </w:r>
+          </w:p>
+        </w:tc>
+        <w:tc>
+          <w:tcPr>
+            <w:tcW w:w="6400" w:type="dxa"/>
+            <w:tcMar>
+              <w:top w:w="80" w:type="dxa"/>
+              <w:left w:w="100" w:type="dxa"/>
+              <w:bottom w:w="80" w:type="dxa"/>
+              <w:right w:w="100" w:type="dxa"/>
+            </w:tcMar>
+          </w:tcPr>
+          <w:p>
+            <w:r>
+              <w:rPr>
+                <w:iCs/>
+              </w:rPr>
+              <w:t>09/09/2026</w:t>
+            </w:r>
+          </w:p>
+        </w:tc>
+      </w:tr>
+      <w:tr>
+        <w:tc>
+          <w:tcPr>
+            <w:tcW w:w="4000" w:type="dxa"/>
+            <w:tcMar>
+              <w:top w:w="80" w:type="dxa"/>
+              <w:left w:w="100" w:type="dxa"/>
+              <w:bottom w:w="80" w:type="dxa"/>
+              <w:right w:w="100" w:type="dxa"/>
+            </w:tcMar>
+          </w:tcPr>
+          <w:p>
+            <w:r>
+              <w:rPr>
+                <w:color w:val="000000"/>
+                <w:sz w:val="19"/>
+                <w:szCs w:val="19"/>
+              </w:rPr>
+              <w:t>Scope reviewed (Y/N)</w:t>
+            </w:r>
+          </w:p>
+        </w:tc>
+        <w:tc>
+          <w:tcPr>
+            <w:tcW w:w="6400" w:type="dxa"/>
+            <w:tcMar>
+              <w:top w:w="80" w:type="dxa"/>
+              <w:left w:w="100" w:type="dxa"/>
+              <w:bottom w:w="80" w:type="dxa"/>
+              <w:right w:w="100" w:type="dxa"/>
+            </w:tcMar>
+          </w:tcPr>
+          <w:p>
+            <w:r>
+              <w:t>N</w:t>
+            </w:r>
+          </w:p>
+        </w:tc>
+      </w:tr>
+      <w:tr>
+        <w:tc>
+          <w:tcPr>
+            <w:tcW w:w="4000" w:type="dxa"/>
+            <w:tcMar>
+              <w:top w:w="80" w:type="dxa"/>
+              <w:left w:w="100" w:type="dxa"/>
+              <w:bottom w:w="80" w:type="dxa"/>
+              <w:right w:w="100" w:type="dxa"/>
+            </w:tcMar>
+          </w:tcPr>
+          <w:p>
+            <w:r>
+              <w:rPr>
+                <w:color w:val="000000"/>
+                <w:sz w:val="19"/>
+                <w:szCs w:val="19"/>
+              </w:rPr>
+              <w:t>Requirements/traceability checked (Y/N)</w:t>
+            </w:r>
+          </w:p>
+        </w:tc>
+        <w:tc>
+          <w:tcPr>
+            <w:tcW w:w="6400" w:type="dxa"/>
+            <w:tcMar>
+              <w:top w:w="80" w:type="dxa"/>
+              <w:left w:w="100" w:type="dxa"/>
+              <w:bottom w:w="80" w:type="dxa"/>
+              <w:right w:w="100" w:type="dxa"/>
+            </w:tcMar>
+          </w:tcPr>
+          <w:p>
+            <w:r>
+              <w:t>N</w:t>
+            </w:r>
+          </w:p>
+        </w:tc>
+      </w:tr>
+      <w:tr>
+        <w:tc>
+          <w:tcPr>
+            <w:tcW w:w="4000" w:type="dxa"/>
+            <w:tcMar>
+              <w:top w:w="80" w:type="dxa"/>
+              <w:left w:w="100" w:type="dxa"/>
+              <w:bottom w:w="80" w:type="dxa"/>
+              <w:right w:w="100" w:type="dxa"/>
+            </w:tcMar>
+          </w:tcPr>
+          <w:p>
+            <w:r>
+              <w:rPr>
+                <w:color w:val="000000"/>
+                <w:sz w:val="19"/>
+                <w:szCs w:val="19"/>
+              </w:rPr>
+              <w:t>Repository/governance controls checked (Y/N)</w:t>
+            </w:r>
+          </w:p>
+        </w:tc>
+        <w:tc>
+          <w:tcPr>
+            <w:tcW w:w="6400" w:type="dxa"/>
+            <w:tcMar>
+              <w:top w:w="80" w:type="dxa"/>
+              <w:left w:w="100" w:type="dxa"/>
+              <w:bottom w:w="80" w:type="dxa"/>
+              <w:right w:w="100" w:type="dxa"/>
+            </w:tcMar>
+          </w:tcPr>
+          <w:p>
+            <w:r>
+              <w:t>N</w:t>
+            </w:r>
+          </w:p>
+        </w:tc>
+      </w:tr>
+      <w:tr>
+        <w:tc>
+          <w:tcPr>
+            <w:tcW w:w="4000" w:type="dxa"/>
+            <w:tcMar>
+              <w:top w:w="80" w:type="dxa"/>
+              <w:left w:w="100" w:type="dxa"/>
+              <w:bottom w:w="80" w:type="dxa"/>
+              <w:right w:w="100" w:type="dxa"/>
+            </w:tcMar>
+          </w:tcPr>
+          <w:p>
+            <w:r>
+              <w:rPr>
+                <w:color w:val="000000"/>
+                <w:sz w:val="19"/>
+                <w:szCs w:val="19"/>
+              </w:rPr>
+              <w:t>Outcome (ACCEPTED / CONDITIONALLY ACCEPTED / REVISION REQUIRED)</w:t>
+            </w:r>
+          </w:p>
+        </w:tc>
+        <w:tc>
+          <w:tcPr>
+            <w:tcW w:w="6400" w:type="dxa"/>
+            <w:tcMar>
+              <w:top w:w="80" w:type="dxa"/>
+              <w:left w:w="100" w:type="dxa"/>
+              <w:bottom w:w="80" w:type="dxa"/>
+              <w:right w:w="100" w:type="dxa"/>
+            </w:tcMar>
+          </w:tcPr>
+          <w:p>
+            <w:r>
+              <w:t>Conditionally accepted</w:t>
+            </w:r>
+          </w:p>
+        </w:tc>
+      </w:tr>
+    </w:tbl>
     <w:p>
       <w:r>
         <w:br w:type="page"/>
@@ -3956,22 +4960,22 @@
       <w:pPr>
         <w:pStyle w:val="Heading1"/>
       </w:pPr>
-      <w:bookmarkStart w:id="2" w:name="_Toc239883340"/>
+      <w:bookmarkStart w:id="4" w:name="_Toc241064269"/>
       <w:r>
         <w:lastRenderedPageBreak/>
         <w:t>1. Problem Statement &amp; Business Need</w:t>
       </w:r>
-      <w:bookmarkEnd w:id="2"/>
+      <w:bookmarkEnd w:id="4"/>
     </w:p>
     <w:p>
       <w:pPr>
         <w:pStyle w:val="Heading2"/>
       </w:pPr>
-      <w:bookmarkStart w:id="3" w:name="_Toc239883341"/>
+      <w:bookmarkStart w:id="5" w:name="_Toc241064270"/>
       <w:r>
         <w:t>1.1 Problem Statement</w:t>
       </w:r>
-      <w:bookmarkEnd w:id="3"/>
+      <w:bookmarkEnd w:id="5"/>
     </w:p>
     <w:p>
       <w:r>
@@ -3990,11 +4994,11 @@
       <w:pPr>
         <w:pStyle w:val="Heading2"/>
       </w:pPr>
-      <w:bookmarkStart w:id="4" w:name="_Toc239883342"/>
+      <w:bookmarkStart w:id="6" w:name="_Toc241064271"/>
       <w:r>
         <w:t>1.2 Business Need</w:t>
       </w:r>
-      <w:bookmarkEnd w:id="4"/>
+      <w:bookmarkEnd w:id="6"/>
     </w:p>
     <w:p>
       <w:proofErr w:type="spellStart"/>
@@ -4013,11 +5017,11 @@
       <w:pPr>
         <w:pStyle w:val="Heading2"/>
       </w:pPr>
-      <w:bookmarkStart w:id="5" w:name="_Toc239883343"/>
+      <w:bookmarkStart w:id="7" w:name="_Toc241064272"/>
       <w:r>
         <w:t>1.3 Intended Business Value</w:t>
       </w:r>
-      <w:bookmarkEnd w:id="5"/>
+      <w:bookmarkEnd w:id="7"/>
     </w:p>
     <w:p>
       <w:proofErr w:type="spellStart"/>
@@ -4037,15 +5041,15 @@
       <w:pPr>
         <w:pStyle w:val="Heading1"/>
       </w:pPr>
-      <w:bookmarkStart w:id="6" w:name="_Toc239883344"/>
+      <w:bookmarkStart w:id="8" w:name="_Toc241064273"/>
       <w:r>
         <w:t>2. Stakeholder Analysis</w:t>
       </w:r>
-      <w:bookmarkEnd w:id="6"/>
+      <w:bookmarkEnd w:id="8"/>
     </w:p>
     <w:tbl>
       <w:tblPr>
-        <w:tblW w:w="10400" w:type="dxa"/>
+        <w:tblW w:w="11248" w:type="dxa"/>
         <w:tblBorders>
           <w:top w:val="single" w:sz="4" w:space="0" w:color="auto"/>
           <w:left w:val="single" w:sz="4" w:space="0" w:color="auto"/>
@@ -4061,12 +5065,13 @@
         <w:tblLook w:val="04A0" w:firstRow="1" w:lastRow="0" w:firstColumn="1" w:lastColumn="0" w:noHBand="0" w:noVBand="1"/>
       </w:tblPr>
       <w:tblGrid>
-        <w:gridCol w:w="1400"/>
-        <w:gridCol w:w="1800"/>
-        <w:gridCol w:w="2465"/>
-        <w:gridCol w:w="1134"/>
-        <w:gridCol w:w="1276"/>
-        <w:gridCol w:w="2325"/>
+        <w:gridCol w:w="1348"/>
+        <w:gridCol w:w="1822"/>
+        <w:gridCol w:w="2472"/>
+        <w:gridCol w:w="921"/>
+        <w:gridCol w:w="921"/>
+        <w:gridCol w:w="2290"/>
+        <w:gridCol w:w="1474"/>
       </w:tblGrid>
       <w:tr>
         <w:trPr>
@@ -4074,7 +5079,7 @@
         </w:trPr>
         <w:tc>
           <w:tcPr>
-            <w:tcW w:w="1400" w:type="dxa"/>
+            <w:tcW w:w="1348" w:type="dxa"/>
             <w:shd w:val="clear" w:color="auto" w:fill="1F3864"/>
             <w:tcMar>
               <w:top w:w="80" w:type="dxa"/>
@@ -4098,7 +5103,7 @@
         </w:tc>
         <w:tc>
           <w:tcPr>
-            <w:tcW w:w="1800" w:type="dxa"/>
+            <w:tcW w:w="1822" w:type="dxa"/>
             <w:shd w:val="clear" w:color="auto" w:fill="1F3864"/>
             <w:tcMar>
               <w:top w:w="80" w:type="dxa"/>
@@ -4122,7 +5127,7 @@
         </w:tc>
         <w:tc>
           <w:tcPr>
-            <w:tcW w:w="2465" w:type="dxa"/>
+            <w:tcW w:w="2472" w:type="dxa"/>
             <w:shd w:val="clear" w:color="auto" w:fill="1F3864"/>
             <w:tcMar>
               <w:top w:w="80" w:type="dxa"/>
@@ -4146,7 +5151,7 @@
         </w:tc>
         <w:tc>
           <w:tcPr>
-            <w:tcW w:w="1134" w:type="dxa"/>
+            <w:tcW w:w="921" w:type="dxa"/>
             <w:shd w:val="clear" w:color="auto" w:fill="1F3864"/>
             <w:tcMar>
               <w:top w:w="80" w:type="dxa"/>
@@ -4170,7 +5175,7 @@
         </w:tc>
         <w:tc>
           <w:tcPr>
-            <w:tcW w:w="1276" w:type="dxa"/>
+            <w:tcW w:w="921" w:type="dxa"/>
             <w:shd w:val="clear" w:color="auto" w:fill="1F3864"/>
             <w:tcMar>
               <w:top w:w="80" w:type="dxa"/>
@@ -4194,17 +5199,11 @@
         </w:tc>
         <w:tc>
           <w:tcPr>
-            <w:tcW w:w="2325" w:type="dxa"/>
+            <w:tcW w:w="2290" w:type="dxa"/>
             <w:shd w:val="clear" w:color="auto" w:fill="1F3864"/>
-            <w:tcMar>
-              <w:top w:w="80" w:type="dxa"/>
-              <w:left w:w="100" w:type="dxa"/>
-              <w:bottom w:w="80" w:type="dxa"/>
-              <w:right w:w="100" w:type="dxa"/>
-            </w:tcMar>
-          </w:tcPr>
-          <w:p>
-            <w:r>
+          </w:tcPr>
+          <w:p>
+            <w:pPr>
               <w:rPr>
                 <w:b/>
                 <w:bCs/>
@@ -4212,7 +5211,33 @@
                 <w:sz w:val="18"/>
                 <w:szCs w:val="18"/>
               </w:rPr>
+            </w:pPr>
+            <w:r>
+              <w:rPr>
+                <w:b/>
+                <w:bCs/>
+                <w:color w:val="FFFFFF"/>
+                <w:sz w:val="18"/>
+                <w:szCs w:val="18"/>
+              </w:rPr>
               <w:t>Potential Conflicts</w:t>
+            </w:r>
+          </w:p>
+        </w:tc>
+        <w:tc>
+          <w:tcPr>
+            <w:tcW w:w="1474" w:type="dxa"/>
+            <w:shd w:val="clear" w:color="auto" w:fill="1F3864"/>
+            <w:tcMar>
+              <w:top w:w="80" w:type="dxa"/>
+              <w:left w:w="100" w:type="dxa"/>
+              <w:bottom w:w="80" w:type="dxa"/>
+              <w:right w:w="100" w:type="dxa"/>
+            </w:tcMar>
+          </w:tcPr>
+          <w:p>
+            <w:r>
+              <w:t>ASR influence</w:t>
             </w:r>
           </w:p>
         </w:tc>
@@ -4220,7 +5245,7 @@
       <w:tr>
         <w:tc>
           <w:tcPr>
-            <w:tcW w:w="1400" w:type="dxa"/>
+            <w:tcW w:w="1348" w:type="dxa"/>
             <w:tcMar>
               <w:top w:w="80" w:type="dxa"/>
               <w:left w:w="100" w:type="dxa"/>
@@ -4236,7 +5261,7 @@
         </w:tc>
         <w:tc>
           <w:tcPr>
-            <w:tcW w:w="1800" w:type="dxa"/>
+            <w:tcW w:w="1822" w:type="dxa"/>
             <w:tcMar>
               <w:top w:w="80" w:type="dxa"/>
               <w:left w:w="100" w:type="dxa"/>
@@ -4252,7 +5277,7 @@
         </w:tc>
         <w:tc>
           <w:tcPr>
-            <w:tcW w:w="2465" w:type="dxa"/>
+            <w:tcW w:w="2472" w:type="dxa"/>
             <w:tcMar>
               <w:top w:w="80" w:type="dxa"/>
               <w:left w:w="100" w:type="dxa"/>
@@ -4278,7 +5303,7 @@
         </w:tc>
         <w:tc>
           <w:tcPr>
-            <w:tcW w:w="1134" w:type="dxa"/>
+            <w:tcW w:w="921" w:type="dxa"/>
             <w:tcMar>
               <w:top w:w="80" w:type="dxa"/>
               <w:left w:w="100" w:type="dxa"/>
@@ -4294,7 +5319,7 @@
         </w:tc>
         <w:tc>
           <w:tcPr>
-            <w:tcW w:w="1276" w:type="dxa"/>
+            <w:tcW w:w="921" w:type="dxa"/>
             <w:tcMar>
               <w:top w:w="80" w:type="dxa"/>
               <w:left w:w="100" w:type="dxa"/>
@@ -4310,25 +5335,31 @@
         </w:tc>
         <w:tc>
           <w:tcPr>
-            <w:tcW w:w="2325" w:type="dxa"/>
-            <w:tcMar>
-              <w:top w:w="80" w:type="dxa"/>
-              <w:left w:w="100" w:type="dxa"/>
-              <w:bottom w:w="80" w:type="dxa"/>
-              <w:right w:w="100" w:type="dxa"/>
-            </w:tcMar>
+            <w:tcW w:w="2290" w:type="dxa"/>
           </w:tcPr>
           <w:p>
             <w:r>
               <w:t xml:space="preserve">Wants the request to be handled fast and wants full visibility </w:t>
             </w:r>
           </w:p>
+        </w:tc>
+        <w:tc>
+          <w:tcPr>
+            <w:tcW w:w="1474" w:type="dxa"/>
+            <w:tcMar>
+              <w:top w:w="80" w:type="dxa"/>
+              <w:left w:w="100" w:type="dxa"/>
+              <w:bottom w:w="80" w:type="dxa"/>
+              <w:right w:w="100" w:type="dxa"/>
+            </w:tcMar>
+          </w:tcPr>
+          <w:p/>
         </w:tc>
       </w:tr>
       <w:tr>
         <w:tc>
           <w:tcPr>
-            <w:tcW w:w="1400" w:type="dxa"/>
+            <w:tcW w:w="1348" w:type="dxa"/>
             <w:tcMar>
               <w:top w:w="80" w:type="dxa"/>
               <w:left w:w="100" w:type="dxa"/>
@@ -4344,7 +5375,7 @@
         </w:tc>
         <w:tc>
           <w:tcPr>
-            <w:tcW w:w="1800" w:type="dxa"/>
+            <w:tcW w:w="1822" w:type="dxa"/>
             <w:tcMar>
               <w:top w:w="80" w:type="dxa"/>
               <w:left w:w="100" w:type="dxa"/>
@@ -4360,7 +5391,7 @@
         </w:tc>
         <w:tc>
           <w:tcPr>
-            <w:tcW w:w="2465" w:type="dxa"/>
+            <w:tcW w:w="2472" w:type="dxa"/>
             <w:tcMar>
               <w:top w:w="80" w:type="dxa"/>
               <w:left w:w="100" w:type="dxa"/>
@@ -4381,7 +5412,7 @@
         </w:tc>
         <w:tc>
           <w:tcPr>
-            <w:tcW w:w="1134" w:type="dxa"/>
+            <w:tcW w:w="921" w:type="dxa"/>
             <w:tcMar>
               <w:top w:w="80" w:type="dxa"/>
               <w:left w:w="100" w:type="dxa"/>
@@ -4397,7 +5428,7 @@
         </w:tc>
         <w:tc>
           <w:tcPr>
-            <w:tcW w:w="1276" w:type="dxa"/>
+            <w:tcW w:w="921" w:type="dxa"/>
             <w:tcMar>
               <w:top w:w="80" w:type="dxa"/>
               <w:left w:w="100" w:type="dxa"/>
@@ -4413,13 +5444,7 @@
         </w:tc>
         <w:tc>
           <w:tcPr>
-            <w:tcW w:w="2325" w:type="dxa"/>
-            <w:tcMar>
-              <w:top w:w="80" w:type="dxa"/>
-              <w:left w:w="100" w:type="dxa"/>
-              <w:bottom w:w="80" w:type="dxa"/>
-              <w:right w:w="100" w:type="dxa"/>
-            </w:tcMar>
+            <w:tcW w:w="2290" w:type="dxa"/>
           </w:tcPr>
           <w:p>
             <w:r>
@@ -4436,12 +5461,24 @@
               <w:t>Could cause problems with requesters full visibility</w:t>
             </w:r>
           </w:p>
+        </w:tc>
+        <w:tc>
+          <w:tcPr>
+            <w:tcW w:w="1474" w:type="dxa"/>
+            <w:tcMar>
+              <w:top w:w="80" w:type="dxa"/>
+              <w:left w:w="100" w:type="dxa"/>
+              <w:bottom w:w="80" w:type="dxa"/>
+              <w:right w:w="100" w:type="dxa"/>
+            </w:tcMar>
+          </w:tcPr>
+          <w:p/>
         </w:tc>
       </w:tr>
       <w:tr>
         <w:tc>
           <w:tcPr>
-            <w:tcW w:w="1400" w:type="dxa"/>
+            <w:tcW w:w="1348" w:type="dxa"/>
             <w:tcMar>
               <w:top w:w="80" w:type="dxa"/>
               <w:left w:w="100" w:type="dxa"/>
@@ -4457,7 +5494,7 @@
         </w:tc>
         <w:tc>
           <w:tcPr>
-            <w:tcW w:w="1800" w:type="dxa"/>
+            <w:tcW w:w="1822" w:type="dxa"/>
             <w:tcMar>
               <w:top w:w="80" w:type="dxa"/>
               <w:left w:w="100" w:type="dxa"/>
@@ -4473,7 +5510,7 @@
         </w:tc>
         <w:tc>
           <w:tcPr>
-            <w:tcW w:w="2465" w:type="dxa"/>
+            <w:tcW w:w="2472" w:type="dxa"/>
             <w:tcMar>
               <w:top w:w="80" w:type="dxa"/>
               <w:left w:w="100" w:type="dxa"/>
@@ -4499,7 +5536,7 @@
         </w:tc>
         <w:tc>
           <w:tcPr>
-            <w:tcW w:w="1134" w:type="dxa"/>
+            <w:tcW w:w="921" w:type="dxa"/>
             <w:tcMar>
               <w:top w:w="80" w:type="dxa"/>
               <w:left w:w="100" w:type="dxa"/>
@@ -4515,7 +5552,7 @@
         </w:tc>
         <w:tc>
           <w:tcPr>
-            <w:tcW w:w="1276" w:type="dxa"/>
+            <w:tcW w:w="921" w:type="dxa"/>
             <w:tcMar>
               <w:top w:w="80" w:type="dxa"/>
               <w:left w:w="100" w:type="dxa"/>
@@ -4531,13 +5568,7 @@
         </w:tc>
         <w:tc>
           <w:tcPr>
-            <w:tcW w:w="2325" w:type="dxa"/>
-            <w:tcMar>
-              <w:top w:w="80" w:type="dxa"/>
-              <w:left w:w="100" w:type="dxa"/>
-              <w:bottom w:w="80" w:type="dxa"/>
-              <w:right w:w="100" w:type="dxa"/>
-            </w:tcMar>
+            <w:tcW w:w="2290" w:type="dxa"/>
           </w:tcPr>
           <w:p>
             <w:r>
@@ -4550,12 +5581,24 @@
               <w:t>conflict with staff's "less admin" preference</w:t>
             </w:r>
           </w:p>
+        </w:tc>
+        <w:tc>
+          <w:tcPr>
+            <w:tcW w:w="1474" w:type="dxa"/>
+            <w:tcMar>
+              <w:top w:w="80" w:type="dxa"/>
+              <w:left w:w="100" w:type="dxa"/>
+              <w:bottom w:w="80" w:type="dxa"/>
+              <w:right w:w="100" w:type="dxa"/>
+            </w:tcMar>
+          </w:tcPr>
+          <w:p/>
         </w:tc>
       </w:tr>
       <w:tr>
         <w:tc>
           <w:tcPr>
-            <w:tcW w:w="1400" w:type="dxa"/>
+            <w:tcW w:w="1348" w:type="dxa"/>
             <w:tcMar>
               <w:top w:w="80" w:type="dxa"/>
               <w:left w:w="100" w:type="dxa"/>
@@ -4571,7 +5614,7 @@
         </w:tc>
         <w:tc>
           <w:tcPr>
-            <w:tcW w:w="1800" w:type="dxa"/>
+            <w:tcW w:w="1822" w:type="dxa"/>
             <w:tcMar>
               <w:top w:w="80" w:type="dxa"/>
               <w:left w:w="100" w:type="dxa"/>
@@ -4587,7 +5630,7 @@
         </w:tc>
         <w:tc>
           <w:tcPr>
-            <w:tcW w:w="2465" w:type="dxa"/>
+            <w:tcW w:w="2472" w:type="dxa"/>
             <w:tcMar>
               <w:top w:w="80" w:type="dxa"/>
               <w:left w:w="100" w:type="dxa"/>
@@ -4608,7 +5651,7 @@
         </w:tc>
         <w:tc>
           <w:tcPr>
-            <w:tcW w:w="1134" w:type="dxa"/>
+            <w:tcW w:w="921" w:type="dxa"/>
             <w:tcMar>
               <w:top w:w="80" w:type="dxa"/>
               <w:left w:w="100" w:type="dxa"/>
@@ -4624,7 +5667,7 @@
         </w:tc>
         <w:tc>
           <w:tcPr>
-            <w:tcW w:w="1276" w:type="dxa"/>
+            <w:tcW w:w="921" w:type="dxa"/>
             <w:tcMar>
               <w:top w:w="80" w:type="dxa"/>
               <w:left w:w="100" w:type="dxa"/>
@@ -4640,13 +5683,7 @@
         </w:tc>
         <w:tc>
           <w:tcPr>
-            <w:tcW w:w="2325" w:type="dxa"/>
-            <w:tcMar>
-              <w:top w:w="80" w:type="dxa"/>
-              <w:left w:w="100" w:type="dxa"/>
-              <w:bottom w:w="80" w:type="dxa"/>
-              <w:right w:w="100" w:type="dxa"/>
-            </w:tcMar>
+            <w:tcW w:w="2290" w:type="dxa"/>
           </w:tcPr>
           <w:p>
             <w:r>
@@ -4674,12 +5711,24 @@
               <w:t>constraints</w:t>
             </w:r>
           </w:p>
+        </w:tc>
+        <w:tc>
+          <w:tcPr>
+            <w:tcW w:w="1474" w:type="dxa"/>
+            <w:tcMar>
+              <w:top w:w="80" w:type="dxa"/>
+              <w:left w:w="100" w:type="dxa"/>
+              <w:bottom w:w="80" w:type="dxa"/>
+              <w:right w:w="100" w:type="dxa"/>
+            </w:tcMar>
+          </w:tcPr>
+          <w:p/>
         </w:tc>
       </w:tr>
       <w:tr>
         <w:tc>
           <w:tcPr>
-            <w:tcW w:w="1400" w:type="dxa"/>
+            <w:tcW w:w="1348" w:type="dxa"/>
             <w:tcMar>
               <w:top w:w="80" w:type="dxa"/>
               <w:left w:w="100" w:type="dxa"/>
@@ -4695,7 +5744,7 @@
         </w:tc>
         <w:tc>
           <w:tcPr>
-            <w:tcW w:w="1800" w:type="dxa"/>
+            <w:tcW w:w="1822" w:type="dxa"/>
             <w:tcMar>
               <w:top w:w="80" w:type="dxa"/>
               <w:left w:w="100" w:type="dxa"/>
@@ -4711,7 +5760,7 @@
         </w:tc>
         <w:tc>
           <w:tcPr>
-            <w:tcW w:w="2465" w:type="dxa"/>
+            <w:tcW w:w="2472" w:type="dxa"/>
             <w:tcMar>
               <w:top w:w="80" w:type="dxa"/>
               <w:left w:w="100" w:type="dxa"/>
@@ -4737,7 +5786,7 @@
         </w:tc>
         <w:tc>
           <w:tcPr>
-            <w:tcW w:w="1134" w:type="dxa"/>
+            <w:tcW w:w="921" w:type="dxa"/>
             <w:tcMar>
               <w:top w:w="80" w:type="dxa"/>
               <w:left w:w="100" w:type="dxa"/>
@@ -4753,7 +5802,7 @@
         </w:tc>
         <w:tc>
           <w:tcPr>
-            <w:tcW w:w="1276" w:type="dxa"/>
+            <w:tcW w:w="921" w:type="dxa"/>
             <w:tcMar>
               <w:top w:w="80" w:type="dxa"/>
               <w:left w:w="100" w:type="dxa"/>
@@ -4769,25 +5818,31 @@
         </w:tc>
         <w:tc>
           <w:tcPr>
-            <w:tcW w:w="2325" w:type="dxa"/>
-            <w:tcMar>
-              <w:top w:w="80" w:type="dxa"/>
-              <w:left w:w="100" w:type="dxa"/>
-              <w:bottom w:w="80" w:type="dxa"/>
-              <w:right w:w="100" w:type="dxa"/>
-            </w:tcMar>
+            <w:tcW w:w="2290" w:type="dxa"/>
           </w:tcPr>
           <w:p>
             <w:r>
               <w:t>May impact speed to make sure data is completely secured</w:t>
             </w:r>
           </w:p>
+        </w:tc>
+        <w:tc>
+          <w:tcPr>
+            <w:tcW w:w="1474" w:type="dxa"/>
+            <w:tcMar>
+              <w:top w:w="80" w:type="dxa"/>
+              <w:left w:w="100" w:type="dxa"/>
+              <w:bottom w:w="80" w:type="dxa"/>
+              <w:right w:w="100" w:type="dxa"/>
+            </w:tcMar>
+          </w:tcPr>
+          <w:p/>
         </w:tc>
       </w:tr>
       <w:tr>
         <w:tc>
           <w:tcPr>
-            <w:tcW w:w="1400" w:type="dxa"/>
+            <w:tcW w:w="1348" w:type="dxa"/>
             <w:tcMar>
               <w:top w:w="80" w:type="dxa"/>
               <w:left w:w="100" w:type="dxa"/>
@@ -4803,7 +5858,7 @@
         </w:tc>
         <w:tc>
           <w:tcPr>
-            <w:tcW w:w="1800" w:type="dxa"/>
+            <w:tcW w:w="1822" w:type="dxa"/>
             <w:tcMar>
               <w:top w:w="80" w:type="dxa"/>
               <w:left w:w="100" w:type="dxa"/>
@@ -4819,7 +5874,7 @@
         </w:tc>
         <w:tc>
           <w:tcPr>
-            <w:tcW w:w="2465" w:type="dxa"/>
+            <w:tcW w:w="2472" w:type="dxa"/>
             <w:tcMar>
               <w:top w:w="80" w:type="dxa"/>
               <w:left w:w="100" w:type="dxa"/>
@@ -4840,7 +5895,7 @@
         </w:tc>
         <w:tc>
           <w:tcPr>
-            <w:tcW w:w="1134" w:type="dxa"/>
+            <w:tcW w:w="921" w:type="dxa"/>
             <w:tcMar>
               <w:top w:w="80" w:type="dxa"/>
               <w:left w:w="100" w:type="dxa"/>
@@ -4856,7 +5911,7 @@
         </w:tc>
         <w:tc>
           <w:tcPr>
-            <w:tcW w:w="1276" w:type="dxa"/>
+            <w:tcW w:w="921" w:type="dxa"/>
             <w:tcMar>
               <w:top w:w="80" w:type="dxa"/>
               <w:left w:w="100" w:type="dxa"/>
@@ -4872,68 +5927,82 @@
         </w:tc>
         <w:tc>
           <w:tcPr>
-            <w:tcW w:w="2325" w:type="dxa"/>
-            <w:tcMar>
-              <w:top w:w="80" w:type="dxa"/>
-              <w:left w:w="100" w:type="dxa"/>
-              <w:bottom w:w="80" w:type="dxa"/>
-              <w:right w:w="100" w:type="dxa"/>
-            </w:tcMar>
+            <w:tcW w:w="2290" w:type="dxa"/>
           </w:tcPr>
           <w:p>
             <w:r>
               <w:t>Wants to be thorough with the request and requester wants to have it handled fast</w:t>
             </w:r>
           </w:p>
+        </w:tc>
+        <w:tc>
+          <w:tcPr>
+            <w:tcW w:w="1474" w:type="dxa"/>
+            <w:tcMar>
+              <w:top w:w="80" w:type="dxa"/>
+              <w:left w:w="100" w:type="dxa"/>
+              <w:bottom w:w="80" w:type="dxa"/>
+              <w:right w:w="100" w:type="dxa"/>
+            </w:tcMar>
+          </w:tcPr>
+          <w:p/>
         </w:tc>
       </w:tr>
       <w:tr>
         <w:tc>
           <w:tcPr>
-            <w:tcW w:w="1400" w:type="dxa"/>
-            <w:tcMar>
-              <w:top w:w="80" w:type="dxa"/>
-              <w:left w:w="100" w:type="dxa"/>
-              <w:bottom w:w="80" w:type="dxa"/>
-              <w:right w:w="100" w:type="dxa"/>
-            </w:tcMar>
-          </w:tcPr>
-          <w:p>
+            <w:tcW w:w="1348" w:type="dxa"/>
+            <w:tcMar>
+              <w:top w:w="80" w:type="dxa"/>
+              <w:left w:w="100" w:type="dxa"/>
+              <w:bottom w:w="80" w:type="dxa"/>
+              <w:right w:w="100" w:type="dxa"/>
+            </w:tcMar>
+          </w:tcPr>
+          <w:p>
+            <w:r>
+              <w:t>Lecturer</w:t>
+            </w:r>
+          </w:p>
+        </w:tc>
+        <w:tc>
+          <w:tcPr>
+            <w:tcW w:w="1822" w:type="dxa"/>
+            <w:tcMar>
+              <w:top w:w="80" w:type="dxa"/>
+              <w:left w:w="100" w:type="dxa"/>
+              <w:bottom w:w="80" w:type="dxa"/>
+              <w:right w:w="100" w:type="dxa"/>
+            </w:tcMar>
+          </w:tcPr>
+          <w:p>
+            <w:r>
+              <w:t xml:space="preserve">Oversees the life cycle of the </w:t>
+            </w:r>
             <w:r>
               <w:lastRenderedPageBreak/>
-              <w:t>Lecturer</w:t>
-            </w:r>
-          </w:p>
-        </w:tc>
-        <w:tc>
-          <w:tcPr>
-            <w:tcW w:w="1800" w:type="dxa"/>
-            <w:tcMar>
-              <w:top w:w="80" w:type="dxa"/>
-              <w:left w:w="100" w:type="dxa"/>
-              <w:bottom w:w="80" w:type="dxa"/>
-              <w:right w:w="100" w:type="dxa"/>
-            </w:tcMar>
-          </w:tcPr>
-          <w:p>
-            <w:r>
-              <w:t>Oversees the life cycle of the application’s creation</w:t>
-            </w:r>
-          </w:p>
-        </w:tc>
-        <w:tc>
-          <w:tcPr>
-            <w:tcW w:w="2465" w:type="dxa"/>
-            <w:tcMar>
-              <w:top w:w="80" w:type="dxa"/>
-              <w:left w:w="100" w:type="dxa"/>
-              <w:bottom w:w="80" w:type="dxa"/>
-              <w:right w:w="100" w:type="dxa"/>
-            </w:tcMar>
-          </w:tcPr>
-          <w:p>
-            <w:r>
-              <w:t>As the client substitute, expects a working solution that satisfies the business need.</w:t>
+              <w:t>application’s creation</w:t>
+            </w:r>
+          </w:p>
+        </w:tc>
+        <w:tc>
+          <w:tcPr>
+            <w:tcW w:w="2472" w:type="dxa"/>
+            <w:tcMar>
+              <w:top w:w="80" w:type="dxa"/>
+              <w:left w:w="100" w:type="dxa"/>
+              <w:bottom w:w="80" w:type="dxa"/>
+              <w:right w:w="100" w:type="dxa"/>
+            </w:tcMar>
+          </w:tcPr>
+          <w:p>
+            <w:r>
+              <w:lastRenderedPageBreak/>
+              <w:t xml:space="preserve">As the client substitute, expects a working </w:t>
+            </w:r>
+            <w:r>
+              <w:lastRenderedPageBreak/>
+              <w:t>solution that satisfies the business need.</w:t>
             </w:r>
           </w:p>
           <w:p>
@@ -4944,23 +6013,24 @@
         </w:tc>
         <w:tc>
           <w:tcPr>
-            <w:tcW w:w="1134" w:type="dxa"/>
-            <w:tcMar>
-              <w:top w:w="80" w:type="dxa"/>
-              <w:left w:w="100" w:type="dxa"/>
-              <w:bottom w:w="80" w:type="dxa"/>
-              <w:right w:w="100" w:type="dxa"/>
-            </w:tcMar>
-          </w:tcPr>
-          <w:p>
-            <w:r>
+            <w:tcW w:w="921" w:type="dxa"/>
+            <w:tcMar>
+              <w:top w:w="80" w:type="dxa"/>
+              <w:left w:w="100" w:type="dxa"/>
+              <w:bottom w:w="80" w:type="dxa"/>
+              <w:right w:w="100" w:type="dxa"/>
+            </w:tcMar>
+          </w:tcPr>
+          <w:p>
+            <w:r>
+              <w:lastRenderedPageBreak/>
               <w:t>High</w:t>
             </w:r>
           </w:p>
         </w:tc>
         <w:tc>
           <w:tcPr>
-            <w:tcW w:w="1276" w:type="dxa"/>
+            <w:tcW w:w="921" w:type="dxa"/>
             <w:tcMar>
               <w:top w:w="80" w:type="dxa"/>
               <w:left w:w="100" w:type="dxa"/>
@@ -4976,23 +6046,33 @@
         </w:tc>
         <w:tc>
           <w:tcPr>
-            <w:tcW w:w="2325" w:type="dxa"/>
-            <w:tcMar>
-              <w:top w:w="80" w:type="dxa"/>
-              <w:left w:w="100" w:type="dxa"/>
-              <w:bottom w:w="80" w:type="dxa"/>
-              <w:right w:w="100" w:type="dxa"/>
-            </w:tcMar>
-          </w:tcPr>
-          <w:p>
-            <w:r>
-              <w:t>As the substitute for the client, they are the only source of clarification. However, information can be withheld to test the skills, understanding and judgement of the developers.</w:t>
+            <w:tcW w:w="2290" w:type="dxa"/>
+          </w:tcPr>
+          <w:p>
+            <w:r>
+              <w:t xml:space="preserve">As the substitute for the client, they are the only </w:t>
+            </w:r>
+            <w:r>
+              <w:lastRenderedPageBreak/>
+              <w:t>source of clarification. However, information can be withheld to test the skills, understanding and judgement of the developers.</w:t>
             </w:r>
             <w:r>
               <w:br/>
               <w:t>Ass assessor they need access to the evidence. Time spent on evidence competes with time to create the application.</w:t>
             </w:r>
           </w:p>
+        </w:tc>
+        <w:tc>
+          <w:tcPr>
+            <w:tcW w:w="1474" w:type="dxa"/>
+            <w:tcMar>
+              <w:top w:w="80" w:type="dxa"/>
+              <w:left w:w="100" w:type="dxa"/>
+              <w:bottom w:w="80" w:type="dxa"/>
+              <w:right w:w="100" w:type="dxa"/>
+            </w:tcMar>
+          </w:tcPr>
+          <w:p/>
         </w:tc>
       </w:tr>
     </w:tbl>
@@ -5000,21 +6080,21 @@
       <w:pPr>
         <w:pStyle w:val="Heading1"/>
       </w:pPr>
-      <w:bookmarkStart w:id="7" w:name="_Toc239883345"/>
+      <w:bookmarkStart w:id="9" w:name="_Toc241064274"/>
       <w:r>
         <w:t>3. Scope Baseline</w:t>
       </w:r>
-      <w:bookmarkEnd w:id="7"/>
+      <w:bookmarkEnd w:id="9"/>
     </w:p>
     <w:p>
       <w:pPr>
         <w:pStyle w:val="Heading2"/>
       </w:pPr>
-      <w:bookmarkStart w:id="8" w:name="_Toc239883346"/>
+      <w:bookmarkStart w:id="10" w:name="_Toc241064275"/>
       <w:r>
         <w:t>3.1 In Scope</w:t>
       </w:r>
-      <w:bookmarkEnd w:id="8"/>
+      <w:bookmarkEnd w:id="10"/>
     </w:p>
     <w:p>
       <w:pPr>
@@ -5085,11 +6165,11 @@
       <w:pPr>
         <w:pStyle w:val="Heading2"/>
       </w:pPr>
-      <w:bookmarkStart w:id="9" w:name="_Toc239883347"/>
+      <w:bookmarkStart w:id="11" w:name="_Toc241064276"/>
       <w:r>
         <w:t>3.2 Out of Scope</w:t>
       </w:r>
-      <w:bookmarkEnd w:id="9"/>
+      <w:bookmarkEnd w:id="11"/>
     </w:p>
     <w:p>
       <w:pPr>
@@ -5134,11 +6214,11 @@
       <w:pPr>
         <w:pStyle w:val="Heading2"/>
       </w:pPr>
-      <w:bookmarkStart w:id="10" w:name="_Toc239883348"/>
+      <w:bookmarkStart w:id="12" w:name="_Toc241064277"/>
       <w:r>
         <w:t>3.3 Deferred / Future Scope</w:t>
       </w:r>
-      <w:bookmarkEnd w:id="10"/>
+      <w:bookmarkEnd w:id="12"/>
     </w:p>
     <w:p>
       <w:pPr>
@@ -5170,11 +6250,11 @@
       <w:pPr>
         <w:pStyle w:val="Heading2"/>
       </w:pPr>
-      <w:bookmarkStart w:id="11" w:name="_Toc239883349"/>
+      <w:bookmarkStart w:id="13" w:name="_Toc241064278"/>
       <w:r>
         <w:t>3.4 Defended Exclusion / Deferment</w:t>
       </w:r>
-      <w:bookmarkEnd w:id="11"/>
+      <w:bookmarkEnd w:id="13"/>
     </w:p>
     <w:p>
       <w:r>
@@ -5263,284 +6343,6 @@
         <w:t>.</w:t>
       </w:r>
     </w:p>
-    <w:p>
-      <w:pPr>
-        <w:pStyle w:val="Heading1"/>
-      </w:pPr>
-      <w:r>
-        <w:t>4. Constraints</w:t>
-      </w:r>
-    </w:p>
-    <w:p/>
-    <w:tbl>
-      <w:tblPr>
-        <w:tblW w:w="7658" w:type="dxa"/>
-        <w:tblBorders>
-          <w:top w:val="single" w:sz="4" w:space="0" w:color="auto"/>
-          <w:left w:val="single" w:sz="4" w:space="0" w:color="auto"/>
-          <w:bottom w:val="single" w:sz="4" w:space="0" w:color="auto"/>
-          <w:right w:val="single" w:sz="4" w:space="0" w:color="auto"/>
-          <w:insideH w:val="single" w:sz="4" w:space="0" w:color="auto"/>
-          <w:insideV w:val="single" w:sz="4" w:space="0" w:color="auto"/>
-        </w:tblBorders>
-        <w:tblCellMar>
-          <w:left w:w="10" w:type="dxa"/>
-          <w:right w:w="10" w:type="dxa"/>
-        </w:tblCellMar>
-        <w:tblLook w:val="04A0" w:firstRow="1" w:lastRow="0" w:firstColumn="1" w:lastColumn="0" w:noHBand="0" w:noVBand="1"/>
-      </w:tblPr>
-      <w:tblGrid>
-        <w:gridCol w:w="889"/>
-        <w:gridCol w:w="2051"/>
-        <w:gridCol w:w="4718"/>
-      </w:tblGrid>
-      <w:tr>
-        <w:trPr>
-          <w:tblHeader/>
-        </w:trPr>
-        <w:tc>
-          <w:tcPr>
-            <w:tcW w:w="889" w:type="dxa"/>
-            <w:shd w:val="clear" w:color="auto" w:fill="1F3864"/>
-            <w:tcMar>
-              <w:top w:w="80" w:type="dxa"/>
-              <w:left w:w="100" w:type="dxa"/>
-              <w:bottom w:w="80" w:type="dxa"/>
-              <w:right w:w="100" w:type="dxa"/>
-            </w:tcMar>
-          </w:tcPr>
-          <w:p>
-            <w:pPr>
-              <w:rPr>
-                <w:sz w:val="20"/>
-                <w:szCs w:val="20"/>
-              </w:rPr>
-            </w:pPr>
-            <w:r>
-              <w:rPr>
-                <w:b/>
-                <w:bCs/>
-                <w:color w:val="FFFFFF"/>
-                <w:sz w:val="18"/>
-                <w:szCs w:val="18"/>
-              </w:rPr>
-              <w:lastRenderedPageBreak/>
-              <w:t>ID</w:t>
-            </w:r>
-          </w:p>
-        </w:tc>
-        <w:tc>
-          <w:tcPr>
-            <w:tcW w:w="2051" w:type="dxa"/>
-            <w:shd w:val="clear" w:color="auto" w:fill="1F3864"/>
-            <w:tcMar>
-              <w:top w:w="80" w:type="dxa"/>
-              <w:left w:w="100" w:type="dxa"/>
-              <w:bottom w:w="80" w:type="dxa"/>
-              <w:right w:w="100" w:type="dxa"/>
-            </w:tcMar>
-          </w:tcPr>
-          <w:p>
-            <w:r>
-              <w:rPr>
-                <w:b/>
-                <w:bCs/>
-                <w:color w:val="FFFFFF"/>
-                <w:sz w:val="20"/>
-                <w:szCs w:val="20"/>
-              </w:rPr>
-              <w:t>Constraint</w:t>
-            </w:r>
-          </w:p>
-        </w:tc>
-        <w:tc>
-          <w:tcPr>
-            <w:tcW w:w="4718" w:type="dxa"/>
-            <w:shd w:val="clear" w:color="auto" w:fill="1F3864"/>
-            <w:tcMar>
-              <w:top w:w="80" w:type="dxa"/>
-              <w:left w:w="100" w:type="dxa"/>
-              <w:bottom w:w="80" w:type="dxa"/>
-              <w:right w:w="100" w:type="dxa"/>
-            </w:tcMar>
-          </w:tcPr>
-          <w:p>
-            <w:r>
-              <w:rPr>
-                <w:b/>
-                <w:bCs/>
-                <w:sz w:val="20"/>
-                <w:szCs w:val="20"/>
-              </w:rPr>
-              <w:t>Rationale/Source</w:t>
-            </w:r>
-          </w:p>
-        </w:tc>
-      </w:tr>
-      <w:tr>
-        <w:tc>
-          <w:tcPr>
-            <w:tcW w:w="889" w:type="dxa"/>
-            <w:tcMar>
-              <w:top w:w="80" w:type="dxa"/>
-              <w:left w:w="100" w:type="dxa"/>
-              <w:bottom w:w="80" w:type="dxa"/>
-              <w:right w:w="100" w:type="dxa"/>
-            </w:tcMar>
-          </w:tcPr>
-          <w:p>
-            <w:r>
-              <w:t>CON-001</w:t>
-            </w:r>
-          </w:p>
-        </w:tc>
-        <w:tc>
-          <w:tcPr>
-            <w:tcW w:w="2051" w:type="dxa"/>
-            <w:tcMar>
-              <w:top w:w="80" w:type="dxa"/>
-              <w:left w:w="100" w:type="dxa"/>
-              <w:bottom w:w="80" w:type="dxa"/>
-              <w:right w:w="100" w:type="dxa"/>
-            </w:tcMar>
-          </w:tcPr>
-          <w:p>
-            <w:r>
-              <w:t>Must run on most devices that support web browsers</w:t>
-            </w:r>
-          </w:p>
-        </w:tc>
-        <w:tc>
-          <w:tcPr>
-            <w:tcW w:w="4718" w:type="dxa"/>
-            <w:tcMar>
-              <w:top w:w="80" w:type="dxa"/>
-              <w:left w:w="100" w:type="dxa"/>
-              <w:bottom w:w="80" w:type="dxa"/>
-              <w:right w:w="100" w:type="dxa"/>
-            </w:tcMar>
-          </w:tcPr>
-          <w:p/>
-        </w:tc>
-      </w:tr>
-      <w:tr>
-        <w:tc>
-          <w:tcPr>
-            <w:tcW w:w="889" w:type="dxa"/>
-            <w:tcMar>
-              <w:top w:w="80" w:type="dxa"/>
-              <w:left w:w="100" w:type="dxa"/>
-              <w:bottom w:w="80" w:type="dxa"/>
-              <w:right w:w="100" w:type="dxa"/>
-            </w:tcMar>
-          </w:tcPr>
-          <w:p>
-            <w:r>
-              <w:t>CON-002</w:t>
-            </w:r>
-          </w:p>
-        </w:tc>
-        <w:tc>
-          <w:tcPr>
-            <w:tcW w:w="2051" w:type="dxa"/>
-            <w:tcMar>
-              <w:top w:w="80" w:type="dxa"/>
-              <w:left w:w="100" w:type="dxa"/>
-              <w:bottom w:w="80" w:type="dxa"/>
-              <w:right w:w="100" w:type="dxa"/>
-            </w:tcMar>
-          </w:tcPr>
-          <w:p>
-            <w:r>
-              <w:rPr>
-                <w:sz w:val="20"/>
-                <w:szCs w:val="20"/>
-              </w:rPr>
-              <w:t>Must use a relational database (SQL)</w:t>
-            </w:r>
-          </w:p>
-        </w:tc>
-        <w:tc>
-          <w:tcPr>
-            <w:tcW w:w="4718" w:type="dxa"/>
-            <w:tcMar>
-              <w:top w:w="80" w:type="dxa"/>
-              <w:left w:w="100" w:type="dxa"/>
-              <w:bottom w:w="80" w:type="dxa"/>
-              <w:right w:w="100" w:type="dxa"/>
-            </w:tcMar>
-          </w:tcPr>
-          <w:p/>
-        </w:tc>
-      </w:tr>
-      <w:tr>
-        <w:tc>
-          <w:tcPr>
-            <w:tcW w:w="889" w:type="dxa"/>
-            <w:tcMar>
-              <w:top w:w="80" w:type="dxa"/>
-              <w:left w:w="100" w:type="dxa"/>
-              <w:bottom w:w="80" w:type="dxa"/>
-              <w:right w:w="100" w:type="dxa"/>
-            </w:tcMar>
-          </w:tcPr>
-          <w:p>
-            <w:r>
-              <w:t>CON-003</w:t>
-            </w:r>
-          </w:p>
-        </w:tc>
-        <w:tc>
-          <w:tcPr>
-            <w:tcW w:w="2051" w:type="dxa"/>
-            <w:tcMar>
-              <w:top w:w="80" w:type="dxa"/>
-              <w:left w:w="100" w:type="dxa"/>
-              <w:bottom w:w="80" w:type="dxa"/>
-              <w:right w:w="100" w:type="dxa"/>
-            </w:tcMar>
-          </w:tcPr>
-          <w:p>
-            <w:pPr>
-              <w:rPr>
-                <w:sz w:val="20"/>
-                <w:szCs w:val="20"/>
-              </w:rPr>
-            </w:pPr>
-            <w:r>
-              <w:rPr>
-                <w:sz w:val="20"/>
-                <w:szCs w:val="20"/>
-              </w:rPr>
-              <w:t>Source code managed in GitHub under protected-main branching strategy</w:t>
-            </w:r>
-          </w:p>
-        </w:tc>
-        <w:tc>
-          <w:tcPr>
-            <w:tcW w:w="4718" w:type="dxa"/>
-            <w:tcMar>
-              <w:top w:w="80" w:type="dxa"/>
-              <w:left w:w="100" w:type="dxa"/>
-              <w:bottom w:w="80" w:type="dxa"/>
-              <w:right w:w="100" w:type="dxa"/>
-            </w:tcMar>
-          </w:tcPr>
-          <w:p>
-            <w:r>
-              <w:t xml:space="preserve">Assignment 2 showed the benefit of using CI software and we will be using </w:t>
-            </w:r>
-            <w:r>
-              <w:rPr>
-                <w:sz w:val="20"/>
-                <w:szCs w:val="20"/>
-              </w:rPr>
-              <w:t>2-reviewer policy</w:t>
-            </w:r>
-          </w:p>
-        </w:tc>
-      </w:tr>
-    </w:tbl>
     <w:p/>
     <w:p/>
     <w:p>
@@ -5552,22 +6354,22 @@
       <w:pPr>
         <w:pStyle w:val="Heading1"/>
       </w:pPr>
-      <w:bookmarkStart w:id="12" w:name="_Toc239883350"/>
+      <w:bookmarkStart w:id="14" w:name="_Toc241064279"/>
       <w:r>
         <w:lastRenderedPageBreak/>
         <w:t>4. Requirements &amp; Acceptance Criteria</w:t>
       </w:r>
-      <w:bookmarkEnd w:id="12"/>
+      <w:bookmarkEnd w:id="14"/>
     </w:p>
     <w:p>
       <w:pPr>
         <w:pStyle w:val="Heading2"/>
       </w:pPr>
-      <w:bookmarkStart w:id="13" w:name="_Toc239883351"/>
+      <w:bookmarkStart w:id="15" w:name="_Toc241064280"/>
       <w:r>
         <w:t>4.1 Functional Requirements</w:t>
       </w:r>
-      <w:bookmarkEnd w:id="13"/>
+      <w:bookmarkEnd w:id="15"/>
     </w:p>
     <w:p>
       <w:r>
@@ -7280,7 +8082,6 @@
           </w:tcPr>
           <w:p>
             <w:r>
-              <w:lastRenderedPageBreak/>
               <w:t>FR-0</w:t>
             </w:r>
             <w:r>
@@ -8064,17 +8865,9 @@
             <w:r>
               <w:t xml:space="preserve">If updates are made, the staff member and timestamp must be recorded, and stored for 5 </w:t>
             </w:r>
-            <w:proofErr w:type="gramStart"/>
-            <w:r>
-              <w:t>years</w:t>
-            </w:r>
-            <w:r>
-              <w:t xml:space="preserve"> </w:t>
-            </w:r>
-            <w:r>
-              <w:t>.</w:t>
-            </w:r>
-            <w:proofErr w:type="gramEnd"/>
+            <w:r>
+              <w:t>years.</w:t>
+            </w:r>
           </w:p>
         </w:tc>
       </w:tr>
@@ -8689,11 +9482,11 @@
       <w:pPr>
         <w:pStyle w:val="Heading2"/>
       </w:pPr>
-      <w:bookmarkStart w:id="14" w:name="_Toc239883352"/>
+      <w:bookmarkStart w:id="16" w:name="_Toc241064281"/>
       <w:r>
         <w:t>4.2 Non-Functional Requirements</w:t>
       </w:r>
-      <w:bookmarkEnd w:id="14"/>
+      <w:bookmarkEnd w:id="16"/>
     </w:p>
     <w:p>
       <w:r>
@@ -10346,17 +11139,17 @@
         </w:tc>
       </w:tr>
     </w:tbl>
-    <w:p>
-      <w:bookmarkStart w:id="15" w:name="_Toc239883353"/>
-    </w:p>
+    <w:p/>
     <w:p>
       <w:pPr>
         <w:pStyle w:val="Heading2"/>
       </w:pPr>
+      <w:bookmarkStart w:id="17" w:name="_Toc241064282"/>
       <w:r>
         <w:lastRenderedPageBreak/>
         <w:t>4.3 Architecturally Significant Requirements and Quality Drivers</w:t>
       </w:r>
+      <w:bookmarkEnd w:id="17"/>
     </w:p>
     <w:p/>
     <w:tbl>
@@ -11394,10 +12187,11 @@
       <w:pPr>
         <w:pStyle w:val="Heading1"/>
       </w:pPr>
+      <w:bookmarkStart w:id="18" w:name="_Toc241064283"/>
       <w:r>
         <w:t>5. Constraints</w:t>
       </w:r>
-      <w:bookmarkEnd w:id="15"/>
+      <w:bookmarkEnd w:id="18"/>
     </w:p>
     <w:p>
       <w:pPr>
@@ -11406,7 +12200,7 @@
     </w:p>
     <w:tbl>
       <w:tblPr>
-        <w:tblW w:w="10400" w:type="dxa"/>
+        <w:tblW w:w="11415" w:type="dxa"/>
         <w:tblBorders>
           <w:top w:val="single" w:sz="4" w:space="0" w:color="auto"/>
           <w:left w:val="single" w:sz="4" w:space="0" w:color="auto"/>
@@ -11423,9 +12217,10 @@
         <w:tblLook w:val="04A0" w:firstRow="1" w:lastRow="0" w:firstColumn="1" w:lastColumn="0" w:noHBand="0" w:noVBand="1"/>
       </w:tblPr>
       <w:tblGrid>
-        <w:gridCol w:w="1800"/>
-        <w:gridCol w:w="3800"/>
-        <w:gridCol w:w="4800"/>
+        <w:gridCol w:w="895"/>
+        <w:gridCol w:w="1840"/>
+        <w:gridCol w:w="3840"/>
+        <w:gridCol w:w="4840"/>
       </w:tblGrid>
       <w:tr>
         <w:trPr>
@@ -11433,17 +12228,11 @@
         </w:trPr>
         <w:tc>
           <w:tcPr>
-            <w:tcW w:w="1800" w:type="dxa"/>
+            <w:tcW w:w="895" w:type="dxa"/>
             <w:shd w:val="clear" w:color="auto" w:fill="1F3864"/>
-            <w:tcMar>
-              <w:top w:w="80" w:type="dxa"/>
-              <w:left w:w="100" w:type="dxa"/>
-              <w:bottom w:w="80" w:type="dxa"/>
-              <w:right w:w="100" w:type="dxa"/>
-            </w:tcMar>
-          </w:tcPr>
-          <w:p>
-            <w:r>
+          </w:tcPr>
+          <w:p>
+            <w:pPr>
               <w:rPr>
                 <w:b/>
                 <w:bCs/>
@@ -11451,22 +12240,7 @@
                 <w:sz w:val="18"/>
                 <w:szCs w:val="18"/>
               </w:rPr>
-              <w:t>Category</w:t>
-            </w:r>
-          </w:p>
-        </w:tc>
-        <w:tc>
-          <w:tcPr>
-            <w:tcW w:w="3800" w:type="dxa"/>
-            <w:shd w:val="clear" w:color="auto" w:fill="1F3864"/>
-            <w:tcMar>
-              <w:top w:w="80" w:type="dxa"/>
-              <w:left w:w="100" w:type="dxa"/>
-              <w:bottom w:w="80" w:type="dxa"/>
-              <w:right w:w="100" w:type="dxa"/>
-            </w:tcMar>
-          </w:tcPr>
-          <w:p>
+            </w:pPr>
             <w:r>
               <w:rPr>
                 <w:b/>
@@ -11475,13 +12249,13 @@
                 <w:sz w:val="18"/>
                 <w:szCs w:val="18"/>
               </w:rPr>
-              <w:t>Constraint</w:t>
-            </w:r>
-          </w:p>
-        </w:tc>
-        <w:tc>
-          <w:tcPr>
-            <w:tcW w:w="4800" w:type="dxa"/>
+              <w:t>ID</w:t>
+            </w:r>
+          </w:p>
+        </w:tc>
+        <w:tc>
+          <w:tcPr>
+            <w:tcW w:w="1840" w:type="dxa"/>
             <w:shd w:val="clear" w:color="auto" w:fill="1F3864"/>
             <w:tcMar>
               <w:top w:w="80" w:type="dxa"/>
@@ -11499,6 +12273,54 @@
                 <w:sz w:val="18"/>
                 <w:szCs w:val="18"/>
               </w:rPr>
+              <w:t>Category</w:t>
+            </w:r>
+          </w:p>
+        </w:tc>
+        <w:tc>
+          <w:tcPr>
+            <w:tcW w:w="3840" w:type="dxa"/>
+            <w:shd w:val="clear" w:color="auto" w:fill="1F3864"/>
+            <w:tcMar>
+              <w:top w:w="80" w:type="dxa"/>
+              <w:left w:w="100" w:type="dxa"/>
+              <w:bottom w:w="80" w:type="dxa"/>
+              <w:right w:w="100" w:type="dxa"/>
+            </w:tcMar>
+          </w:tcPr>
+          <w:p>
+            <w:r>
+              <w:rPr>
+                <w:b/>
+                <w:bCs/>
+                <w:color w:val="FFFFFF"/>
+                <w:sz w:val="18"/>
+                <w:szCs w:val="18"/>
+              </w:rPr>
+              <w:t>Constraint</w:t>
+            </w:r>
+          </w:p>
+        </w:tc>
+        <w:tc>
+          <w:tcPr>
+            <w:tcW w:w="4840" w:type="dxa"/>
+            <w:shd w:val="clear" w:color="auto" w:fill="1F3864"/>
+            <w:tcMar>
+              <w:top w:w="80" w:type="dxa"/>
+              <w:left w:w="100" w:type="dxa"/>
+              <w:bottom w:w="80" w:type="dxa"/>
+              <w:right w:w="100" w:type="dxa"/>
+            </w:tcMar>
+          </w:tcPr>
+          <w:p>
+            <w:r>
+              <w:rPr>
+                <w:b/>
+                <w:bCs/>
+                <w:color w:val="FFFFFF"/>
+                <w:sz w:val="18"/>
+                <w:szCs w:val="18"/>
+              </w:rPr>
               <w:t>Engineering Implication</w:t>
             </w:r>
           </w:p>
@@ -11507,7 +12329,22 @@
       <w:tr>
         <w:tc>
           <w:tcPr>
-            <w:tcW w:w="1800" w:type="dxa"/>
+            <w:tcW w:w="895" w:type="dxa"/>
+          </w:tcPr>
+          <w:p>
+            <w:pPr>
+              <w:tabs>
+                <w:tab w:val="right" w:pos="1780"/>
+              </w:tabs>
+            </w:pPr>
+            <w:r>
+              <w:t>CON-001</w:t>
+            </w:r>
+          </w:p>
+        </w:tc>
+        <w:tc>
+          <w:tcPr>
+            <w:tcW w:w="1840" w:type="dxa"/>
             <w:tcMar>
               <w:top w:w="80" w:type="dxa"/>
               <w:left w:w="100" w:type="dxa"/>
@@ -11523,7 +12360,7 @@
         </w:tc>
         <w:tc>
           <w:tcPr>
-            <w:tcW w:w="3800" w:type="dxa"/>
+            <w:tcW w:w="3840" w:type="dxa"/>
             <w:tcMar>
               <w:top w:w="80" w:type="dxa"/>
               <w:left w:w="100" w:type="dxa"/>
@@ -11539,7 +12376,7 @@
         </w:tc>
         <w:tc>
           <w:tcPr>
-            <w:tcW w:w="4800" w:type="dxa"/>
+            <w:tcW w:w="4840" w:type="dxa"/>
             <w:tcMar>
               <w:top w:w="80" w:type="dxa"/>
               <w:left w:w="100" w:type="dxa"/>
@@ -11557,7 +12394,20 @@
       <w:tr>
         <w:tc>
           <w:tcPr>
-            <w:tcW w:w="1800" w:type="dxa"/>
+            <w:tcW w:w="895" w:type="dxa"/>
+          </w:tcPr>
+          <w:p>
+            <w:r>
+              <w:t>CON-00</w:t>
+            </w:r>
+            <w:r>
+              <w:t>2</w:t>
+            </w:r>
+          </w:p>
+        </w:tc>
+        <w:tc>
+          <w:tcPr>
+            <w:tcW w:w="1840" w:type="dxa"/>
             <w:tcMar>
               <w:top w:w="80" w:type="dxa"/>
               <w:left w:w="100" w:type="dxa"/>
@@ -11573,7 +12423,7 @@
         </w:tc>
         <w:tc>
           <w:tcPr>
-            <w:tcW w:w="3800" w:type="dxa"/>
+            <w:tcW w:w="3840" w:type="dxa"/>
             <w:tcMar>
               <w:top w:w="80" w:type="dxa"/>
               <w:left w:w="100" w:type="dxa"/>
@@ -11595,7 +12445,7 @@
         </w:tc>
         <w:tc>
           <w:tcPr>
-            <w:tcW w:w="4800" w:type="dxa"/>
+            <w:tcW w:w="4840" w:type="dxa"/>
             <w:tcMar>
               <w:top w:w="80" w:type="dxa"/>
               <w:left w:w="100" w:type="dxa"/>
@@ -11613,7 +12463,20 @@
       <w:tr>
         <w:tc>
           <w:tcPr>
-            <w:tcW w:w="1800" w:type="dxa"/>
+            <w:tcW w:w="895" w:type="dxa"/>
+          </w:tcPr>
+          <w:p>
+            <w:r>
+              <w:t>CON-00</w:t>
+            </w:r>
+            <w:r>
+              <w:t>3</w:t>
+            </w:r>
+          </w:p>
+        </w:tc>
+        <w:tc>
+          <w:tcPr>
+            <w:tcW w:w="1840" w:type="dxa"/>
             <w:tcMar>
               <w:top w:w="80" w:type="dxa"/>
               <w:left w:w="100" w:type="dxa"/>
@@ -11629,7 +12492,7 @@
         </w:tc>
         <w:tc>
           <w:tcPr>
-            <w:tcW w:w="3800" w:type="dxa"/>
+            <w:tcW w:w="3840" w:type="dxa"/>
             <w:tcMar>
               <w:top w:w="80" w:type="dxa"/>
               <w:left w:w="100" w:type="dxa"/>
@@ -11641,11 +12504,9 @@
             <w:r>
               <w:t xml:space="preserve">The team should prefer free or low-cost services where </w:t>
             </w:r>
-            <w:proofErr w:type="gramStart"/>
-            <w:r>
-              <w:t>practical, but</w:t>
-            </w:r>
-            <w:proofErr w:type="gramEnd"/>
+            <w:r>
+              <w:t>practical but</w:t>
+            </w:r>
             <w:r>
               <w:t xml:space="preserve"> must identify their limitations and the likely operational cost beyond the educational context.</w:t>
             </w:r>
@@ -11653,7 +12514,7 @@
         </w:tc>
         <w:tc>
           <w:tcPr>
-            <w:tcW w:w="4800" w:type="dxa"/>
+            <w:tcW w:w="4840" w:type="dxa"/>
             <w:tcMar>
               <w:top w:w="80" w:type="dxa"/>
               <w:left w:w="100" w:type="dxa"/>
@@ -11715,7 +12576,20 @@
       <w:tr>
         <w:tc>
           <w:tcPr>
-            <w:tcW w:w="1800" w:type="dxa"/>
+            <w:tcW w:w="895" w:type="dxa"/>
+          </w:tcPr>
+          <w:p>
+            <w:r>
+              <w:t>CON-00</w:t>
+            </w:r>
+            <w:r>
+              <w:t>4</w:t>
+            </w:r>
+          </w:p>
+        </w:tc>
+        <w:tc>
+          <w:tcPr>
+            <w:tcW w:w="1840" w:type="dxa"/>
             <w:tcMar>
               <w:top w:w="80" w:type="dxa"/>
               <w:left w:w="100" w:type="dxa"/>
@@ -11731,7 +12605,7 @@
         </w:tc>
         <w:tc>
           <w:tcPr>
-            <w:tcW w:w="3800" w:type="dxa"/>
+            <w:tcW w:w="3840" w:type="dxa"/>
             <w:tcMar>
               <w:top w:w="80" w:type="dxa"/>
               <w:left w:w="100" w:type="dxa"/>
@@ -11747,7 +12621,7 @@
         </w:tc>
         <w:tc>
           <w:tcPr>
-            <w:tcW w:w="4800" w:type="dxa"/>
+            <w:tcW w:w="4840" w:type="dxa"/>
             <w:tcMar>
               <w:top w:w="80" w:type="dxa"/>
               <w:left w:w="100" w:type="dxa"/>
@@ -11777,7 +12651,20 @@
       <w:tr>
         <w:tc>
           <w:tcPr>
-            <w:tcW w:w="1800" w:type="dxa"/>
+            <w:tcW w:w="895" w:type="dxa"/>
+          </w:tcPr>
+          <w:p>
+            <w:r>
+              <w:t>CON-00</w:t>
+            </w:r>
+            <w:r>
+              <w:t>5</w:t>
+            </w:r>
+          </w:p>
+        </w:tc>
+        <w:tc>
+          <w:tcPr>
+            <w:tcW w:w="1840" w:type="dxa"/>
             <w:tcMar>
               <w:top w:w="80" w:type="dxa"/>
               <w:left w:w="100" w:type="dxa"/>
@@ -11793,7 +12680,7 @@
         </w:tc>
         <w:tc>
           <w:tcPr>
-            <w:tcW w:w="3800" w:type="dxa"/>
+            <w:tcW w:w="3840" w:type="dxa"/>
             <w:tcMar>
               <w:top w:w="80" w:type="dxa"/>
               <w:left w:w="100" w:type="dxa"/>
@@ -11817,7 +12704,7 @@
         </w:tc>
         <w:tc>
           <w:tcPr>
-            <w:tcW w:w="4800" w:type="dxa"/>
+            <w:tcW w:w="4840" w:type="dxa"/>
             <w:tcMar>
               <w:top w:w="80" w:type="dxa"/>
               <w:left w:w="100" w:type="dxa"/>
@@ -11849,7 +12736,20 @@
       <w:tr>
         <w:tc>
           <w:tcPr>
-            <w:tcW w:w="1800" w:type="dxa"/>
+            <w:tcW w:w="895" w:type="dxa"/>
+          </w:tcPr>
+          <w:p>
+            <w:r>
+              <w:t>CON-00</w:t>
+            </w:r>
+            <w:r>
+              <w:t>6</w:t>
+            </w:r>
+          </w:p>
+        </w:tc>
+        <w:tc>
+          <w:tcPr>
+            <w:tcW w:w="1840" w:type="dxa"/>
             <w:tcMar>
               <w:top w:w="80" w:type="dxa"/>
               <w:left w:w="100" w:type="dxa"/>
@@ -11865,7 +12765,7 @@
         </w:tc>
         <w:tc>
           <w:tcPr>
-            <w:tcW w:w="3800" w:type="dxa"/>
+            <w:tcW w:w="3840" w:type="dxa"/>
             <w:tcMar>
               <w:top w:w="80" w:type="dxa"/>
               <w:left w:w="100" w:type="dxa"/>
@@ -11881,7 +12781,7 @@
         </w:tc>
         <w:tc>
           <w:tcPr>
-            <w:tcW w:w="4800" w:type="dxa"/>
+            <w:tcW w:w="4840" w:type="dxa"/>
             <w:tcMar>
               <w:top w:w="80" w:type="dxa"/>
               <w:left w:w="100" w:type="dxa"/>
@@ -11898,6 +12798,77 @@
             </w:r>
             <w:r>
               <w:t xml:space="preserve"> this interaction is expanded in Section 5.1 and tracked as Risk R-001 (Section 7).</w:t>
+            </w:r>
+          </w:p>
+        </w:tc>
+      </w:tr>
+      <w:tr>
+        <w:tc>
+          <w:tcPr>
+            <w:tcW w:w="895" w:type="dxa"/>
+          </w:tcPr>
+          <w:p>
+            <w:r>
+              <w:t>CON-00</w:t>
+            </w:r>
+            <w:r>
+              <w:t>7</w:t>
+            </w:r>
+          </w:p>
+        </w:tc>
+        <w:tc>
+          <w:tcPr>
+            <w:tcW w:w="1840" w:type="dxa"/>
+            <w:tcMar>
+              <w:top w:w="80" w:type="dxa"/>
+              <w:left w:w="100" w:type="dxa"/>
+              <w:bottom w:w="80" w:type="dxa"/>
+              <w:right w:w="100" w:type="dxa"/>
+            </w:tcMar>
+          </w:tcPr>
+          <w:p>
+            <w:r>
+              <w:t>Technology environment</w:t>
+            </w:r>
+          </w:p>
+        </w:tc>
+        <w:tc>
+          <w:tcPr>
+            <w:tcW w:w="3840" w:type="dxa"/>
+            <w:tcMar>
+              <w:top w:w="80" w:type="dxa"/>
+              <w:left w:w="100" w:type="dxa"/>
+              <w:bottom w:w="80" w:type="dxa"/>
+              <w:right w:w="100" w:type="dxa"/>
+            </w:tcMar>
+          </w:tcPr>
+          <w:p>
+            <w:r>
+              <w:t>tools must run on the BC Desktop or team laptop</w:t>
+            </w:r>
+          </w:p>
+        </w:tc>
+        <w:tc>
+          <w:tcPr>
+            <w:tcW w:w="4840" w:type="dxa"/>
+            <w:tcMar>
+              <w:top w:w="80" w:type="dxa"/>
+              <w:left w:w="100" w:type="dxa"/>
+              <w:bottom w:w="80" w:type="dxa"/>
+              <w:right w:w="100" w:type="dxa"/>
+            </w:tcMar>
+          </w:tcPr>
+          <w:p>
+            <w:r>
+              <w:t xml:space="preserve">This helps the lecturer to assess the project on their end and to see how each part integrates with each other (the master brief also </w:t>
+            </w:r>
+            <w:proofErr w:type="gramStart"/>
+            <w:r>
+              <w:t>list</w:t>
+            </w:r>
+            <w:proofErr w:type="gramEnd"/>
+            <w:r>
+              <w:t xml:space="preserve"> this as a requirement section 25)</w:t>
             </w:r>
           </w:p>
         </w:tc>
@@ -11907,22 +12878,17 @@
       <w:pPr>
         <w:spacing w:after="160"/>
       </w:pPr>
-      <w:bookmarkStart w:id="16" w:name="_Toc239883354"/>
     </w:p>
-    <w:p>
-      <w:r>
-        <w:br w:type="page"/>
-      </w:r>
-    </w:p>
+    <w:p/>
     <w:p>
       <w:pPr>
         <w:pStyle w:val="Heading2"/>
       </w:pPr>
+      <w:bookmarkStart w:id="19" w:name="_Toc241064284"/>
       <w:r>
-        <w:lastRenderedPageBreak/>
         <w:t>5.1 Constraint Interaction / Trade-off</w:t>
       </w:r>
-      <w:bookmarkEnd w:id="16"/>
+      <w:bookmarkEnd w:id="19"/>
     </w:p>
     <w:p>
       <w:pPr>
@@ -11967,20 +12933,22 @@
       <w:pPr>
         <w:pStyle w:val="Heading1"/>
       </w:pPr>
-      <w:bookmarkStart w:id="17" w:name="_Toc239883355"/>
+      <w:bookmarkStart w:id="20" w:name="_Toc241064285"/>
       <w:r>
         <w:lastRenderedPageBreak/>
         <w:t>6. Requirements Traceability Matrix (RTM)</w:t>
       </w:r>
-      <w:bookmarkEnd w:id="17"/>
+      <w:bookmarkEnd w:id="20"/>
     </w:p>
     <w:p>
       <w:pPr>
         <w:pStyle w:val="Heading2"/>
       </w:pPr>
+      <w:bookmarkStart w:id="21" w:name="_Toc241064286"/>
       <w:r>
         <w:t>6.1 Matrix filled by Milestone 1</w:t>
       </w:r>
+      <w:bookmarkEnd w:id="21"/>
     </w:p>
     <w:tbl>
       <w:tblPr>
@@ -13856,7 +14824,6 @@
           <w:szCs w:val="23"/>
         </w:rPr>
       </w:pPr>
-      <w:bookmarkStart w:id="18" w:name="_Toc239883356"/>
       <w:r>
         <w:br w:type="page"/>
       </w:r>
@@ -13865,10 +14832,12 @@
       <w:pPr>
         <w:pStyle w:val="Heading2"/>
       </w:pPr>
+      <w:bookmarkStart w:id="22" w:name="_Toc241064287"/>
       <w:r>
         <w:lastRenderedPageBreak/>
         <w:t>6.2 Matrix filled by Milestone 2</w:t>
       </w:r>
+      <w:bookmarkEnd w:id="22"/>
     </w:p>
     <w:tbl>
       <w:tblPr>
@@ -17268,10 +18237,11 @@
       <w:pPr>
         <w:pStyle w:val="Heading1"/>
       </w:pPr>
+      <w:bookmarkStart w:id="23" w:name="_Toc241064288"/>
       <w:r>
         <w:t>7. Risk Register</w:t>
       </w:r>
-      <w:bookmarkEnd w:id="18"/>
+      <w:bookmarkEnd w:id="23"/>
     </w:p>
     <w:p>
       <w:pPr>
@@ -18741,11 +19711,11 @@
       <w:pPr>
         <w:pStyle w:val="Heading1"/>
       </w:pPr>
-      <w:bookmarkStart w:id="19" w:name="_Toc239883357"/>
+      <w:bookmarkStart w:id="24" w:name="_Toc241064289"/>
       <w:r>
         <w:t>8. Forward Engineering Considerations</w:t>
       </w:r>
-      <w:bookmarkEnd w:id="19"/>
+      <w:bookmarkEnd w:id="24"/>
     </w:p>
     <w:p>
       <w:pPr>
@@ -19537,11 +20507,11 @@
       <w:pPr>
         <w:pStyle w:val="Heading1"/>
       </w:pPr>
-      <w:bookmarkStart w:id="20" w:name="_Toc239883358"/>
+      <w:bookmarkStart w:id="25" w:name="_Toc241064290"/>
       <w:r>
         <w:t>9. Engineering Decision Log</w:t>
       </w:r>
-      <w:bookmarkEnd w:id="20"/>
+      <w:bookmarkEnd w:id="25"/>
     </w:p>
     <w:p>
       <w:pPr>
@@ -20793,22 +21763,22 @@
       <w:pPr>
         <w:pStyle w:val="Heading1"/>
       </w:pPr>
-      <w:bookmarkStart w:id="21" w:name="_Toc239883359"/>
+      <w:bookmarkStart w:id="26" w:name="_Toc241064291"/>
       <w:r>
         <w:lastRenderedPageBreak/>
         <w:t>10. GitHub &amp; Team Governance</w:t>
       </w:r>
-      <w:bookmarkEnd w:id="21"/>
+      <w:bookmarkEnd w:id="26"/>
     </w:p>
     <w:p>
       <w:pPr>
         <w:pStyle w:val="Heading2"/>
       </w:pPr>
-      <w:bookmarkStart w:id="22" w:name="_Toc239883360"/>
+      <w:bookmarkStart w:id="27" w:name="_Toc241064292"/>
       <w:r>
         <w:t>10.1 Repository</w:t>
       </w:r>
-      <w:bookmarkEnd w:id="22"/>
+      <w:bookmarkEnd w:id="27"/>
     </w:p>
     <w:tbl>
       <w:tblPr>
@@ -21160,11 +22130,11 @@
       <w:pPr>
         <w:pStyle w:val="Heading2"/>
       </w:pPr>
-      <w:bookmarkStart w:id="23" w:name="_Toc239883361"/>
+      <w:bookmarkStart w:id="28" w:name="_Toc241064293"/>
       <w:r>
         <w:t>10.2 Team Working Agreement</w:t>
       </w:r>
-      <w:bookmarkEnd w:id="23"/>
+      <w:bookmarkEnd w:id="28"/>
     </w:p>
     <w:p>
       <w:r>
@@ -21272,11 +22242,11 @@
       <w:pPr>
         <w:pStyle w:val="Heading1"/>
       </w:pPr>
-      <w:bookmarkStart w:id="24" w:name="_Toc239883362"/>
+      <w:bookmarkStart w:id="29" w:name="_Toc241064294"/>
       <w:r>
         <w:t>11. AI Usage Register</w:t>
       </w:r>
-      <w:bookmarkEnd w:id="24"/>
+      <w:bookmarkEnd w:id="29"/>
     </w:p>
     <w:tbl>
       <w:tblPr>
@@ -22309,11 +23279,11 @@
       <w:pPr>
         <w:pStyle w:val="Heading1"/>
       </w:pPr>
-      <w:bookmarkStart w:id="25" w:name="_Toc239883363"/>
+      <w:bookmarkStart w:id="30" w:name="_Toc241064295"/>
       <w:r>
         <w:t>12. Baseline Readiness Checklist</w:t>
       </w:r>
-      <w:bookmarkEnd w:id="25"/>
+      <w:bookmarkEnd w:id="30"/>
     </w:p>
     <w:p>
       <w:pPr>
@@ -22442,37 +23412,29 @@
       <w:pPr>
         <w:pStyle w:val="Heading1"/>
       </w:pPr>
+      <w:bookmarkStart w:id="31" w:name="_Toc241064296"/>
       <w:r>
         <w:lastRenderedPageBreak/>
-        <w:t>1</w:t>
+        <w:t>13. Solution Design Baseline</w:t>
       </w:r>
-      <w:r>
-        <w:t>3</w:t>
-      </w:r>
-      <w:r>
-        <w:t>. Solution Design Baseline</w:t>
-      </w:r>
+      <w:bookmarkEnd w:id="31"/>
     </w:p>
     <w:p>
       <w:pPr>
         <w:pStyle w:val="Heading2"/>
       </w:pPr>
+      <w:bookmarkStart w:id="32" w:name="_Toc241064297"/>
       <w:r>
-        <w:t>1</w:t>
+        <w:t>13.1 Repository</w:t>
       </w:r>
-      <w:r>
-        <w:t>3</w:t>
-      </w:r>
-      <w:r>
-        <w:t>.1 Repository</w:t>
-      </w:r>
+      <w:bookmarkEnd w:id="32"/>
     </w:p>
     <w:p>
       <w:pPr>
         <w:pStyle w:val="Heading1"/>
       </w:pPr>
     </w:p>
-    <w:bookmarkStart w:id="26" w:name="_Toc239883364" w:displacedByCustomXml="next"/>
+    <w:bookmarkStart w:id="33" w:name="_Toc241064298" w:displacedByCustomXml="next"/>
     <w:sdt>
       <w:sdtPr>
         <w:rPr>
@@ -22496,7 +23458,7 @@
           <w:r>
             <w:t>References</w:t>
           </w:r>
-          <w:bookmarkEnd w:id="26"/>
+          <w:bookmarkEnd w:id="33"/>
         </w:p>
         <w:sdt>
           <w:sdtPr>
@@ -23647,7 +24609,6 @@
   <w:style w:type="character" w:default="1" w:styleId="DefaultParagraphFont">
     <w:name w:val="Default Paragraph Font"/>
     <w:uiPriority w:val="1"/>
-    <w:semiHidden/>
     <w:unhideWhenUsed/>
   </w:style>
   <w:style w:type="table" w:default="1" w:styleId="TableNormal">

</xml_diff>

<commit_message>
testing main branch protection
</commit_message>
<xml_diff>
--- a/SEN381_Milestone1_V1.2 - conditionally accepted.docx
+++ b/SEN381_Milestone1_V1.2 - conditionally accepted.docx
@@ -4604,10 +4604,7 @@
       </w:pPr>
       <w:bookmarkStart w:id="3" w:name="_Toc241064268"/>
       <w:r>
-        <w:t>Baseline Approval</w:t>
-      </w:r>
-      <w:r>
-        <w:t xml:space="preserve"> (Milestone 2)</w:t>
+        <w:t>Baseline Approval (Milestone 2)</w:t>
       </w:r>
       <w:bookmarkEnd w:id="3"/>
     </w:p>
@@ -8082,6 +8079,7 @@
           </w:tcPr>
           <w:p>
             <w:r>
+              <w:lastRenderedPageBreak/>
               <w:t>FR-0</w:t>
             </w:r>
             <w:r>
@@ -12398,10 +12396,7 @@
           </w:tcPr>
           <w:p>
             <w:r>
-              <w:t>CON-00</w:t>
-            </w:r>
-            <w:r>
-              <w:t>2</w:t>
+              <w:t>CON-002</w:t>
             </w:r>
           </w:p>
         </w:tc>
@@ -12467,10 +12462,7 @@
           </w:tcPr>
           <w:p>
             <w:r>
-              <w:t>CON-00</w:t>
-            </w:r>
-            <w:r>
-              <w:t>3</w:t>
+              <w:t>CON-003</w:t>
             </w:r>
           </w:p>
         </w:tc>
@@ -12580,10 +12572,7 @@
           </w:tcPr>
           <w:p>
             <w:r>
-              <w:t>CON-00</w:t>
-            </w:r>
-            <w:r>
-              <w:t>4</w:t>
+              <w:t>CON-004</w:t>
             </w:r>
           </w:p>
         </w:tc>
@@ -12655,10 +12644,7 @@
           </w:tcPr>
           <w:p>
             <w:r>
-              <w:t>CON-00</w:t>
-            </w:r>
-            <w:r>
-              <w:t>5</w:t>
+              <w:t>CON-005</w:t>
             </w:r>
           </w:p>
         </w:tc>
@@ -12740,10 +12726,7 @@
           </w:tcPr>
           <w:p>
             <w:r>
-              <w:t>CON-00</w:t>
-            </w:r>
-            <w:r>
-              <w:t>6</w:t>
+              <w:t>CON-006</w:t>
             </w:r>
           </w:p>
         </w:tc>
@@ -12809,10 +12792,7 @@
           </w:tcPr>
           <w:p>
             <w:r>
-              <w:t>CON-00</w:t>
-            </w:r>
-            <w:r>
-              <w:t>7</w:t>
+              <w:t>CON-007</w:t>
             </w:r>
           </w:p>
         </w:tc>
@@ -12862,11 +12842,9 @@
             <w:r>
               <w:t xml:space="preserve">This helps the lecturer to assess the project on their end and to see how each part integrates with each other (the master brief also </w:t>
             </w:r>
-            <w:proofErr w:type="gramStart"/>
-            <w:r>
-              <w:t>list</w:t>
-            </w:r>
-            <w:proofErr w:type="gramEnd"/>
+            <w:r>
+              <w:t>lists</w:t>
+            </w:r>
             <w:r>
               <w:t xml:space="preserve"> this as a requirement section 25)</w:t>
             </w:r>
@@ -24609,6 +24587,7 @@
   <w:style w:type="character" w:default="1" w:styleId="DefaultParagraphFont">
     <w:name w:val="Default Paragraph Font"/>
     <w:uiPriority w:val="1"/>
+    <w:semiHidden/>
     <w:unhideWhenUsed/>
   </w:style>
   <w:style w:type="table" w:default="1" w:styleId="TableNormal">

</xml_diff>

<commit_message>
Section 13.1 + section 9 update
Finished section 13.1, and added a new decision to section 9 (D-006).
</commit_message>
<xml_diff>
--- a/SEN381_Milestone1_V1.2 - conditionally accepted.docx
+++ b/SEN381_Milestone1_V1.2 - conditionally accepted.docx
@@ -150,7 +150,15 @@
         <w:jc w:val="center"/>
       </w:pPr>
       <w:r>
-        <w:t>Jared Swanepool - 601621</w:t>
+        <w:t xml:space="preserve">Jared </w:t>
+      </w:r>
+      <w:proofErr w:type="spellStart"/>
+      <w:r>
+        <w:t>Swanepool</w:t>
+      </w:r>
+      <w:proofErr w:type="spellEnd"/>
+      <w:r>
+        <w:t xml:space="preserve"> - 601621</w:t>
       </w:r>
     </w:p>
     <w:p>
@@ -212,7 +220,15 @@
         <w:t>Governing document</w:t>
       </w:r>
       <w:r>
-        <w:t>: SEN381 CivicConnect Master Project Brief</w:t>
+        <w:t xml:space="preserve">: SEN381 </w:t>
+      </w:r>
+      <w:proofErr w:type="spellStart"/>
+      <w:r>
+        <w:t>CivicConnect</w:t>
+      </w:r>
+      <w:proofErr w:type="spellEnd"/>
+      <w:r>
+        <w:t xml:space="preserve"> Master Project Brief</w:t>
       </w:r>
     </w:p>
     <w:p>
@@ -4296,9 +4312,11 @@
             </w:tcMar>
           </w:tcPr>
           <w:p>
+            <w:proofErr w:type="spellStart"/>
             <w:r>
               <w:t>CivicConnect</w:t>
             </w:r>
+            <w:proofErr w:type="spellEnd"/>
           </w:p>
         </w:tc>
       </w:tr>
@@ -4645,9 +4663,11 @@
             </w:tcMar>
           </w:tcPr>
           <w:p>
+            <w:proofErr w:type="spellStart"/>
             <w:r>
               <w:t>CivicConnect</w:t>
             </w:r>
+            <w:proofErr w:type="spellEnd"/>
           </w:p>
         </w:tc>
       </w:tr>
@@ -4956,7 +4976,15 @@
     </w:p>
     <w:p>
       <w:r>
-        <w:t xml:space="preserve">A community-focused organisation CivicConnect currently manages their services requests such as facility faults, IT support, maintenance, lost property and security concerns across email, phone, WhatsApp, spreadsheets, and paper. This produces duplicated or lost requests, no visibility for requesters, no reliable reporting for management and no clear ownership for staff. </w:t>
+        <w:t xml:space="preserve">A community-focused organisation </w:t>
+      </w:r>
+      <w:proofErr w:type="spellStart"/>
+      <w:r>
+        <w:t>CivicConnect</w:t>
+      </w:r>
+      <w:proofErr w:type="spellEnd"/>
+      <w:r>
+        <w:t xml:space="preserve"> currently manages their services requests such as facility faults, IT support, maintenance, lost property and security concerns across email, phone, WhatsApp, spreadsheets, and paper. This produces duplicated or lost requests, no visibility for requesters, no reliable reporting for management and no clear ownership for staff. </w:t>
       </w:r>
     </w:p>
     <w:p>
@@ -4970,8 +4998,13 @@
       <w:bookmarkEnd w:id="6"/>
     </w:p>
     <w:p>
+      <w:proofErr w:type="spellStart"/>
       <w:r>
-        <w:t xml:space="preserve">CivicConnect needs a controlled digital platform that provides a reliable, traceable </w:t>
+        <w:t>CivicConnect</w:t>
+      </w:r>
+      <w:proofErr w:type="spellEnd"/>
+      <w:r>
+        <w:t xml:space="preserve"> needs a controlled digital platform that provides a reliable, traceable </w:t>
       </w:r>
       <w:r>
         <w:t>and usable way to submit, manage, monitor and report on service requests.</w:t>
@@ -4988,8 +5021,13 @@
       <w:bookmarkEnd w:id="7"/>
     </w:p>
     <w:p>
+      <w:proofErr w:type="spellStart"/>
       <w:r>
-        <w:t>CivicConnect business value is a single controlled record of a request’s lifecycle. Submit to categorise to assign to act to resolve then report which closes the accountability gap that their current infrastructure has</w:t>
+        <w:t>CivicConnect</w:t>
+      </w:r>
+      <w:proofErr w:type="spellEnd"/>
+      <w:r>
+        <w:t xml:space="preserve"> business value is a single controlled record of a request’s lifecycle. Submit to categorise to assign to act to resolve then report which closes the accountability gap that their current infrastructure has</w:t>
       </w:r>
       <w:r>
         <w:t>.</w:t>
@@ -7000,7 +7038,17 @@
           </w:tcPr>
           <w:p>
             <w:r>
-              <w:t>Upon submission attempt, the user must receive feedback. If its an error, the problem must be stated. If successful, the user must be notified</w:t>
+              <w:t xml:space="preserve">Upon submission attempt, the user must receive feedback. If </w:t>
+            </w:r>
+            <w:proofErr w:type="spellStart"/>
+            <w:proofErr w:type="gramStart"/>
+            <w:r>
+              <w:t>its</w:t>
+            </w:r>
+            <w:proofErr w:type="spellEnd"/>
+            <w:proofErr w:type="gramEnd"/>
+            <w:r>
+              <w:t xml:space="preserve"> an error, the problem must be stated. If successful, the user must be notified</w:t>
             </w:r>
           </w:p>
         </w:tc>
@@ -7121,7 +7169,15 @@
           </w:tcPr>
           <w:p>
             <w:r>
-              <w:t>On selection, requests must be categorise according to date submitted, date changed, or alphabetical order.</w:t>
+              <w:t xml:space="preserve">On selection, requests must be </w:t>
+            </w:r>
+            <w:proofErr w:type="gramStart"/>
+            <w:r>
+              <w:t>categorise</w:t>
+            </w:r>
+            <w:proofErr w:type="gramEnd"/>
+            <w:r>
+              <w:t xml:space="preserve"> according to date submitted, date changed, or alphabetical order.</w:t>
             </w:r>
           </w:p>
         </w:tc>
@@ -7484,7 +7540,15 @@
           </w:tcPr>
           <w:p>
             <w:r>
-              <w:t>After 5 years the requests must be auto-deleted to prevent overloading storage in the long term.</w:t>
+              <w:t xml:space="preserve">After 5 years the requests must be </w:t>
+            </w:r>
+            <w:proofErr w:type="gramStart"/>
+            <w:r>
+              <w:t>auto-deleted</w:t>
+            </w:r>
+            <w:proofErr w:type="gramEnd"/>
+            <w:r>
+              <w:t xml:space="preserve"> to prevent overloading storage in the long term.</w:t>
             </w:r>
           </w:p>
         </w:tc>
@@ -7974,11 +8038,24 @@
           </w:tcPr>
           <w:p>
             <w:r>
-              <w:t xml:space="preserve">The views should provide enough information in order to make relevant decisions. Examples </w:t>
-            </w:r>
+              <w:t xml:space="preserve">The views should provide enough information </w:t>
+            </w:r>
+            <w:proofErr w:type="gramStart"/>
+            <w:r>
+              <w:t>in order to</w:t>
+            </w:r>
+            <w:proofErr w:type="gramEnd"/>
+            <w:r>
+              <w:t xml:space="preserve"> make relevant decisions. Examples </w:t>
+            </w:r>
+            <w:proofErr w:type="gramStart"/>
             <w:r>
               <w:lastRenderedPageBreak/>
-              <w:t>being: category, status, time submitted, who is assigned to the request.</w:t>
+              <w:t>being:</w:t>
+            </w:r>
+            <w:proofErr w:type="gramEnd"/>
+            <w:r>
+              <w:t xml:space="preserve"> category, status, time submitted, who is assigned to the request.</w:t>
             </w:r>
           </w:p>
         </w:tc>
@@ -9247,7 +9324,15 @@
           </w:tcPr>
           <w:p>
             <w:r>
-              <w:t>Requests will have to be resolved within a set amount of time. Early estimates sets it at within 7 days.</w:t>
+              <w:t xml:space="preserve">Requests will have to be resolved within a set amount of time. Early estimates </w:t>
+            </w:r>
+            <w:proofErr w:type="gramStart"/>
+            <w:r>
+              <w:t>sets</w:t>
+            </w:r>
+            <w:proofErr w:type="gramEnd"/>
+            <w:r>
+              <w:t xml:space="preserve"> it at within 7 days.</w:t>
             </w:r>
           </w:p>
         </w:tc>
@@ -9362,7 +9447,15 @@
           </w:tcPr>
           <w:p>
             <w:r>
-              <w:t xml:space="preserve">Management should have access to the additional information given by the staff members in order to review the resolved </w:t>
+              <w:t xml:space="preserve">Management should have access to the additional information given by the staff members </w:t>
+            </w:r>
+            <w:proofErr w:type="gramStart"/>
+            <w:r>
+              <w:t>in order to</w:t>
+            </w:r>
+            <w:proofErr w:type="gramEnd"/>
+            <w:r>
+              <w:t xml:space="preserve"> review the resolved </w:t>
             </w:r>
             <w:r>
               <w:lastRenderedPageBreak/>
@@ -9915,7 +10008,15 @@
           </w:tcPr>
           <w:p>
             <w:r>
-              <w:t>Users can only access data that they are allowed to access. For instance, a requestor cant access the credentials of other requestors</w:t>
+              <w:t xml:space="preserve">Users can only access data that they are allowed to access. For instance, a requestor </w:t>
+            </w:r>
+            <w:proofErr w:type="gramStart"/>
+            <w:r>
+              <w:t>cant</w:t>
+            </w:r>
+            <w:proofErr w:type="gramEnd"/>
+            <w:r>
+              <w:t xml:space="preserve"> access the credentials of other requestors</w:t>
             </w:r>
           </w:p>
         </w:tc>
@@ -11663,7 +11764,23 @@
           </w:tcPr>
           <w:p>
             <w:r>
-              <w:t>A main issue CivicConnect is supposed to solve is requests being lost. Requests must be submitted, or a report must be given. Requests that has been stored must be recoverable when lost</w:t>
+              <w:t xml:space="preserve">A main issue </w:t>
+            </w:r>
+            <w:proofErr w:type="spellStart"/>
+            <w:r>
+              <w:t>CivicConnect</w:t>
+            </w:r>
+            <w:proofErr w:type="spellEnd"/>
+            <w:r>
+              <w:t xml:space="preserve"> is supposed to solve is requests being lost. Requests must be submitted, or a report must be given. Requests that </w:t>
+            </w:r>
+            <w:proofErr w:type="gramStart"/>
+            <w:r>
+              <w:t>has</w:t>
+            </w:r>
+            <w:proofErr w:type="gramEnd"/>
+            <w:r>
+              <w:t xml:space="preserve"> been stored must be recoverable when lost</w:t>
             </w:r>
             <w:r>
               <w:t>.</w:t>
@@ -11688,7 +11805,15 @@
           </w:tcPr>
           <w:p>
             <w:r>
-              <w:t>No submissions may be simply lost. Submission failures must be indicated, successful submissions must be acknowledged. Furthermore, overwritten data must be recoverable within 48 hours. 99% availability during operating hours is also required.</w:t>
+              <w:t xml:space="preserve">No submissions may be simply lost. Submission failures must be </w:t>
+            </w:r>
+            <w:proofErr w:type="gramStart"/>
+            <w:r>
+              <w:t>indicated,</w:t>
+            </w:r>
+            <w:proofErr w:type="gramEnd"/>
+            <w:r>
+              <w:t xml:space="preserve"> successful submissions must be acknowledged. Furthermore, overwritten data must be recoverable within 48 hours. 99% availability during operating hours is also required.</w:t>
             </w:r>
           </w:p>
         </w:tc>
@@ -12128,8 +12253,13 @@
             </w:tcMar>
           </w:tcPr>
           <w:p>
-            <w:r>
-              <w:t xml:space="preserve">CivicConnect needs to make use of free-tier software and services. This will mean that the 5-year retention </w:t>
+            <w:proofErr w:type="spellStart"/>
+            <w:r>
+              <w:t>CivicConnect</w:t>
+            </w:r>
+            <w:proofErr w:type="spellEnd"/>
+            <w:r>
+              <w:t xml:space="preserve"> needs to make use of free-tier software and services. This will mean that the 5-year retention </w:t>
             </w:r>
             <w:r>
               <w:lastRenderedPageBreak/>
@@ -12551,7 +12681,15 @@
               <w:t>Free-tier hosting/database services typically cap storage, connection counts, request quotas or uptime</w:t>
             </w:r>
             <w:r>
-              <w:t xml:space="preserve">, for example SupaBase only providing 500MB database size in the free tier </w:t>
+              <w:t xml:space="preserve">, for example </w:t>
+            </w:r>
+            <w:proofErr w:type="spellStart"/>
+            <w:r>
+              <w:t>SupaBase</w:t>
+            </w:r>
+            <w:proofErr w:type="spellEnd"/>
+            <w:r>
+              <w:t xml:space="preserve"> only providing 500MB database size in the free tier </w:t>
             </w:r>
             <w:sdt>
               <w:sdtPr>
@@ -12700,7 +12838,15 @@
           </w:tcPr>
           <w:p>
             <w:r>
-              <w:t>Security is a lifecycle-wide responsibility. CivicConnect handles categories such as security concerns and IT support requests that may contain sensitive personal or safety-related information.</w:t>
+              <w:t xml:space="preserve">Security is a lifecycle-wide responsibility. </w:t>
+            </w:r>
+            <w:proofErr w:type="spellStart"/>
+            <w:r>
+              <w:t>CivicConnect</w:t>
+            </w:r>
+            <w:proofErr w:type="spellEnd"/>
+            <w:r>
+              <w:t xml:space="preserve"> handles categories such as security concerns and IT support requests that may contain sensitive personal or safety-related information.</w:t>
             </w:r>
           </w:p>
         </w:tc>
@@ -12722,7 +12868,15 @@
               <w:t>-</w:t>
             </w:r>
             <w:r>
-              <w:t xml:space="preserve"> deferring this risks a costly late redesign of the data model and authentication approach.</w:t>
+              <w:t xml:space="preserve"> deferring </w:t>
+            </w:r>
+            <w:proofErr w:type="gramStart"/>
+            <w:r>
+              <w:t>this risks</w:t>
+            </w:r>
+            <w:proofErr w:type="gramEnd"/>
+            <w:r>
+              <w:t xml:space="preserve"> a costly late redesign of the data model and authentication approach.</w:t>
             </w:r>
           </w:p>
         </w:tc>
@@ -12976,12 +13130,21 @@
             </w:tcMar>
           </w:tcPr>
           <w:p>
+            <w:proofErr w:type="spellStart"/>
             <w:r>
               <w:rPr>
                 <w:b/>
                 <w:bCs/>
               </w:rPr>
-              <w:t>Req ID</w:t>
+              <w:t>Req</w:t>
+            </w:r>
+            <w:proofErr w:type="spellEnd"/>
+            <w:r>
+              <w:rPr>
+                <w:b/>
+                <w:bCs/>
+              </w:rPr>
+              <w:t xml:space="preserve"> ID</w:t>
             </w:r>
           </w:p>
         </w:tc>
@@ -13256,7 +13419,17 @@
           </w:tcPr>
           <w:p>
             <w:r>
-              <w:t>Upon submission attempt, the user must receive feedback. If its an error, the problem must be stated. If successful, the user must be notified</w:t>
+              <w:t xml:space="preserve">Upon submission attempt, the user must receive feedback. If </w:t>
+            </w:r>
+            <w:proofErr w:type="spellStart"/>
+            <w:proofErr w:type="gramStart"/>
+            <w:r>
+              <w:t>its</w:t>
+            </w:r>
+            <w:proofErr w:type="spellEnd"/>
+            <w:proofErr w:type="gramEnd"/>
+            <w:r>
+              <w:t xml:space="preserve"> an error, the problem must be stated. If successful, the user must be notified</w:t>
             </w:r>
           </w:p>
         </w:tc>
@@ -13325,7 +13498,17 @@
           </w:tcPr>
           <w:p>
             <w:r>
-              <w:t>Upon submission attempt, the user must receive feedback. If its an error, the problem must be stated. If successful, the user must be notified</w:t>
+              <w:t xml:space="preserve">Upon submission attempt, the user must receive feedback. If </w:t>
+            </w:r>
+            <w:proofErr w:type="spellStart"/>
+            <w:proofErr w:type="gramStart"/>
+            <w:r>
+              <w:t>its</w:t>
+            </w:r>
+            <w:proofErr w:type="spellEnd"/>
+            <w:proofErr w:type="gramEnd"/>
+            <w:r>
+              <w:t xml:space="preserve"> an error, the problem must be stated. If successful, the user must be notified</w:t>
             </w:r>
           </w:p>
         </w:tc>
@@ -13394,7 +13577,15 @@
           </w:tcPr>
           <w:p>
             <w:r>
-              <w:t>On selection, requests must be categorise according to date submitted, date changed, or alphabetical order.</w:t>
+              <w:t xml:space="preserve">On selection, requests must be </w:t>
+            </w:r>
+            <w:proofErr w:type="gramStart"/>
+            <w:r>
+              <w:t>categorise</w:t>
+            </w:r>
+            <w:proofErr w:type="gramEnd"/>
+            <w:r>
+              <w:t xml:space="preserve"> according to date submitted, date changed, or alphabetical order.</w:t>
             </w:r>
           </w:p>
         </w:tc>
@@ -13883,7 +14074,23 @@
           </w:tcPr>
           <w:p>
             <w:r>
-              <w:t>The views should provide enough information in order to make relevant decisions. Examples being: category, status, time submitted, who is assigned to the request.</w:t>
+              <w:t xml:space="preserve">The views should provide enough information </w:t>
+            </w:r>
+            <w:proofErr w:type="gramStart"/>
+            <w:r>
+              <w:t>in order to</w:t>
+            </w:r>
+            <w:proofErr w:type="gramEnd"/>
+            <w:r>
+              <w:t xml:space="preserve"> make relevant decisions. Examples </w:t>
+            </w:r>
+            <w:proofErr w:type="gramStart"/>
+            <w:r>
+              <w:t>being:</w:t>
+            </w:r>
+            <w:proofErr w:type="gramEnd"/>
+            <w:r>
+              <w:t xml:space="preserve"> category, status, time submitted, who is assigned to the request.</w:t>
             </w:r>
           </w:p>
         </w:tc>
@@ -14655,7 +14862,15 @@
           </w:tcPr>
           <w:p>
             <w:r>
-              <w:t>Requests will have to be resolved within a set amount of time. Early estimates sets it at within 7 days.</w:t>
+              <w:t xml:space="preserve">Requests will have to be resolved within a set amount of time. Early estimates </w:t>
+            </w:r>
+            <w:proofErr w:type="gramStart"/>
+            <w:r>
+              <w:t>sets</w:t>
+            </w:r>
+            <w:proofErr w:type="gramEnd"/>
+            <w:r>
+              <w:t xml:space="preserve"> it at within 7 days.</w:t>
             </w:r>
           </w:p>
         </w:tc>
@@ -14725,7 +14940,15 @@
           </w:tcPr>
           <w:p>
             <w:r>
-              <w:t>Management should have access to the additional information given by the staff members in order to review the resolved requests. Basic analysis features, such as average time to resolution could also be added.</w:t>
+              <w:t xml:space="preserve">Management should have access to the additional information given by the staff members </w:t>
+            </w:r>
+            <w:proofErr w:type="gramStart"/>
+            <w:r>
+              <w:t>in order to</w:t>
+            </w:r>
+            <w:proofErr w:type="gramEnd"/>
+            <w:r>
+              <w:t xml:space="preserve"> review the resolved requests. Basic analysis features, such as average time to resolution could also be added.</w:t>
             </w:r>
           </w:p>
         </w:tc>
@@ -14800,12 +15023,21 @@
             </w:tcMar>
           </w:tcPr>
           <w:p>
+            <w:proofErr w:type="spellStart"/>
             <w:r>
               <w:rPr>
                 <w:b/>
                 <w:bCs/>
               </w:rPr>
-              <w:t>Req ID</w:t>
+              <w:t>Req</w:t>
+            </w:r>
+            <w:proofErr w:type="spellEnd"/>
+            <w:r>
+              <w:rPr>
+                <w:b/>
+                <w:bCs/>
+              </w:rPr>
+              <w:t xml:space="preserve"> ID</w:t>
             </w:r>
           </w:p>
         </w:tc>
@@ -14896,21 +15128,37 @@
                 <w:b/>
                 <w:bCs/>
               </w:rPr>
-              <w:t xml:space="preserve"> on d</w:t>
-            </w:r>
+              <w:t xml:space="preserve"> on </w:t>
+            </w:r>
+            <w:proofErr w:type="gramStart"/>
             <w:r>
               <w:rPr>
                 <w:b/>
                 <w:bCs/>
               </w:rPr>
-              <w:t xml:space="preserve">ata </w:t>
+              <w:t>d</w:t>
             </w:r>
             <w:r>
               <w:rPr>
                 <w:b/>
                 <w:bCs/>
               </w:rPr>
-              <w:t xml:space="preserve"> and </w:t>
+              <w:t xml:space="preserve">ata </w:t>
+            </w:r>
+            <w:r>
+              <w:rPr>
+                <w:b/>
+                <w:bCs/>
+              </w:rPr>
+              <w:t xml:space="preserve"> and</w:t>
+            </w:r>
+            <w:proofErr w:type="gramEnd"/>
+            <w:r>
+              <w:rPr>
+                <w:b/>
+                <w:bCs/>
+              </w:rPr>
+              <w:t xml:space="preserve"> </w:t>
             </w:r>
             <w:r>
               <w:rPr>
@@ -15149,9 +15397,11 @@
             </w:tcMar>
           </w:tcPr>
           <w:p>
+            <w:proofErr w:type="spellStart"/>
             <w:r>
               <w:t>RequestQuery</w:t>
             </w:r>
+            <w:proofErr w:type="spellEnd"/>
           </w:p>
         </w:tc>
         <w:tc>
@@ -15182,7 +15432,15 @@
           </w:tcPr>
           <w:p>
             <w:r>
-              <w:t>Should read via a DataAcces layer, not directly via query.</w:t>
+              <w:t xml:space="preserve">Should read via a </w:t>
+            </w:r>
+            <w:proofErr w:type="spellStart"/>
+            <w:r>
+              <w:t>DataAcces</w:t>
+            </w:r>
+            <w:proofErr w:type="spellEnd"/>
+            <w:r>
+              <w:t xml:space="preserve"> layer, not directly via query.</w:t>
             </w:r>
           </w:p>
         </w:tc>
@@ -15506,9 +15764,11 @@
             </w:tcMar>
           </w:tcPr>
           <w:p>
+            <w:proofErr w:type="spellStart"/>
             <w:r>
               <w:t>RequestQuery</w:t>
             </w:r>
+            <w:proofErr w:type="spellEnd"/>
           </w:p>
         </w:tc>
         <w:tc>
@@ -15626,9 +15886,11 @@
             </w:tcMar>
           </w:tcPr>
           <w:p>
+            <w:proofErr w:type="spellStart"/>
             <w:r>
               <w:t>StatusAudit</w:t>
             </w:r>
+            <w:proofErr w:type="spellEnd"/>
           </w:p>
         </w:tc>
         <w:tc>
@@ -15643,7 +15905,15 @@
           </w:tcPr>
           <w:p>
             <w:r>
-              <w:t>The current status must be consistent with the history</w:t>
+              <w:t xml:space="preserve">The </w:t>
+            </w:r>
+            <w:proofErr w:type="gramStart"/>
+            <w:r>
+              <w:t>current status</w:t>
+            </w:r>
+            <w:proofErr w:type="gramEnd"/>
+            <w:r>
+              <w:t xml:space="preserve"> must be consistent with the history</w:t>
             </w:r>
           </w:p>
         </w:tc>
@@ -15746,8 +16016,13 @@
             </w:tcMar>
           </w:tcPr>
           <w:p>
-            <w:r>
-              <w:t>StatusAudit, Notification</w:t>
+            <w:proofErr w:type="spellStart"/>
+            <w:r>
+              <w:t>StatusAudit</w:t>
+            </w:r>
+            <w:proofErr w:type="spellEnd"/>
+            <w:r>
+              <w:t>, Notification</w:t>
             </w:r>
           </w:p>
         </w:tc>
@@ -15882,8 +16157,13 @@
             </w:tcMar>
           </w:tcPr>
           <w:p>
-            <w:r>
-              <w:t>Auto-deletion at 5 years after last update.</w:t>
+            <w:proofErr w:type="gramStart"/>
+            <w:r>
+              <w:t>Auto-deletion</w:t>
+            </w:r>
+            <w:proofErr w:type="gramEnd"/>
+            <w:r>
+              <w:t xml:space="preserve"> at 5 years after last update.</w:t>
             </w:r>
           </w:p>
         </w:tc>
@@ -15986,9 +16266,11 @@
             </w:tcMar>
           </w:tcPr>
           <w:p>
+            <w:proofErr w:type="spellStart"/>
             <w:r>
               <w:t>RequestQuery</w:t>
             </w:r>
+            <w:proofErr w:type="spellEnd"/>
           </w:p>
         </w:tc>
         <w:tc>
@@ -16259,7 +16541,15 @@
           </w:tcPr>
           <w:p>
             <w:r>
-              <w:t>Must be applied on the DataLayer, not per-screen</w:t>
+              <w:t xml:space="preserve">Must be applied on the </w:t>
+            </w:r>
+            <w:proofErr w:type="spellStart"/>
+            <w:r>
+              <w:t>DataLayer</w:t>
+            </w:r>
+            <w:proofErr w:type="spellEnd"/>
+            <w:r>
+              <w:t>, not per-screen</w:t>
             </w:r>
           </w:p>
         </w:tc>
@@ -16346,9 +16636,11 @@
             </w:tcMar>
           </w:tcPr>
           <w:p>
+            <w:proofErr w:type="spellStart"/>
             <w:r>
               <w:t>RequestQuery</w:t>
             </w:r>
+            <w:proofErr w:type="spellEnd"/>
           </w:p>
         </w:tc>
         <w:tc>
@@ -16379,7 +16671,15 @@
           </w:tcPr>
           <w:p>
             <w:r>
-              <w:t>The SummaryView must be separate from a detailed read</w:t>
+              <w:t xml:space="preserve">The </w:t>
+            </w:r>
+            <w:proofErr w:type="spellStart"/>
+            <w:r>
+              <w:t>SummaryView</w:t>
+            </w:r>
+            <w:proofErr w:type="spellEnd"/>
+            <w:r>
+              <w:t xml:space="preserve"> must be separate from a detailed read</w:t>
             </w:r>
           </w:p>
         </w:tc>
@@ -16466,8 +16766,13 @@
             </w:tcMar>
           </w:tcPr>
           <w:p>
-            <w:r>
-              <w:t>RequestQuery, Authorisation</w:t>
+            <w:proofErr w:type="spellStart"/>
+            <w:r>
+              <w:t>RequestQuery</w:t>
+            </w:r>
+            <w:proofErr w:type="spellEnd"/>
+            <w:r>
+              <w:t>, Authorisation</w:t>
             </w:r>
           </w:p>
         </w:tc>
@@ -16482,8 +16787,13 @@
             </w:tcMar>
           </w:tcPr>
           <w:p>
-            <w:r>
-              <w:t>Filered and sorted fields must be scoped by authorisation</w:t>
+            <w:proofErr w:type="spellStart"/>
+            <w:r>
+              <w:t>Filered</w:t>
+            </w:r>
+            <w:proofErr w:type="spellEnd"/>
+            <w:r>
+              <w:t xml:space="preserve"> and sorted fields must be scoped by authorisation</w:t>
             </w:r>
           </w:p>
         </w:tc>
@@ -16588,9 +16898,11 @@
             </w:tcMar>
           </w:tcPr>
           <w:p>
+            <w:proofErr w:type="spellStart"/>
             <w:r>
               <w:t>StatusAudit</w:t>
             </w:r>
+            <w:proofErr w:type="spellEnd"/>
           </w:p>
         </w:tc>
         <w:tc>
@@ -16605,7 +16917,15 @@
           </w:tcPr>
           <w:p>
             <w:r>
-              <w:t>The StatusHistory must read form the history of changes.</w:t>
+              <w:t xml:space="preserve">The </w:t>
+            </w:r>
+            <w:proofErr w:type="spellStart"/>
+            <w:r>
+              <w:t>StatusHistory</w:t>
+            </w:r>
+            <w:proofErr w:type="spellEnd"/>
+            <w:r>
+              <w:t xml:space="preserve"> must read form the history of changes.</w:t>
             </w:r>
           </w:p>
         </w:tc>
@@ -16829,8 +17149,13 @@
           </w:tcPr>
           <w:p>
             <w:r>
-              <w:t>Assignment, StatusAudit</w:t>
-            </w:r>
+              <w:t xml:space="preserve">Assignment, </w:t>
+            </w:r>
+            <w:proofErr w:type="spellStart"/>
+            <w:r>
+              <w:t>StatusAudit</w:t>
+            </w:r>
+            <w:proofErr w:type="spellEnd"/>
           </w:p>
         </w:tc>
         <w:tc>
@@ -16948,9 +17273,11 @@
             </w:tcMar>
           </w:tcPr>
           <w:p>
+            <w:proofErr w:type="spellStart"/>
             <w:r>
               <w:t>StatusAudit</w:t>
             </w:r>
+            <w:proofErr w:type="spellEnd"/>
           </w:p>
         </w:tc>
         <w:tc>
@@ -17069,8 +17396,13 @@
           </w:tcPr>
           <w:p>
             <w:r>
-              <w:t>Authentication, StatusAudit</w:t>
-            </w:r>
+              <w:t xml:space="preserve">Authentication, </w:t>
+            </w:r>
+            <w:proofErr w:type="spellStart"/>
+            <w:r>
+              <w:t>StatusAudit</w:t>
+            </w:r>
+            <w:proofErr w:type="spellEnd"/>
           </w:p>
         </w:tc>
         <w:tc>
@@ -17100,8 +17432,13 @@
             </w:tcMar>
           </w:tcPr>
           <w:p>
-            <w:r>
-              <w:t>Autorisation must be validated for updates.</w:t>
+            <w:proofErr w:type="spellStart"/>
+            <w:r>
+              <w:t>Autorisation</w:t>
+            </w:r>
+            <w:proofErr w:type="spellEnd"/>
+            <w:r>
+              <w:t xml:space="preserve"> must be validated for updates.</w:t>
             </w:r>
           </w:p>
         </w:tc>
@@ -17188,9 +17525,11 @@
             </w:tcMar>
           </w:tcPr>
           <w:p>
+            <w:proofErr w:type="spellStart"/>
             <w:r>
               <w:t>StatusAudit</w:t>
             </w:r>
+            <w:proofErr w:type="spellEnd"/>
           </w:p>
         </w:tc>
         <w:tc>
@@ -17204,8 +17543,13 @@
             </w:tcMar>
           </w:tcPr>
           <w:p>
-            <w:r>
-              <w:t>StatusHistory must be append-only. Actor and timestamp must be included.</w:t>
+            <w:proofErr w:type="spellStart"/>
+            <w:r>
+              <w:t>StatusHistory</w:t>
+            </w:r>
+            <w:proofErr w:type="spellEnd"/>
+            <w:r>
+              <w:t xml:space="preserve"> must be append-only. Actor and timestamp must be included.</w:t>
             </w:r>
           </w:p>
         </w:tc>
@@ -17308,9 +17652,11 @@
             </w:tcMar>
           </w:tcPr>
           <w:p>
+            <w:proofErr w:type="spellStart"/>
             <w:r>
               <w:t>StatusAudit</w:t>
             </w:r>
+            <w:proofErr w:type="spellEnd"/>
           </w:p>
         </w:tc>
         <w:tc>
@@ -17429,8 +17775,13 @@
           </w:tcPr>
           <w:p>
             <w:r>
-              <w:t>Assignment, StatusAudit</w:t>
-            </w:r>
+              <w:t xml:space="preserve">Assignment, </w:t>
+            </w:r>
+            <w:proofErr w:type="spellStart"/>
+            <w:r>
+              <w:t>StatusAudit</w:t>
+            </w:r>
+            <w:proofErr w:type="spellEnd"/>
           </w:p>
         </w:tc>
         <w:tc>
@@ -17445,7 +17796,15 @@
           </w:tcPr>
           <w:p>
             <w:r>
-              <w:t>Requires a change in status, and possibly change in assignment.</w:t>
+              <w:t xml:space="preserve">Requires a change in </w:t>
+            </w:r>
+            <w:proofErr w:type="gramStart"/>
+            <w:r>
+              <w:t>status, and</w:t>
+            </w:r>
+            <w:proofErr w:type="gramEnd"/>
+            <w:r>
+              <w:t xml:space="preserve"> possibly change in assignment.</w:t>
             </w:r>
           </w:p>
         </w:tc>
@@ -17584,7 +17943,15 @@
           </w:tcPr>
           <w:p>
             <w:r>
-              <w:t>While using the same quey path, it will have different scope, meaning its not just a duplication of previous code.</w:t>
+              <w:t xml:space="preserve">While using the same quey path, it will have different scope, meaning </w:t>
+            </w:r>
+            <w:proofErr w:type="spellStart"/>
+            <w:r>
+              <w:t>its</w:t>
+            </w:r>
+            <w:proofErr w:type="spellEnd"/>
+            <w:r>
+              <w:t xml:space="preserve"> not just a duplication of previous code.</w:t>
             </w:r>
           </w:p>
         </w:tc>
@@ -17688,7 +18055,17 @@
           </w:tcPr>
           <w:p>
             <w:r>
-              <w:t>Time will be derived from the timestamp, an will not be stored on its own.</w:t>
+              <w:t xml:space="preserve">Time will be derived from the timestamp, </w:t>
+            </w:r>
+            <w:proofErr w:type="spellStart"/>
+            <w:proofErr w:type="gramStart"/>
+            <w:r>
+              <w:t>an</w:t>
+            </w:r>
+            <w:proofErr w:type="spellEnd"/>
+            <w:proofErr w:type="gramEnd"/>
+            <w:r>
+              <w:t xml:space="preserve"> will not be stored on its own.</w:t>
             </w:r>
           </w:p>
         </w:tc>
@@ -17847,7 +18224,15 @@
           </w:tcPr>
           <w:p>
             <w:r>
-              <w:t>Collects over time as the StatusHistory gains more data.</w:t>
+              <w:t xml:space="preserve">Collects over time as the </w:t>
+            </w:r>
+            <w:proofErr w:type="spellStart"/>
+            <w:r>
+              <w:t>StatusHistory</w:t>
+            </w:r>
+            <w:proofErr w:type="spellEnd"/>
+            <w:r>
+              <w:t xml:space="preserve"> gains more data.</w:t>
             </w:r>
           </w:p>
         </w:tc>
@@ -17863,8 +18248,29 @@
           </w:tcPr>
           <w:p>
             <w:r>
-              <w:t>This will be a on-demand report, no a live dashboard such as from PowerBI</w:t>
-            </w:r>
+              <w:t xml:space="preserve">This will be </w:t>
+            </w:r>
+            <w:proofErr w:type="spellStart"/>
+            <w:r>
+              <w:t>a</w:t>
+            </w:r>
+            <w:proofErr w:type="spellEnd"/>
+            <w:r>
+              <w:t xml:space="preserve"> on-demand report, </w:t>
+            </w:r>
+            <w:proofErr w:type="gramStart"/>
+            <w:r>
+              <w:t>no</w:t>
+            </w:r>
+            <w:proofErr w:type="gramEnd"/>
+            <w:r>
+              <w:t xml:space="preserve"> a live dashboard such as from </w:t>
+            </w:r>
+            <w:proofErr w:type="spellStart"/>
+            <w:r>
+              <w:t>PowerBI</w:t>
+            </w:r>
+            <w:proofErr w:type="spellEnd"/>
           </w:p>
         </w:tc>
         <w:tc>
@@ -18079,9 +18485,11 @@
             <w:r>
               <w:t xml:space="preserve">Authorisation, </w:t>
             </w:r>
+            <w:proofErr w:type="spellStart"/>
             <w:r>
               <w:t>DataAccess</w:t>
             </w:r>
+            <w:proofErr w:type="spellEnd"/>
           </w:p>
         </w:tc>
         <w:tc>
@@ -18196,9 +18604,11 @@
             </w:tcMar>
           </w:tcPr>
           <w:p>
+            <w:proofErr w:type="spellStart"/>
             <w:r>
               <w:t>StatusAudit</w:t>
             </w:r>
+            <w:proofErr w:type="spellEnd"/>
           </w:p>
         </w:tc>
         <w:tc>
@@ -18313,9 +18723,11 @@
             </w:tcMar>
           </w:tcPr>
           <w:p>
+            <w:proofErr w:type="spellStart"/>
             <w:r>
               <w:t>RequestQuery</w:t>
             </w:r>
+            <w:proofErr w:type="spellEnd"/>
           </w:p>
         </w:tc>
         <w:tc>
@@ -18346,7 +18758,15 @@
           </w:tcPr>
           <w:p>
             <w:r>
-              <w:t>Pagination becomes a necessity when considering  the scale of data that can be gathered over 5 years</w:t>
+              <w:t xml:space="preserve">Pagination becomes a necessity when </w:t>
+            </w:r>
+            <w:proofErr w:type="gramStart"/>
+            <w:r>
+              <w:t>considering  the</w:t>
+            </w:r>
+            <w:proofErr w:type="gramEnd"/>
+            <w:r>
+              <w:t xml:space="preserve"> scale of data that can be gathered over 5 years</w:t>
             </w:r>
           </w:p>
         </w:tc>
@@ -18383,7 +18803,15 @@
           </w:p>
           <w:p>
             <w:r>
-              <w:t>D-004 (Defered)</w:t>
+              <w:t>D-004 (</w:t>
+            </w:r>
+            <w:proofErr w:type="spellStart"/>
+            <w:r>
+              <w:t>Defered</w:t>
+            </w:r>
+            <w:proofErr w:type="spellEnd"/>
+            <w:r>
+              <w:t>)</w:t>
             </w:r>
           </w:p>
         </w:tc>
@@ -18500,7 +18928,15 @@
           </w:tcPr>
           <w:p>
             <w:r>
-              <w:t>D-005 (Defered)</w:t>
+              <w:t>D-005 (</w:t>
+            </w:r>
+            <w:proofErr w:type="spellStart"/>
+            <w:r>
+              <w:t>Defered</w:t>
+            </w:r>
+            <w:proofErr w:type="spellEnd"/>
+            <w:r>
+              <w:t>)</w:t>
             </w:r>
           </w:p>
         </w:tc>
@@ -18552,8 +18988,13 @@
             </w:tcMar>
           </w:tcPr>
           <w:p>
-            <w:r>
-              <w:t>DataAccess, Deployment</w:t>
+            <w:proofErr w:type="spellStart"/>
+            <w:r>
+              <w:t>DataAccess</w:t>
+            </w:r>
+            <w:proofErr w:type="spellEnd"/>
+            <w:r>
+              <w:t>, Deployment</w:t>
             </w:r>
           </w:p>
         </w:tc>
@@ -18819,7 +19260,17 @@
           </w:tcPr>
           <w:p>
             <w:r>
-              <w:t>Error message must return a explanation, not a generic failure.</w:t>
+              <w:t xml:space="preserve">Error message must return </w:t>
+            </w:r>
+            <w:proofErr w:type="spellStart"/>
+            <w:proofErr w:type="gramStart"/>
+            <w:r>
+              <w:t>a</w:t>
+            </w:r>
+            <w:proofErr w:type="spellEnd"/>
+            <w:proofErr w:type="gramEnd"/>
+            <w:r>
+              <w:t xml:space="preserve"> explanation, not a generic failure.</w:t>
             </w:r>
           </w:p>
         </w:tc>
@@ -20302,7 +20753,15 @@
           </w:tcPr>
           <w:p>
             <w:r>
-              <w:t>This is one of the core problems described in the CivicConnect business need; unconstrained submission would reproduce it.</w:t>
+              <w:t xml:space="preserve">This is one of the core problems described in the </w:t>
+            </w:r>
+            <w:proofErr w:type="spellStart"/>
+            <w:r>
+              <w:t>CivicConnect</w:t>
+            </w:r>
+            <w:proofErr w:type="spellEnd"/>
+            <w:r>
+              <w:t xml:space="preserve"> business need; unconstrained submission would reproduce it.</w:t>
             </w:r>
           </w:p>
         </w:tc>
@@ -20802,7 +21261,15 @@
           </w:tcPr>
           <w:p>
             <w:r>
-              <w:t>Free-text categorisation reproduces the exact fragmentation problem CivicConnect is meant to solve; late taxonomy changes ripple through requirements, data and reports.</w:t>
+              <w:t xml:space="preserve">Free-text categorisation reproduces the exact fragmentation problem </w:t>
+            </w:r>
+            <w:proofErr w:type="spellStart"/>
+            <w:r>
+              <w:t>CivicConnect</w:t>
+            </w:r>
+            <w:proofErr w:type="spellEnd"/>
+            <w:r>
+              <w:t xml:space="preserve"> is meant to solve; late taxonomy changes ripple through requirements, data and reports.</w:t>
             </w:r>
           </w:p>
         </w:tc>
@@ -20852,7 +21319,15 @@
           </w:tcPr>
           <w:p>
             <w:r>
-              <w:t>The business need explicitly names 'weak accountability for changes to request status' as a current problem; the data model must capture who changed what and when from the outset.</w:t>
+              <w:t xml:space="preserve">The business </w:t>
+            </w:r>
+            <w:proofErr w:type="gramStart"/>
+            <w:r>
+              <w:t>need</w:t>
+            </w:r>
+            <w:proofErr w:type="gramEnd"/>
+            <w:r>
+              <w:t xml:space="preserve"> explicitly names 'weak accountability for changes to request status' as a current problem; the data model must capture who changed what and when from the outset.</w:t>
             </w:r>
           </w:p>
         </w:tc>
@@ -21544,8 +22019,13 @@
             </w:tcMar>
           </w:tcPr>
           <w:p>
-            <w:r>
-              <w:t>CivicConnect requires a shared vocabulary for request types to enable consistent submission, staff triage and management reporting.</w:t>
+            <w:proofErr w:type="spellStart"/>
+            <w:r>
+              <w:t>CivicConnect</w:t>
+            </w:r>
+            <w:proofErr w:type="spellEnd"/>
+            <w:r>
+              <w:t xml:space="preserve"> requires a shared vocabulary for request types to enable consistent submission, staff triage and management reporting.</w:t>
             </w:r>
           </w:p>
         </w:tc>
@@ -21593,7 +22073,15 @@
           </w:tcPr>
           <w:p>
             <w:r>
-              <w:t>Adopt (c): a fixed controlled list with a staff-reclassifiable 'Other' category.</w:t>
+              <w:t>Adopt (c): a fixed controlled list with a staff-</w:t>
+            </w:r>
+            <w:proofErr w:type="spellStart"/>
+            <w:r>
+              <w:t>reclassifiable</w:t>
+            </w:r>
+            <w:proofErr w:type="spellEnd"/>
+            <w:r>
+              <w:t xml:space="preserve"> 'Other' category.</w:t>
             </w:r>
           </w:p>
         </w:tc>
@@ -21749,11 +22237,27 @@
           <w:p>
             <w:r>
               <w:lastRenderedPageBreak/>
-              <w:t xml:space="preserve">(a) Store only current status; </w:t>
+              <w:t xml:space="preserve">(a) Store only </w:t>
+            </w:r>
+            <w:proofErr w:type="gramStart"/>
+            <w:r>
+              <w:t>current status</w:t>
+            </w:r>
+            <w:proofErr w:type="gramEnd"/>
+            <w:r>
+              <w:t xml:space="preserve">; </w:t>
             </w:r>
             <w:r>
               <w:lastRenderedPageBreak/>
-              <w:t>(b) Store current status plus a full append-only status-change history.</w:t>
+              <w:t xml:space="preserve">(b) Store </w:t>
+            </w:r>
+            <w:proofErr w:type="gramStart"/>
+            <w:r>
+              <w:t>current status</w:t>
+            </w:r>
+            <w:proofErr w:type="gramEnd"/>
+            <w:r>
+              <w:t xml:space="preserve"> plus a full append-only status-change history.</w:t>
             </w:r>
           </w:p>
         </w:tc>
@@ -22076,7 +22580,15 @@
           </w:tcPr>
           <w:p>
             <w:r>
-              <w:t>Technology-stack selection for CivicConnect.</w:t>
+              <w:t xml:space="preserve">Technology-stack selection for </w:t>
+            </w:r>
+            <w:proofErr w:type="spellStart"/>
+            <w:r>
+              <w:t>CivicConnect</w:t>
+            </w:r>
+            <w:proofErr w:type="spellEnd"/>
+            <w:r>
+              <w:t>.</w:t>
             </w:r>
           </w:p>
         </w:tc>
@@ -22092,7 +22604,15 @@
           </w:tcPr>
           <w:p>
             <w:r>
-              <w:t>Not applicable at this time.</w:t>
+              <w:t xml:space="preserve">Not applicable </w:t>
+            </w:r>
+            <w:proofErr w:type="gramStart"/>
+            <w:r>
+              <w:t>at this time</w:t>
+            </w:r>
+            <w:proofErr w:type="gramEnd"/>
+            <w:r>
+              <w:t>.</w:t>
             </w:r>
           </w:p>
         </w:tc>
@@ -22108,7 +22628,15 @@
           </w:tcPr>
           <w:p>
             <w:r>
-              <w:t>Not applicable at this time.</w:t>
+              <w:t xml:space="preserve">Not applicable </w:t>
+            </w:r>
+            <w:proofErr w:type="gramStart"/>
+            <w:r>
+              <w:t>at this time</w:t>
+            </w:r>
+            <w:proofErr w:type="gramEnd"/>
+            <w:r>
+              <w:t>.</w:t>
             </w:r>
           </w:p>
         </w:tc>
@@ -22161,7 +22689,15 @@
           <w:p>
             <w:r>
               <w:lastRenderedPageBreak/>
-              <w:t>Not applicable at this time.</w:t>
+              <w:t xml:space="preserve">Not applicable </w:t>
+            </w:r>
+            <w:proofErr w:type="gramStart"/>
+            <w:r>
+              <w:t>at this time</w:t>
+            </w:r>
+            <w:proofErr w:type="gramEnd"/>
+            <w:r>
+              <w:t>.</w:t>
             </w:r>
           </w:p>
         </w:tc>
@@ -22204,7 +22740,15 @@
           <w:p>
             <w:r>
               <w:lastRenderedPageBreak/>
-              <w:t>Not applicable at this time.</w:t>
+              <w:t xml:space="preserve">Not applicable </w:t>
+            </w:r>
+            <w:proofErr w:type="gramStart"/>
+            <w:r>
+              <w:t>at this time</w:t>
+            </w:r>
+            <w:proofErr w:type="gramEnd"/>
+            <w:r>
+              <w:t>.</w:t>
             </w:r>
           </w:p>
         </w:tc>
@@ -22220,7 +22764,15 @@
           </w:tcPr>
           <w:p>
             <w:r>
-              <w:t>Not applicable at this time.</w:t>
+              <w:t xml:space="preserve">Not applicable </w:t>
+            </w:r>
+            <w:proofErr w:type="gramStart"/>
+            <w:r>
+              <w:t>at this time</w:t>
+            </w:r>
+            <w:proofErr w:type="gramEnd"/>
+            <w:r>
+              <w:t>.</w:t>
             </w:r>
           </w:p>
         </w:tc>
@@ -22270,7 +22822,15 @@
           </w:tcPr>
           <w:p>
             <w:r>
-              <w:t>Not applicable at this time.</w:t>
+              <w:t xml:space="preserve">Not applicable </w:t>
+            </w:r>
+            <w:proofErr w:type="gramStart"/>
+            <w:r>
+              <w:t>at this time</w:t>
+            </w:r>
+            <w:proofErr w:type="gramEnd"/>
+            <w:r>
+              <w:t>.</w:t>
             </w:r>
           </w:p>
         </w:tc>
@@ -22286,7 +22846,15 @@
           </w:tcPr>
           <w:p>
             <w:r>
-              <w:t>Not applicable at this time.</w:t>
+              <w:t xml:space="preserve">Not applicable </w:t>
+            </w:r>
+            <w:proofErr w:type="gramStart"/>
+            <w:r>
+              <w:t>at this time</w:t>
+            </w:r>
+            <w:proofErr w:type="gramEnd"/>
+            <w:r>
+              <w:t>.</w:t>
             </w:r>
           </w:p>
         </w:tc>
@@ -22334,7 +22902,15 @@
           </w:tcPr>
           <w:p>
             <w:r>
-              <w:t>Not applicable at this time.</w:t>
+              <w:t xml:space="preserve">Not applicable </w:t>
+            </w:r>
+            <w:proofErr w:type="gramStart"/>
+            <w:r>
+              <w:t>at this time</w:t>
+            </w:r>
+            <w:proofErr w:type="gramEnd"/>
+            <w:r>
+              <w:t>.</w:t>
             </w:r>
           </w:p>
         </w:tc>
@@ -22366,7 +22942,15 @@
           </w:tcPr>
           <w:p>
             <w:r>
-              <w:t>Not applicable at this time.</w:t>
+              <w:t xml:space="preserve">Not applicable </w:t>
+            </w:r>
+            <w:proofErr w:type="gramStart"/>
+            <w:r>
+              <w:t>at this time</w:t>
+            </w:r>
+            <w:proofErr w:type="gramEnd"/>
+            <w:r>
+              <w:t>.</w:t>
             </w:r>
           </w:p>
         </w:tc>
@@ -22382,7 +22966,212 @@
           </w:tcPr>
           <w:p>
             <w:r>
-              <w:t>Not applicable at this time.</w:t>
+              <w:t xml:space="preserve">Not applicable </w:t>
+            </w:r>
+            <w:proofErr w:type="gramStart"/>
+            <w:r>
+              <w:t>at this time</w:t>
+            </w:r>
+            <w:proofErr w:type="gramEnd"/>
+            <w:r>
+              <w:t>.</w:t>
+            </w:r>
+          </w:p>
+        </w:tc>
+      </w:tr>
+      <w:tr>
+        <w:tc>
+          <w:tcPr>
+            <w:tcW w:w="1020" w:type="dxa"/>
+            <w:tcMar>
+              <w:top w:w="80" w:type="dxa"/>
+              <w:left w:w="100" w:type="dxa"/>
+              <w:bottom w:w="80" w:type="dxa"/>
+              <w:right w:w="100" w:type="dxa"/>
+            </w:tcMar>
+          </w:tcPr>
+          <w:p>
+            <w:r>
+              <w:t>D-006</w:t>
+            </w:r>
+          </w:p>
+        </w:tc>
+        <w:tc>
+          <w:tcPr>
+            <w:tcW w:w="1543" w:type="dxa"/>
+            <w:tcMar>
+              <w:top w:w="80" w:type="dxa"/>
+              <w:left w:w="100" w:type="dxa"/>
+              <w:bottom w:w="80" w:type="dxa"/>
+              <w:right w:w="100" w:type="dxa"/>
+            </w:tcMar>
+          </w:tcPr>
+          <w:p>
+            <w:proofErr w:type="spellStart"/>
+            <w:r>
+              <w:t>CivicConnect</w:t>
+            </w:r>
+            <w:proofErr w:type="spellEnd"/>
+            <w:r>
+              <w:t xml:space="preserve"> needs an architecture that enforces </w:t>
+            </w:r>
+            <w:proofErr w:type="spellStart"/>
+            <w:r>
+              <w:t>auitable</w:t>
+            </w:r>
+            <w:proofErr w:type="spellEnd"/>
+            <w:r>
+              <w:t xml:space="preserve"> status changes, and that applies </w:t>
+            </w:r>
+            <w:proofErr w:type="spellStart"/>
+            <w:r>
+              <w:t>autorisation</w:t>
+            </w:r>
+            <w:proofErr w:type="spellEnd"/>
+            <w:r>
+              <w:t xml:space="preserve"> consistently across queries. All this must be done withing the free-tier service constraint</w:t>
+            </w:r>
+          </w:p>
+        </w:tc>
+        <w:tc>
+          <w:tcPr>
+            <w:tcW w:w="1123" w:type="dxa"/>
+            <w:tcMar>
+              <w:top w:w="80" w:type="dxa"/>
+              <w:left w:w="100" w:type="dxa"/>
+              <w:bottom w:w="80" w:type="dxa"/>
+              <w:right w:w="100" w:type="dxa"/>
+            </w:tcMar>
+          </w:tcPr>
+          <w:p>
+            <w:r>
+              <w:t xml:space="preserve">The cost constraint, as the services must be free. It needs browser-based </w:t>
+            </w:r>
+            <w:r>
+              <w:t>access and</w:t>
+            </w:r>
+            <w:r>
+              <w:t xml:space="preserve"> be buildable and maintainable by a 3-person team.</w:t>
+            </w:r>
+          </w:p>
+        </w:tc>
+        <w:tc>
+          <w:tcPr>
+            <w:tcW w:w="992" w:type="dxa"/>
+            <w:tcMar>
+              <w:top w:w="80" w:type="dxa"/>
+              <w:left w:w="100" w:type="dxa"/>
+              <w:bottom w:w="80" w:type="dxa"/>
+              <w:right w:w="100" w:type="dxa"/>
+            </w:tcMar>
+          </w:tcPr>
+          <w:p>
+            <w:r>
+              <w:t>A server-rendered application without API’s (option A), Layered modular monolith (option B), or distributed services (option C)</w:t>
+            </w:r>
+          </w:p>
+        </w:tc>
+        <w:tc>
+          <w:tcPr>
+            <w:tcW w:w="993" w:type="dxa"/>
+            <w:tcMar>
+              <w:top w:w="80" w:type="dxa"/>
+              <w:left w:w="100" w:type="dxa"/>
+              <w:bottom w:w="80" w:type="dxa"/>
+              <w:right w:w="100" w:type="dxa"/>
+            </w:tcMar>
+          </w:tcPr>
+          <w:p>
+            <w:r>
+              <w:t>Option B, a layered modular monolith application using React, typescript and a SPA client over Laravel.</w:t>
+            </w:r>
+          </w:p>
+        </w:tc>
+        <w:tc>
+          <w:tcPr>
+            <w:tcW w:w="1367" w:type="dxa"/>
+            <w:tcMar>
+              <w:top w:w="80" w:type="dxa"/>
+              <w:left w:w="100" w:type="dxa"/>
+              <w:bottom w:w="80" w:type="dxa"/>
+              <w:right w:w="100" w:type="dxa"/>
+            </w:tcMar>
+          </w:tcPr>
+          <w:p>
+            <w:r>
+              <w:t xml:space="preserve">Detailed justification and reasoning </w:t>
+            </w:r>
+            <w:proofErr w:type="gramStart"/>
+            <w:r>
+              <w:t>is</w:t>
+            </w:r>
+            <w:proofErr w:type="gramEnd"/>
+            <w:r>
+              <w:t xml:space="preserve"> in section 13.1.3.</w:t>
+            </w:r>
+          </w:p>
+        </w:tc>
+        <w:tc>
+          <w:tcPr>
+            <w:tcW w:w="1042" w:type="dxa"/>
+            <w:tcMar>
+              <w:top w:w="80" w:type="dxa"/>
+              <w:left w:w="100" w:type="dxa"/>
+              <w:bottom w:w="80" w:type="dxa"/>
+              <w:right w:w="100" w:type="dxa"/>
+            </w:tcMar>
+          </w:tcPr>
+          <w:p>
+            <w:r>
+              <w:t>A boundary created between the browser and the API’s.</w:t>
+            </w:r>
+          </w:p>
+        </w:tc>
+        <w:tc>
+          <w:tcPr>
+            <w:tcW w:w="1134" w:type="dxa"/>
+            <w:tcMar>
+              <w:top w:w="80" w:type="dxa"/>
+              <w:left w:w="100" w:type="dxa"/>
+              <w:bottom w:w="80" w:type="dxa"/>
+              <w:right w:w="100" w:type="dxa"/>
+            </w:tcMar>
+          </w:tcPr>
+          <w:p>
+            <w:r>
+              <w:t>R-001 and R005, the boundaries may erode under the pressure of the project’s schedule.</w:t>
+            </w:r>
+          </w:p>
+        </w:tc>
+        <w:tc>
+          <w:tcPr>
+            <w:tcW w:w="993" w:type="dxa"/>
+            <w:tcMar>
+              <w:top w:w="80" w:type="dxa"/>
+              <w:left w:w="100" w:type="dxa"/>
+              <w:bottom w:w="80" w:type="dxa"/>
+              <w:right w:w="100" w:type="dxa"/>
+            </w:tcMar>
+          </w:tcPr>
+          <w:p>
+            <w:r>
+              <w:t>Section 8 considerations 3 and 5, D-002, FR-013, FR-019, section 5’s cost constraint, and the business needs in section 1.1.</w:t>
+            </w:r>
+          </w:p>
+        </w:tc>
+        <w:tc>
+          <w:tcPr>
+            <w:tcW w:w="1134" w:type="dxa"/>
+            <w:tcMar>
+              <w:top w:w="80" w:type="dxa"/>
+              <w:left w:w="100" w:type="dxa"/>
+              <w:bottom w:w="80" w:type="dxa"/>
+              <w:right w:w="100" w:type="dxa"/>
+            </w:tcMar>
+          </w:tcPr>
+          <w:p>
+            <w:r>
+              <w:t>Influences the repository structure, component names, deployment and the layering.</w:t>
             </w:r>
           </w:p>
         </w:tc>
@@ -22680,7 +23469,20 @@
           </w:tcPr>
           <w:p>
             <w:r>
-              <w:t>Secrets/credentials policy in place (.gitignore, no committed keys)</w:t>
+              <w:t xml:space="preserve">Secrets/credentials policy in place </w:t>
+            </w:r>
+            <w:proofErr w:type="gramStart"/>
+            <w:r>
+              <w:t>(.</w:t>
+            </w:r>
+            <w:proofErr w:type="spellStart"/>
+            <w:r>
+              <w:t>gitignore</w:t>
+            </w:r>
+            <w:proofErr w:type="spellEnd"/>
+            <w:proofErr w:type="gramEnd"/>
+            <w:r>
+              <w:t>, no committed keys)</w:t>
             </w:r>
           </w:p>
         </w:tc>
@@ -23485,7 +24287,15 @@
           </w:tcPr>
           <w:p>
             <w:r>
-              <w:t>Not all of the explanations were relevant to the project</w:t>
+              <w:t xml:space="preserve">Not </w:t>
+            </w:r>
+            <w:proofErr w:type="gramStart"/>
+            <w:r>
+              <w:t>all of</w:t>
+            </w:r>
+            <w:proofErr w:type="gramEnd"/>
+            <w:r>
+              <w:t xml:space="preserve"> the explanations were relevant to the project</w:t>
             </w:r>
           </w:p>
         </w:tc>
@@ -23566,7 +24376,21 @@
               <w:rPr>
                 <w:i/>
               </w:rPr>
-              <w:t>Checked every table's required fields against the Milestone 1 Brief §3 and Master Brief §§9–13 field-by-field</w:t>
+              <w:t xml:space="preserve">Checked every table's required </w:t>
+            </w:r>
+            <w:proofErr w:type="gramStart"/>
+            <w:r>
+              <w:rPr>
+                <w:i/>
+              </w:rPr>
+              <w:t>fields</w:t>
+            </w:r>
+            <w:proofErr w:type="gramEnd"/>
+            <w:r>
+              <w:rPr>
+                <w:i/>
+              </w:rPr>
+              <w:t xml:space="preserve"> against the Milestone 1 Brief §3 and Master Brief §§9–13 field-by-field</w:t>
             </w:r>
           </w:p>
         </w:tc>
@@ -23683,7 +24507,21 @@
               <w:rPr>
                 <w:i/>
               </w:rPr>
-              <w:t>Drafted CivicConnect-specific constraint implications, 7 project risks, 6 forward-engineering concerns and 5 decision-log entries</w:t>
+              <w:t xml:space="preserve">Drafted </w:t>
+            </w:r>
+            <w:proofErr w:type="spellStart"/>
+            <w:r>
+              <w:rPr>
+                <w:i/>
+              </w:rPr>
+              <w:t>CivicConnect</w:t>
+            </w:r>
+            <w:proofErr w:type="spellEnd"/>
+            <w:r>
+              <w:rPr>
+                <w:i/>
+              </w:rPr>
+              <w:t>-specific constraint implications, 7 project risks, 6 forward-engineering concerns and 5 decision-log entries</w:t>
             </w:r>
           </w:p>
         </w:tc>
@@ -23696,7 +24534,21 @@
               <w:rPr>
                 <w:i/>
               </w:rPr>
-              <w:t>Cross-checked every claim against the CivicConnect Master Project Brief and Milestone 1 Brief sections cited inline (e.g. §2, §3, §9, §18.1); reviewed with Michael before merging</w:t>
+              <w:t xml:space="preserve">Cross-checked every claim against the </w:t>
+            </w:r>
+            <w:proofErr w:type="spellStart"/>
+            <w:r>
+              <w:rPr>
+                <w:i/>
+              </w:rPr>
+              <w:t>CivicConnect</w:t>
+            </w:r>
+            <w:proofErr w:type="spellEnd"/>
+            <w:r>
+              <w:rPr>
+                <w:i/>
+              </w:rPr>
+              <w:t xml:space="preserve"> Master Project Brief and Milestone 1 Brief sections cited inline (e.g. §2, §3, §9, §18.1); reviewed with Michael before merging</w:t>
             </w:r>
           </w:p>
         </w:tc>
@@ -24169,9 +25021,11 @@
             </w:tcMar>
           </w:tcPr>
           <w:p>
+            <w:proofErr w:type="spellStart"/>
             <w:r>
               <w:t>StatusAudit</w:t>
             </w:r>
+            <w:proofErr w:type="spellEnd"/>
           </w:p>
         </w:tc>
         <w:tc>
@@ -24261,9 +25115,11 @@
             </w:tcMar>
           </w:tcPr>
           <w:p>
+            <w:proofErr w:type="spellStart"/>
             <w:r>
               <w:t>RequestQuery</w:t>
             </w:r>
+            <w:proofErr w:type="spellEnd"/>
           </w:p>
         </w:tc>
         <w:tc>
@@ -24762,7 +25618,15 @@
           </w:tcPr>
           <w:p>
             <w:r>
-              <w:t>Uses React and TypeScript, with a client over Laravel API’s. It has only one deployable, and modules are logical boundaries.</w:t>
+              <w:t xml:space="preserve">Uses React and TypeScript, with a client over Laravel </w:t>
+            </w:r>
+            <w:proofErr w:type="gramStart"/>
+            <w:r>
+              <w:t>API’s</w:t>
+            </w:r>
+            <w:proofErr w:type="gramEnd"/>
+            <w:r>
+              <w:t>. It has only one deployable, and modules are logical boundaries.</w:t>
             </w:r>
           </w:p>
         </w:tc>
@@ -24778,7 +25642,15 @@
           </w:tcPr>
           <w:p>
             <w:r>
-              <w:t>ASR-2, as the transaction and authorisation is confined to one layer, allowing D-002 to be easily enforceable. ASR-3 as stale writes are rejected. ASR-006 as there will only be one web processor and one database</w:t>
+              <w:t xml:space="preserve">ASR-2, as the transaction and authorisation </w:t>
+            </w:r>
+            <w:proofErr w:type="gramStart"/>
+            <w:r>
+              <w:t>is</w:t>
+            </w:r>
+            <w:proofErr w:type="gramEnd"/>
+            <w:r>
+              <w:t xml:space="preserve"> confined to one layer, allowing D-002 to be easily enforceable. ASR-3 as stale writes are rejected. ASR-006 as there will only be one web processor and one database</w:t>
             </w:r>
           </w:p>
         </w:tc>
@@ -24849,7 +25721,15 @@
           </w:tcPr>
           <w:p>
             <w:r>
-              <w:t>Separate deployables for requests, notifications, reporting and identification.</w:t>
+              <w:t xml:space="preserve">Separate </w:t>
+            </w:r>
+            <w:proofErr w:type="spellStart"/>
+            <w:r>
+              <w:t>deployables</w:t>
+            </w:r>
+            <w:proofErr w:type="spellEnd"/>
+            <w:r>
+              <w:t xml:space="preserve"> for requests, notifications, reporting and identification.</w:t>
             </w:r>
           </w:p>
         </w:tc>
@@ -24865,7 +25745,15 @@
           </w:tcPr>
           <w:p>
             <w:r>
-              <w:t>No ASR is better supported through the use of this option</w:t>
+              <w:t xml:space="preserve">No ASR is better supported </w:t>
+            </w:r>
+            <w:proofErr w:type="gramStart"/>
+            <w:r>
+              <w:t>through the use of</w:t>
+            </w:r>
+            <w:proofErr w:type="gramEnd"/>
+            <w:r>
+              <w:t xml:space="preserve"> this option</w:t>
             </w:r>
           </w:p>
         </w:tc>
@@ -24881,7 +25769,15 @@
           </w:tcPr>
           <w:p>
             <w:r>
-              <w:t>ASR-006, as the deployables will quickly exceed the free-tier services. ASR-002 and ASR-003 as the transaction becomes distributed, causing it to become difficult to adhere to these ASR’s.</w:t>
+              <w:t xml:space="preserve">ASR-006, as the </w:t>
+            </w:r>
+            <w:proofErr w:type="spellStart"/>
+            <w:r>
+              <w:t>deployables</w:t>
+            </w:r>
+            <w:proofErr w:type="spellEnd"/>
+            <w:r>
+              <w:t xml:space="preserve"> will quickly exceed the free-tier services. ASR-002 and ASR-003 as the transaction becomes distributed, causing it to become difficult to adhere to these ASR’s.</w:t>
             </w:r>
           </w:p>
         </w:tc>
@@ -24925,7 +25821,15 @@
         <w:spacing w:after="160"/>
       </w:pPr>
       <w:r>
-        <w:t>The CovicConnect application will adopt option B, a layered modular monolithic architecture, with a single-page application client.</w:t>
+        <w:t xml:space="preserve">The </w:t>
+      </w:r>
+      <w:proofErr w:type="spellStart"/>
+      <w:r>
+        <w:t>CovicConnect</w:t>
+      </w:r>
+      <w:proofErr w:type="spellEnd"/>
+      <w:r>
+        <w:t xml:space="preserve"> application will adopt option B, a layered modular monolithic architecture, with a single-page application client.</w:t>
       </w:r>
     </w:p>
     <w:p>
@@ -24941,7 +25845,25 @@
         <w:spacing w:after="160"/>
       </w:pPr>
       <w:r>
-        <w:t>This is further reinforced by access control. FR-013 will permit staff to search, filter and sort relatively freely, and there wont be a simple screen at which permissions are checked. Rather, the authorisation layer will have an API to apply limitations to what can be read and written.</w:t>
+        <w:t xml:space="preserve">This is further reinforced by access control. FR-013 will permit staff to search, filter and sort relatively freely, and </w:t>
+      </w:r>
+      <w:proofErr w:type="gramStart"/>
+      <w:r>
+        <w:t>there</w:t>
+      </w:r>
+      <w:proofErr w:type="gramEnd"/>
+      <w:r>
+        <w:t xml:space="preserve"> </w:t>
+      </w:r>
+      <w:proofErr w:type="spellStart"/>
+      <w:proofErr w:type="gramStart"/>
+      <w:r>
+        <w:t>wont</w:t>
+      </w:r>
+      <w:proofErr w:type="spellEnd"/>
+      <w:proofErr w:type="gramEnd"/>
+      <w:r>
+        <w:t xml:space="preserve"> be a simple screen at which permissions are checked. Rather, the authorisation layer will have an API to apply limitations to what can be read and written.</w:t>
       </w:r>
     </w:p>
     <w:p>
@@ -24957,7 +25879,23 @@
         <w:spacing w:after="160"/>
       </w:pPr>
       <w:r>
-        <w:t>Finally, the cost constraint practically outright rules out Option C. The constraint is that we must use free-tier services, and there are very few sites that offer hosting for multiple deployables. Also, having multiple deployables will very quickly and easily exceed the limits of free-tier services. Furthermore, a more complicated and distributed system does not automatically mean it is more advanced, and there is no requirement that justifies the added complexity.</w:t>
+        <w:t xml:space="preserve">Finally, the cost constraint practically outright rules out Option C. The constraint is that we must use free-tier services, and there are very few sites that offer hosting for multiple </w:t>
+      </w:r>
+      <w:proofErr w:type="spellStart"/>
+      <w:r>
+        <w:t>deployables</w:t>
+      </w:r>
+      <w:proofErr w:type="spellEnd"/>
+      <w:r>
+        <w:t xml:space="preserve">. Also, having multiple </w:t>
+      </w:r>
+      <w:proofErr w:type="spellStart"/>
+      <w:r>
+        <w:t>deployables</w:t>
+      </w:r>
+      <w:proofErr w:type="spellEnd"/>
+      <w:r>
+        <w:t xml:space="preserve"> will very quickly and easily exceed the limits of free-tier services. Furthermore, a more complicated and distributed system does not automatically mean it is more advanced, and there is no requirement that justifies the added complexity.</w:t>
       </w:r>
     </w:p>
     <w:p>
@@ -24965,8 +25903,246 @@
         <w:spacing w:after="160"/>
       </w:pPr>
       <w:r>
-        <w:t>Option B only has one realistic problem that has been found, and that is the network boundary. However this concern will hopefully be adequately addressed in the authentication decisions.</w:t>
+        <w:t xml:space="preserve">Option B only has one realistic problem that has been found, and that is the network boundary. </w:t>
       </w:r>
+      <w:proofErr w:type="gramStart"/>
+      <w:r>
+        <w:t>However</w:t>
+      </w:r>
+      <w:proofErr w:type="gramEnd"/>
+      <w:r>
+        <w:t xml:space="preserve"> this concern will hopefully be adequately addressed in the authentication decisions.</w:t>
+      </w:r>
+    </w:p>
+    <w:p>
+      <w:pPr>
+        <w:spacing w:after="160"/>
+      </w:pPr>
+    </w:p>
+    <w:p>
+      <w:pPr>
+        <w:pStyle w:val="Heading2"/>
+        <w:rPr>
+          <w:sz w:val="24"/>
+          <w:szCs w:val="24"/>
+        </w:rPr>
+      </w:pPr>
+      <w:r>
+        <w:rPr>
+          <w:sz w:val="24"/>
+          <w:szCs w:val="24"/>
+        </w:rPr>
+        <w:t>13.1.4 Physical deployment</w:t>
+      </w:r>
+    </w:p>
+    <w:p>
+      <w:pPr>
+        <w:spacing w:after="160"/>
+      </w:pPr>
+      <w:r>
+        <w:t xml:space="preserve">The components in 13.1.1 are only logical. They are boundaries on responsibility and in the source </w:t>
+      </w:r>
+      <w:proofErr w:type="gramStart"/>
+      <w:r>
+        <w:t>tree, but</w:t>
+      </w:r>
+      <w:proofErr w:type="gramEnd"/>
+      <w:r>
+        <w:t xml:space="preserve"> are not deployed as separate processes. </w:t>
+      </w:r>
+      <w:proofErr w:type="spellStart"/>
+      <w:r>
+        <w:t>CivicConnect</w:t>
+      </w:r>
+      <w:proofErr w:type="spellEnd"/>
+      <w:r>
+        <w:t xml:space="preserve"> rather runs on 4 physical units:</w:t>
+      </w:r>
+    </w:p>
+    <w:p>
+      <w:pPr>
+        <w:pStyle w:val="ListParagraph"/>
+        <w:numPr>
+          <w:ilvl w:val="0"/>
+          <w:numId w:val="4"/>
+        </w:numPr>
+        <w:spacing w:after="160"/>
+      </w:pPr>
+      <w:r>
+        <w:rPr>
+          <w:b/>
+          <w:bCs/>
+        </w:rPr>
+        <w:t>Static front-end</w:t>
+      </w:r>
+      <w:r>
+        <w:t>: this is compiled in react and is used to serve static files to the user.</w:t>
+      </w:r>
+    </w:p>
+    <w:p>
+      <w:pPr>
+        <w:pStyle w:val="ListParagraph"/>
+        <w:numPr>
+          <w:ilvl w:val="0"/>
+          <w:numId w:val="4"/>
+        </w:numPr>
+        <w:spacing w:after="160"/>
+      </w:pPr>
+      <w:r>
+        <w:rPr>
+          <w:b/>
+          <w:bCs/>
+        </w:rPr>
+        <w:t>Back-end web process</w:t>
+      </w:r>
+      <w:r>
+        <w:t xml:space="preserve">: here the 9 logical components will </w:t>
+      </w:r>
+      <w:proofErr w:type="gramStart"/>
+      <w:r>
+        <w:t>reside, and</w:t>
+      </w:r>
+      <w:proofErr w:type="gramEnd"/>
+      <w:r>
+        <w:t xml:space="preserve"> is bundled into one single process.</w:t>
+      </w:r>
+    </w:p>
+    <w:p>
+      <w:pPr>
+        <w:pStyle w:val="ListParagraph"/>
+        <w:numPr>
+          <w:ilvl w:val="0"/>
+          <w:numId w:val="4"/>
+        </w:numPr>
+        <w:spacing w:after="160"/>
+      </w:pPr>
+      <w:r>
+        <w:rPr>
+          <w:b/>
+          <w:bCs/>
+        </w:rPr>
+        <w:t>Queue worker</w:t>
+      </w:r>
+      <w:r>
+        <w:t>:</w:t>
+      </w:r>
+      <w:r>
+        <w:t xml:space="preserve"> here the listeners for the notifications will reside. It will share the same </w:t>
+      </w:r>
+      <w:proofErr w:type="gramStart"/>
+      <w:r>
+        <w:t>codebase, but</w:t>
+      </w:r>
+      <w:proofErr w:type="gramEnd"/>
+      <w:r>
+        <w:t xml:space="preserve"> has separate entry points.</w:t>
+      </w:r>
+    </w:p>
+    <w:p>
+      <w:pPr>
+        <w:pStyle w:val="ListParagraph"/>
+        <w:numPr>
+          <w:ilvl w:val="0"/>
+          <w:numId w:val="4"/>
+        </w:numPr>
+        <w:spacing w:after="160"/>
+      </w:pPr>
+      <w:r>
+        <w:rPr>
+          <w:b/>
+          <w:bCs/>
+        </w:rPr>
+        <w:t>PostgreSQL database</w:t>
+      </w:r>
+      <w:r>
+        <w:t xml:space="preserve">: This is responsible for the persistence of the data, and for the job queueing. While it is a </w:t>
+      </w:r>
+      <w:proofErr w:type="spellStart"/>
+      <w:r>
+        <w:t>signle</w:t>
+      </w:r>
+      <w:proofErr w:type="spellEnd"/>
+      <w:r>
+        <w:t xml:space="preserve"> point of failure (SPOF), this is an accepted risk.</w:t>
+      </w:r>
+    </w:p>
+    <w:p>
+      <w:pPr>
+        <w:rPr>
+          <w:b/>
+          <w:bCs/>
+          <w:color w:val="2E5395"/>
+          <w:sz w:val="23"/>
+          <w:szCs w:val="23"/>
+        </w:rPr>
+      </w:pPr>
+      <w:r>
+        <w:br w:type="page"/>
+      </w:r>
+    </w:p>
+    <w:p>
+      <w:pPr>
+        <w:pStyle w:val="Heading2"/>
+      </w:pPr>
+      <w:r>
+        <w:lastRenderedPageBreak/>
+        <w:t>13.1.5 Architectural diagrams</w:t>
+      </w:r>
+    </w:p>
+    <w:p>
+      <w:pPr>
+        <w:spacing w:after="160"/>
+      </w:pPr>
+      <w:r>
+        <w:t>Below is a diagram explaining on the interactions of the components and the flow of data</w:t>
+      </w:r>
+    </w:p>
+    <w:p>
+      <w:pPr>
+        <w:spacing w:after="160"/>
+      </w:pPr>
+      <w:r>
+        <w:drawing>
+          <wp:inline distT="0" distB="0" distL="0" distR="0" wp14:anchorId="24700190" wp14:editId="77F8BA4A">
+            <wp:extent cx="6858000" cy="7272655"/>
+            <wp:effectExtent l="0" t="0" r="0" b="4445"/>
+            <wp:docPr id="323196180" name="Picture 1"/>
+            <wp:cNvGraphicFramePr>
+              <a:graphicFrameLocks xmlns:a="http://schemas.openxmlformats.org/drawingml/2006/main" noChangeAspect="1"/>
+            </wp:cNvGraphicFramePr>
+            <a:graphic xmlns:a="http://schemas.openxmlformats.org/drawingml/2006/main">
+              <a:graphicData uri="http://schemas.openxmlformats.org/drawingml/2006/picture">
+                <pic:pic xmlns:pic="http://schemas.openxmlformats.org/drawingml/2006/picture">
+                  <pic:nvPicPr>
+                    <pic:cNvPr id="323196180" name=""/>
+                    <pic:cNvPicPr/>
+                  </pic:nvPicPr>
+                  <pic:blipFill>
+                    <a:blip r:embed="rId8"/>
+                    <a:stretch>
+                      <a:fillRect/>
+                    </a:stretch>
+                  </pic:blipFill>
+                  <pic:spPr>
+                    <a:xfrm>
+                      <a:off x="0" y="0"/>
+                      <a:ext cx="6858000" cy="7272655"/>
+                    </a:xfrm>
+                    <a:prstGeom prst="rect">
+                      <a:avLst/>
+                    </a:prstGeom>
+                  </pic:spPr>
+                </pic:pic>
+              </a:graphicData>
+            </a:graphic>
+          </wp:inline>
+        </w:drawing>
+      </w:r>
+    </w:p>
+    <w:p>
+      <w:pPr>
+        <w:spacing w:after="160"/>
+      </w:pPr>
     </w:p>
     <w:p>
       <w:pPr>
@@ -25453,6 +26629,119 @@
 <file path=word/numbering.xml><?xml version="1.0" encoding="utf-8"?>
 <w:numbering xmlns:wpc="http://schemas.microsoft.com/office/word/2010/wordprocessingCanvas" xmlns:cx="http://schemas.microsoft.com/office/drawing/2014/chartex" xmlns:cx1="http://schemas.microsoft.com/office/drawing/2015/9/8/chartex" xmlns:cx2="http://schemas.microsoft.com/office/drawing/2015/10/21/chartex" xmlns:cx3="http://schemas.microsoft.com/office/drawing/2016/5/9/chartex" xmlns:cx4="http://schemas.microsoft.com/office/drawing/2016/5/10/chartex" xmlns:cx5="http://schemas.microsoft.com/office/drawing/2016/5/11/chartex" xmlns:cx6="http://schemas.microsoft.com/office/drawing/2016/5/12/chartex" xmlns:cx7="http://schemas.microsoft.com/office/drawing/2016/5/13/chartex" xmlns:cx8="http://schemas.microsoft.com/office/drawing/2016/5/14/chartex" xmlns:mc="http://schemas.openxmlformats.org/markup-compatibility/2006" xmlns:aink="http://schemas.microsoft.com/office/drawing/2016/ink" xmlns:am3d="http://schemas.microsoft.com/office/drawing/2017/model3d" xmlns:o="urn:schemas-microsoft-com:office:office" xmlns:oel="http://schemas.microsoft.com/office/2019/extlst" xmlns:r="http://schemas.openxmlformats.org/officeDocument/2006/relationships" xmlns:m="http://schemas.openxmlformats.org/officeDocument/2006/math" xmlns:v="urn:schemas-microsoft-com:vml" xmlns:wp14="http://schemas.microsoft.com/office/word/2010/wordprocessingDrawing" xmlns:wp="http://schemas.openxmlformats.org/drawingml/2006/wordprocessingDrawing" xmlns:w10="urn:schemas-microsoft-com:office:word" xmlns:w="http://schemas.openxmlformats.org/wordprocessingml/2006/main" xmlns:w14="http://schemas.microsoft.com/office/word/2010/wordml" xmlns:w15="http://schemas.microsoft.com/office/word/2012/wordml" xmlns:w16cex="http://schemas.microsoft.com/office/word/2018/wordml/cex" xmlns:w16cid="http://schemas.microsoft.com/office/word/2016/wordml/cid" xmlns:w16="http://schemas.microsoft.com/office/word/2018/wordml" xmlns:w16du="http://schemas.microsoft.com/office/word/2023/wordml/word16du" xmlns:w16sdtdh="http://schemas.microsoft.com/office/word/2020/wordml/sdtdatahash" xmlns:w16sdtfl="http://schemas.microsoft.com/office/word/2024/wordml/sdtformatlock" xmlns:w16se="http://schemas.microsoft.com/office/word/2015/wordml/symex" xmlns:wpg="http://schemas.microsoft.com/office/word/2010/wordprocessingGroup" xmlns:wpi="http://schemas.microsoft.com/office/word/2010/wordprocessingInk" xmlns:wne="http://schemas.microsoft.com/office/word/2006/wordml" xmlns:wps="http://schemas.microsoft.com/office/word/2010/wordprocessingShape" mc:Ignorable="w14 w15 w16se w16cid w16 w16cex w16sdtdh w16sdtfl w16du wp14">
   <w:abstractNum w:abstractNumId="0" w15:restartNumberingAfterBreak="0">
+    <w:nsid w:val="0846041A"/>
+    <w:multiLevelType w:val="hybridMultilevel"/>
+    <w:tmpl w:val="F0BCE79E"/>
+    <w:lvl w:ilvl="0" w:tplc="1C090001">
+      <w:start w:val="1"/>
+      <w:numFmt w:val="bullet"/>
+      <w:lvlText w:val=""/>
+      <w:lvlJc w:val="left"/>
+      <w:pPr>
+        <w:ind w:left="720" w:hanging="360"/>
+      </w:pPr>
+      <w:rPr>
+        <w:rFonts w:ascii="Symbol" w:hAnsi="Symbol" w:hint="default"/>
+      </w:rPr>
+    </w:lvl>
+    <w:lvl w:ilvl="1" w:tplc="1C090003" w:tentative="1">
+      <w:start w:val="1"/>
+      <w:numFmt w:val="bullet"/>
+      <w:lvlText w:val="o"/>
+      <w:lvlJc w:val="left"/>
+      <w:pPr>
+        <w:ind w:left="1440" w:hanging="360"/>
+      </w:pPr>
+      <w:rPr>
+        <w:rFonts w:ascii="Courier New" w:hAnsi="Courier New" w:cs="Courier New" w:hint="default"/>
+      </w:rPr>
+    </w:lvl>
+    <w:lvl w:ilvl="2" w:tplc="1C090005" w:tentative="1">
+      <w:start w:val="1"/>
+      <w:numFmt w:val="bullet"/>
+      <w:lvlText w:val=""/>
+      <w:lvlJc w:val="left"/>
+      <w:pPr>
+        <w:ind w:left="2160" w:hanging="360"/>
+      </w:pPr>
+      <w:rPr>
+        <w:rFonts w:ascii="Wingdings" w:hAnsi="Wingdings" w:hint="default"/>
+      </w:rPr>
+    </w:lvl>
+    <w:lvl w:ilvl="3" w:tplc="1C090001" w:tentative="1">
+      <w:start w:val="1"/>
+      <w:numFmt w:val="bullet"/>
+      <w:lvlText w:val=""/>
+      <w:lvlJc w:val="left"/>
+      <w:pPr>
+        <w:ind w:left="2880" w:hanging="360"/>
+      </w:pPr>
+      <w:rPr>
+        <w:rFonts w:ascii="Symbol" w:hAnsi="Symbol" w:hint="default"/>
+      </w:rPr>
+    </w:lvl>
+    <w:lvl w:ilvl="4" w:tplc="1C090003" w:tentative="1">
+      <w:start w:val="1"/>
+      <w:numFmt w:val="bullet"/>
+      <w:lvlText w:val="o"/>
+      <w:lvlJc w:val="left"/>
+      <w:pPr>
+        <w:ind w:left="3600" w:hanging="360"/>
+      </w:pPr>
+      <w:rPr>
+        <w:rFonts w:ascii="Courier New" w:hAnsi="Courier New" w:cs="Courier New" w:hint="default"/>
+      </w:rPr>
+    </w:lvl>
+    <w:lvl w:ilvl="5" w:tplc="1C090005" w:tentative="1">
+      <w:start w:val="1"/>
+      <w:numFmt w:val="bullet"/>
+      <w:lvlText w:val=""/>
+      <w:lvlJc w:val="left"/>
+      <w:pPr>
+        <w:ind w:left="4320" w:hanging="360"/>
+      </w:pPr>
+      <w:rPr>
+        <w:rFonts w:ascii="Wingdings" w:hAnsi="Wingdings" w:hint="default"/>
+      </w:rPr>
+    </w:lvl>
+    <w:lvl w:ilvl="6" w:tplc="1C090001" w:tentative="1">
+      <w:start w:val="1"/>
+      <w:numFmt w:val="bullet"/>
+      <w:lvlText w:val=""/>
+      <w:lvlJc w:val="left"/>
+      <w:pPr>
+        <w:ind w:left="5040" w:hanging="360"/>
+      </w:pPr>
+      <w:rPr>
+        <w:rFonts w:ascii="Symbol" w:hAnsi="Symbol" w:hint="default"/>
+      </w:rPr>
+    </w:lvl>
+    <w:lvl w:ilvl="7" w:tplc="1C090003" w:tentative="1">
+      <w:start w:val="1"/>
+      <w:numFmt w:val="bullet"/>
+      <w:lvlText w:val="o"/>
+      <w:lvlJc w:val="left"/>
+      <w:pPr>
+        <w:ind w:left="5760" w:hanging="360"/>
+      </w:pPr>
+      <w:rPr>
+        <w:rFonts w:ascii="Courier New" w:hAnsi="Courier New" w:cs="Courier New" w:hint="default"/>
+      </w:rPr>
+    </w:lvl>
+    <w:lvl w:ilvl="8" w:tplc="1C090005" w:tentative="1">
+      <w:start w:val="1"/>
+      <w:numFmt w:val="bullet"/>
+      <w:lvlText w:val=""/>
+      <w:lvlJc w:val="left"/>
+      <w:pPr>
+        <w:ind w:left="6480" w:hanging="360"/>
+      </w:pPr>
+      <w:rPr>
+        <w:rFonts w:ascii="Wingdings" w:hAnsi="Wingdings" w:hint="default"/>
+      </w:rPr>
+    </w:lvl>
+  </w:abstractNum>
+  <w:abstractNum w:abstractNumId="1" w15:restartNumberingAfterBreak="0">
     <w:nsid w:val="35CC21E1"/>
     <w:multiLevelType w:val="hybridMultilevel"/>
     <w:tmpl w:val="E33CFA82"/>
@@ -25506,7 +26795,7 @@
       <w:lvlJc w:val="left"/>
     </w:lvl>
   </w:abstractNum>
-  <w:abstractNum w:abstractNumId="1" w15:restartNumberingAfterBreak="0">
+  <w:abstractNum w:abstractNumId="2" w15:restartNumberingAfterBreak="0">
     <w:nsid w:val="44412F8E"/>
     <w:multiLevelType w:val="hybridMultilevel"/>
     <w:tmpl w:val="4B0EC72E"/>
@@ -25592,7 +26881,7 @@
       </w:pPr>
     </w:lvl>
   </w:abstractNum>
-  <w:abstractNum w:abstractNumId="2" w15:restartNumberingAfterBreak="0">
+  <w:abstractNum w:abstractNumId="3" w15:restartNumberingAfterBreak="0">
     <w:nsid w:val="5CE173F7"/>
     <w:multiLevelType w:val="hybridMultilevel"/>
     <w:tmpl w:val="474CA64E"/>
@@ -25647,22 +26936,25 @@
     </w:lvl>
   </w:abstractNum>
   <w:num w:numId="1" w16cid:durableId="993340206">
+    <w:abstractNumId w:val="2"/>
+    <w:lvlOverride w:ilvl="0">
+      <w:startOverride w:val="1"/>
+    </w:lvlOverride>
+  </w:num>
+  <w:num w:numId="2" w16cid:durableId="1788501721">
+    <w:abstractNumId w:val="3"/>
+    <w:lvlOverride w:ilvl="0">
+      <w:startOverride w:val="1"/>
+    </w:lvlOverride>
+  </w:num>
+  <w:num w:numId="3" w16cid:durableId="1187015715">
     <w:abstractNumId w:val="1"/>
     <w:lvlOverride w:ilvl="0">
       <w:startOverride w:val="1"/>
     </w:lvlOverride>
   </w:num>
-  <w:num w:numId="2" w16cid:durableId="1788501721">
-    <w:abstractNumId w:val="2"/>
-    <w:lvlOverride w:ilvl="0">
-      <w:startOverride w:val="1"/>
-    </w:lvlOverride>
-  </w:num>
-  <w:num w:numId="3" w16cid:durableId="1187015715">
+  <w:num w:numId="4" w16cid:durableId="926810435">
     <w:abstractNumId w:val="0"/>
-    <w:lvlOverride w:ilvl="0">
-      <w:startOverride w:val="1"/>
-    </w:lvlOverride>
   </w:num>
 </w:numbering>
 </file>

</xml_diff>